<commit_message>
feat: add decommission command to purge GCP assets, reset org policies, and wipe local migration state
</commit_message>
<xml_diff>
--- a/INSTALLATION_GUIDE.docx
+++ b/INSTALLATION_GUIDE.docx
@@ -9375,6 +9375,328 @@
       <w:pPr>
         <w:spacing w:after="160"/>
       </w:pPr>
+    </w:p>
+    <w:p>
+      <w:pPr>
+        <w:pStyle w:val="Heading1"/>
+        <w:spacing w:after="140" w:before="360"/>
+      </w:pPr>
+      <w:r>
+        <w:t xml:space="preserve">9. Application Decommissioning &amp; Cleanup (Full Teardown)</w:t>
+      </w:r>
+    </w:p>
+    <w:p>
+      <w:pPr>
+        <w:spacing w:after="120" w:line="276"/>
+      </w:pPr>
+      <w:r>
+        <w:rPr>
+          <w:rFonts w:ascii="Arial" w:cs="Arial" w:eastAsia="Arial" w:hAnsi="Arial"/>
+          <w:color w:val="1E293B"/>
+          <w:sz w:val="21"/>
+          <w:szCs w:val="21"/>
+        </w:rPr>
+        <w:t xml:space="preserve">When migration waves are completed or during environment reset, the tool provides two distinct cleanup mechanisms in Tab 6 (Target Maintenance &amp; Platform Decommission):</w:t>
+      </w:r>
+    </w:p>
+    <w:p>
+      <w:pPr>
+        <w:pStyle w:val="Heading2"/>
+        <w:spacing w:after="120" w:before="280"/>
+      </w:pPr>
+      <w:r>
+        <w:t xml:space="preserve">Button 1: Reset Target Project Assets (Test Iterations)</w:t>
+      </w:r>
+    </w:p>
+    <w:p>
+      <w:pPr>
+        <w:spacing w:after="120" w:line="276"/>
+      </w:pPr>
+      <w:r>
+        <w:rPr>
+          <w:rFonts w:ascii="Arial" w:cs="Arial" w:eastAsia="Arial" w:hAnsi="Arial"/>
+          <w:color w:val="1E293B"/>
+          <w:sz w:val="21"/>
+          <w:szCs w:val="21"/>
+        </w:rPr>
+        <w:t xml:space="preserve">Resets migrated assets (notebooks, custom agents, chat history, user memories, reports, and local artifacts) between test iterations without modifying credentials or GCP IAM roles.</w:t>
+      </w:r>
+    </w:p>
+    <w:p>
+      <w:pPr>
+        <w:pStyle w:val="Heading2"/>
+        <w:spacing w:after="120" w:before="280"/>
+      </w:pPr>
+      <w:r>
+        <w:t xml:space="preserve">Button 2: Clean Up Install &amp; Decommission Migration App (Full Teardown)</w:t>
+      </w:r>
+    </w:p>
+    <w:p>
+      <w:pPr>
+        <w:spacing w:after="120" w:line="276"/>
+      </w:pPr>
+      <w:r>
+        <w:rPr>
+          <w:rFonts w:ascii="Arial" w:cs="Arial" w:eastAsia="Arial" w:hAnsi="Arial"/>
+          <w:color w:val="1E293B"/>
+          <w:sz w:val="21"/>
+          <w:szCs w:val="21"/>
+        </w:rPr>
+        <w:t xml:space="preserve">Completely uninstalls the migration application and restores both Google Cloud and your local workstation to their pre-setup baseline state:</w:t>
+      </w:r>
+    </w:p>
+    <w:p>
+      <w:pPr>
+        <w:pStyle w:val="ListParagraph"/>
+        <w:numPr>
+          <w:ilvl w:val="0"/>
+          <w:numId w:val="1"/>
+        </w:numPr>
+        <w:spacing w:after="60" w:line="260"/>
+      </w:pPr>
+      <w:r>
+        <w:rPr>
+          <w:rFonts w:ascii="Arial" w:cs="Arial" w:eastAsia="Arial" w:hAnsi="Arial"/>
+          <w:color w:val="1E293B"/>
+          <w:sz w:val="21"/>
+          <w:szCs w:val="21"/>
+        </w:rPr>
+        <w:t xml:space="preserve">Reset Overwritten Org Policies: Resets iam.disableServiceAccountKeyCreation back to inherit from parent organization via gcloud org-policies reset.</w:t>
+      </w:r>
+    </w:p>
+    <w:p>
+      <w:pPr>
+        <w:pStyle w:val="ListParagraph"/>
+        <w:numPr>
+          <w:ilvl w:val="0"/>
+          <w:numId w:val="1"/>
+        </w:numPr>
+        <w:spacing w:after="60" w:line="260"/>
+      </w:pPr>
+      <w:r>
+        <w:rPr>
+          <w:rFonts w:ascii="Arial" w:cs="Arial" w:eastAsia="Arial" w:hAnsi="Arial"/>
+          <w:color w:val="1E293B"/>
+          <w:sz w:val="21"/>
+          <w:szCs w:val="21"/>
+        </w:rPr>
+        <w:t xml:space="preserve">Revoke IAM Roles: Strips roles/discoveryengine.admin, roles/serviceusage.serviceUsageConsumer, and roles/iam.serviceAccountTokenCreator.</w:t>
+      </w:r>
+    </w:p>
+    <w:p>
+      <w:pPr>
+        <w:pStyle w:val="ListParagraph"/>
+        <w:numPr>
+          <w:ilvl w:val="0"/>
+          <w:numId w:val="1"/>
+        </w:numPr>
+        <w:spacing w:after="60" w:line="260"/>
+      </w:pPr>
+      <w:r>
+        <w:rPr>
+          <w:rFonts w:ascii="Arial" w:cs="Arial" w:eastAsia="Arial" w:hAnsi="Arial"/>
+          <w:color w:val="1E293B"/>
+          <w:sz w:val="21"/>
+          <w:szCs w:val="21"/>
+        </w:rPr>
+        <w:t xml:space="preserve">Delete Service Account: Deletes gemini-dwd-migrator in Google Cloud IAM.</w:t>
+      </w:r>
+    </w:p>
+    <w:p>
+      <w:pPr>
+        <w:pStyle w:val="ListParagraph"/>
+        <w:numPr>
+          <w:ilvl w:val="0"/>
+          <w:numId w:val="1"/>
+        </w:numPr>
+        <w:spacing w:after="60" w:line="260"/>
+      </w:pPr>
+      <w:r>
+        <w:rPr>
+          <w:rFonts w:ascii="Arial" w:cs="Arial" w:eastAsia="Arial" w:hAnsi="Arial"/>
+          <w:color w:val="1E293B"/>
+          <w:sz w:val="21"/>
+          <w:szCs w:val="21"/>
+        </w:rPr>
+        <w:t xml:space="preserve">Invalidate DWD: Permanently revokes token creation in Google Cloud IAM; manual console deletion in admin.google.com required due to Google Workspace API boundaries.</w:t>
+      </w:r>
+    </w:p>
+    <w:p>
+      <w:pPr>
+        <w:pStyle w:val="ListParagraph"/>
+        <w:numPr>
+          <w:ilvl w:val="0"/>
+          <w:numId w:val="1"/>
+        </w:numPr>
+        <w:spacing w:after="60" w:line="260"/>
+      </w:pPr>
+      <w:r>
+        <w:rPr>
+          <w:rFonts w:ascii="Arial" w:cs="Arial" w:eastAsia="Arial" w:hAnsi="Arial"/>
+          <w:color w:val="1E293B"/>
+          <w:sz w:val="21"/>
+          <w:szCs w:val="21"/>
+        </w:rPr>
+        <w:t xml:space="preserve">Delete Local Credentials: Removes sa-dwd-key.json, workforce-identity-config.json, </w:t>
+      </w:r>
+      <w:r>
+        <w:rPr>
+          <w:rFonts w:ascii="Arial" w:cs="Arial" w:eastAsia="Arial" w:hAnsi="Arial"/>
+          <w:i/>
+          <w:iCs/>
+          <w:color w:val="334155"/>
+          <w:sz w:val="21"/>
+          <w:szCs w:val="21"/>
+        </w:rPr>
+        <w:t xml:space="preserve">.pem, </w:t>
+      </w:r>
+      <w:r>
+        <w:rPr>
+          <w:rFonts w:ascii="Arial" w:cs="Arial" w:eastAsia="Arial" w:hAnsi="Arial"/>
+          <w:color w:val="1E293B"/>
+          <w:sz w:val="21"/>
+          <w:szCs w:val="21"/>
+        </w:rPr>
+        <w:t xml:space="preserve">.jwt, and migration-config.json.</w:t>
+      </w:r>
+    </w:p>
+    <w:p>
+      <w:pPr>
+        <w:pStyle w:val="ListParagraph"/>
+        <w:numPr>
+          <w:ilvl w:val="0"/>
+          <w:numId w:val="1"/>
+        </w:numPr>
+        <w:spacing w:after="60" w:line="260"/>
+      </w:pPr>
+      <w:r>
+        <w:rPr>
+          <w:rFonts w:ascii="Arial" w:cs="Arial" w:eastAsia="Arial" w:hAnsi="Arial"/>
+          <w:color w:val="1E293B"/>
+          <w:sz w:val="21"/>
+          <w:szCs w:val="21"/>
+        </w:rPr>
+        <w:t xml:space="preserve">Purge Output Directories: Empties reports/, exports/, and user_handover_reports/.</w:t>
+      </w:r>
+    </w:p>
+    <w:p>
+      <w:pPr>
+        <w:pStyle w:val="ListParagraph"/>
+        <w:numPr>
+          <w:ilvl w:val="0"/>
+          <w:numId w:val="1"/>
+        </w:numPr>
+        <w:spacing w:after="60" w:line="260"/>
+      </w:pPr>
+      <w:r>
+        <w:rPr>
+          <w:rFonts w:ascii="Arial" w:cs="Arial" w:eastAsia="Arial" w:hAnsi="Arial"/>
+          <w:color w:val="1E293B"/>
+          <w:sz w:val="21"/>
+          <w:szCs w:val="21"/>
+        </w:rPr>
+        <w:t xml:space="preserve">Headless CLI Support: Supports "gemini-migrate decommission --project &lt;ID&gt; --confirm &lt;ID&gt; </w:t>
+      </w:r>
+      <w:r>
+        <w:rPr>
+          <w:rFonts w:ascii="Arial" w:cs="Arial" w:eastAsia="Arial" w:hAnsi="Arial"/>
+          <w:b/>
+          <w:bCs/>
+          <w:color w:val="1A73E8"/>
+          <w:sz w:val="18"/>
+          <w:szCs w:val="18"/>
+        </w:rPr>
+        <w:t xml:space="preserve">[--wipe-target-assets]</w:t>
+      </w:r>
+      <w:r>
+        <w:rPr>
+          <w:rFonts w:ascii="Arial" w:cs="Arial" w:eastAsia="Arial" w:hAnsi="Arial"/>
+          <w:color w:val="1E293B"/>
+          <w:sz w:val="21"/>
+          <w:szCs w:val="21"/>
+        </w:rPr>
+        <w:t xml:space="preserve">".</w:t>
+      </w:r>
+    </w:p>
+    <w:p>
+      <w:pPr>
+        <w:pStyle w:val="Heading2"/>
+        <w:spacing w:after="120" w:before="280"/>
+      </w:pPr>
+      <w:r>
+        <w:t xml:space="preserve">Automated Rollback State Verification Engine</w:t>
+      </w:r>
+    </w:p>
+    <w:p>
+      <w:pPr>
+        <w:spacing w:after="120" w:line="276"/>
+      </w:pPr>
+      <w:r>
+        <w:rPr>
+          <w:rFonts w:ascii="Arial" w:cs="Arial" w:eastAsia="Arial" w:hAnsi="Arial"/>
+          <w:color w:val="1E293B"/>
+          <w:sz w:val="21"/>
+          <w:szCs w:val="21"/>
+        </w:rPr>
+        <w:t xml:space="preserve">Provides an automated 7-dimension audit engine verifying that organization policies inherit parent defaults, service accounts are permanently deleted, IAM role bindings are removed, DWD tokens are invalidated, local private keys are deleted, output folders are empty, and state caches are cleared.</w:t>
+      </w:r>
+    </w:p>
+    <w:p>
+      <w:pPr>
+        <w:pStyle w:val="ListParagraph"/>
+        <w:numPr>
+          <w:ilvl w:val="0"/>
+          <w:numId w:val="1"/>
+        </w:numPr>
+        <w:spacing w:after="60" w:line="260"/>
+      </w:pPr>
+      <w:r>
+        <w:rPr>
+          <w:rFonts w:ascii="Arial" w:cs="Arial" w:eastAsia="Arial" w:hAnsi="Arial"/>
+          <w:color w:val="1E293B"/>
+          <w:sz w:val="21"/>
+          <w:szCs w:val="21"/>
+        </w:rPr>
+        <w:t xml:space="preserve">Web Console: Click "Verify Rollback State" in Tab 6 (Card 2).</w:t>
+      </w:r>
+    </w:p>
+    <w:p>
+      <w:pPr>
+        <w:pStyle w:val="ListParagraph"/>
+        <w:numPr>
+          <w:ilvl w:val="0"/>
+          <w:numId w:val="1"/>
+        </w:numPr>
+        <w:spacing w:after="60" w:line="260"/>
+      </w:pPr>
+      <w:r>
+        <w:rPr>
+          <w:rFonts w:ascii="Arial" w:cs="Arial" w:eastAsia="Arial" w:hAnsi="Arial"/>
+          <w:color w:val="1E293B"/>
+          <w:sz w:val="21"/>
+          <w:szCs w:val="21"/>
+        </w:rPr>
+        <w:t xml:space="preserve">Headless CLI: gemini-migrate verify-rollback --project &lt;TARGET_PROJECT_ID&gt;</w:t>
+      </w:r>
+    </w:p>
+    <w:p>
+      <w:pPr>
+        <w:pStyle w:val="ListParagraph"/>
+        <w:numPr>
+          <w:ilvl w:val="0"/>
+          <w:numId w:val="1"/>
+        </w:numPr>
+        <w:spacing w:after="60" w:line="260"/>
+      </w:pPr>
+      <w:r>
+        <w:rPr>
+          <w:rFonts w:ascii="Arial" w:cs="Arial" w:eastAsia="Arial" w:hAnsi="Arial"/>
+          <w:color w:val="1E293B"/>
+          <w:sz w:val="21"/>
+          <w:szCs w:val="21"/>
+        </w:rPr>
+        <w:t xml:space="preserve">REST API: GET /api/maintenance/verify-rollback?targetProject=&lt;PROJECT_ID&gt;</w:t>
+      </w:r>
     </w:p>
     <w:sectPr>
       <w:headerReference w:type="default" r:id="rId7"/>

</xml_diff>

<commit_message>
feat: update GCP authentication handling with multi-modal token retries and enhance configuration support for migration features and IDP mapping.
</commit_message>
<xml_diff>
--- a/INSTALLATION_GUIDE.docx
+++ b/INSTALLATION_GUIDE.docx
@@ -96,7 +96,7 @@
                 <w:sz w:val="19"/>
                 <w:szCs w:val="19"/>
               </w:rPr>
-              <w:t xml:space="preserve">v1.4.1 (Enterprise Release)</w:t>
+              <w:t xml:space="preserve">v1.5.3 (Enterprise Release)</w:t>
             </w:r>
           </w:p>
         </w:tc>
@@ -3283,7 +3283,7 @@
                 <w:sz w:val="21"/>
                 <w:szCs w:val="21"/>
               </w:rPr>
-              <w:t xml:space="preserve">Target Project</w:t>
+              <w:t xml:space="preserve">Source Project</w:t>
             </w:r>
           </w:p>
         </w:tc>
@@ -3309,7 +3309,7 @@
                 <w:sz w:val="21"/>
                 <w:szCs w:val="21"/>
               </w:rPr>
-              <w:t xml:space="preserve">roles/discoveryengine.admin</w:t>
+              <w:t xml:space="preserve">roles/iam.securityReviewer</w:t>
             </w:r>
           </w:p>
         </w:tc>
@@ -3361,7 +3361,7 @@
                 <w:sz w:val="21"/>
                 <w:szCs w:val="21"/>
               </w:rPr>
-              <w:t xml:space="preserve">Creation and configuration of target engines, datastores, agents, and notebooks</w:t>
+              <w:t xml:space="preserve">Allows enumerating project IAM bindings (resourcemanager.projects.getIamPolicy) during User Discovery</w:t>
             </w:r>
           </w:p>
         </w:tc>
@@ -3415,7 +3415,7 @@
                 <w:sz w:val="21"/>
                 <w:szCs w:val="21"/>
               </w:rPr>
-              <w:t xml:space="preserve">roles/iam.serviceAccountTokenCreator</w:t>
+              <w:t xml:space="preserve">roles/discoveryengine.admin</w:t>
             </w:r>
           </w:p>
         </w:tc>
@@ -3467,7 +3467,7 @@
                 <w:sz w:val="21"/>
                 <w:szCs w:val="21"/>
               </w:rPr>
-              <w:t xml:space="preserve">Allows minting user-scoped impersonation tokens via Domain-Wide Delegation</w:t>
+              <w:t xml:space="preserve">Creation and configuration of target engines, datastores, agents, and notebooks</w:t>
             </w:r>
           </w:p>
         </w:tc>
@@ -3521,6 +3521,112 @@
                 <w:sz w:val="21"/>
                 <w:szCs w:val="21"/>
               </w:rPr>
+              <w:t xml:space="preserve">roles/iam.serviceAccountTokenCreator</w:t>
+            </w:r>
+          </w:p>
+        </w:tc>
+        <w:tc>
+          <w:tcPr>
+            <w:tcW w:type="pct" w:w="20%"/>
+            <w:shd w:fill="FFFFFF"/>
+            <w:tcMar>
+              <w:top w:type="dxa" w:w="80"/>
+              <w:left w:type="dxa" w:w="140"/>
+              <w:bottom w:type="dxa" w:w="80"/>
+              <w:right w:type="dxa" w:w="140"/>
+            </w:tcMar>
+          </w:tcPr>
+          <w:p>
+            <w:pPr>
+              <w:spacing w:after="40"/>
+            </w:pPr>
+            <w:r>
+              <w:rPr>
+                <w:rFonts w:ascii="Arial" w:cs="Arial" w:eastAsia="Arial" w:hAnsi="Arial"/>
+                <w:color w:val="1E293B"/>
+                <w:sz w:val="21"/>
+                <w:szCs w:val="21"/>
+              </w:rPr>
+              <w:t xml:space="preserve">Predefined Role</w:t>
+            </w:r>
+          </w:p>
+        </w:tc>
+        <w:tc>
+          <w:tcPr>
+            <w:tcW w:type="pct" w:w="25%"/>
+            <w:shd w:fill="FFFFFF"/>
+            <w:tcMar>
+              <w:top w:type="dxa" w:w="80"/>
+              <w:left w:type="dxa" w:w="140"/>
+              <w:bottom w:type="dxa" w:w="80"/>
+              <w:right w:type="dxa" w:w="140"/>
+            </w:tcMar>
+          </w:tcPr>
+          <w:p>
+            <w:pPr>
+              <w:spacing w:after="40"/>
+            </w:pPr>
+            <w:r>
+              <w:rPr>
+                <w:rFonts w:ascii="Arial" w:cs="Arial" w:eastAsia="Arial" w:hAnsi="Arial"/>
+                <w:color w:val="1E293B"/>
+                <w:sz w:val="21"/>
+                <w:szCs w:val="21"/>
+              </w:rPr>
+              <w:t xml:space="preserve">Allows minting user-scoped impersonation tokens via Domain-Wide Delegation</w:t>
+            </w:r>
+          </w:p>
+        </w:tc>
+      </w:tr>
+      <w:tr>
+        <w:tc>
+          <w:tcPr>
+            <w:tcW w:type="pct" w:w="20%"/>
+            <w:shd w:fill="F8FAFC"/>
+            <w:tcMar>
+              <w:top w:type="dxa" w:w="80"/>
+              <w:left w:type="dxa" w:w="140"/>
+              <w:bottom w:type="dxa" w:w="80"/>
+              <w:right w:type="dxa" w:w="140"/>
+            </w:tcMar>
+          </w:tcPr>
+          <w:p>
+            <w:pPr>
+              <w:spacing w:after="40"/>
+            </w:pPr>
+            <w:r>
+              <w:rPr>
+                <w:rFonts w:ascii="Arial" w:cs="Arial" w:eastAsia="Arial" w:hAnsi="Arial"/>
+                <w:color w:val="1E293B"/>
+                <w:sz w:val="21"/>
+                <w:szCs w:val="21"/>
+              </w:rPr>
+              <w:t xml:space="preserve">Target Project</w:t>
+            </w:r>
+          </w:p>
+        </w:tc>
+        <w:tc>
+          <w:tcPr>
+            <w:tcW w:type="pct" w:w="35%"/>
+            <w:shd w:fill="F8FAFC"/>
+            <w:tcMar>
+              <w:top w:type="dxa" w:w="80"/>
+              <w:left w:type="dxa" w:w="140"/>
+              <w:bottom w:type="dxa" w:w="80"/>
+              <w:right w:type="dxa" w:w="140"/>
+            </w:tcMar>
+          </w:tcPr>
+          <w:p>
+            <w:pPr>
+              <w:spacing w:after="40"/>
+            </w:pPr>
+            <w:r>
+              <w:rPr>
+                <w:rFonts w:ascii="Arial" w:cs="Arial" w:eastAsia="Arial" w:hAnsi="Arial"/>
+                <w:color w:val="1E293B"/>
+                <w:sz w:val="21"/>
+                <w:szCs w:val="21"/>
+              </w:rPr>
               <w:t xml:space="preserve">roles/serviceusage.serviceUsageConsumer</w:t>
             </w:r>
           </w:p>
@@ -3528,7 +3634,7 @@
         <w:tc>
           <w:tcPr>
             <w:tcW w:type="pct" w:w="20%"/>
-            <w:shd w:fill="FFFFFF"/>
+            <w:shd w:fill="F8FAFC"/>
             <w:tcMar>
               <w:top w:type="dxa" w:w="80"/>
               <w:left w:type="dxa" w:w="140"/>
@@ -3554,7 +3660,7 @@
         <w:tc>
           <w:tcPr>
             <w:tcW w:type="pct" w:w="25%"/>
-            <w:shd w:fill="FFFFFF"/>
+            <w:shd w:fill="F8FAFC"/>
             <w:tcMar>
               <w:top w:type="dxa" w:w="80"/>
               <w:left w:type="dxa" w:w="140"/>
@@ -3642,7 +3748,26 @@
           <w:sz w:val="21"/>
           <w:szCs w:val="21"/>
         </w:rPr>
-        <w:t xml:space="preserve"> on both Source and Target projects is mandatory. Administrative pre-flight checks are isolated to the configured Service Account key, ensuring that user-scoped WiF tokens are never erroneously used for administrative engine validation.</w:t>
+        <w:t xml:space="preserve"> and </w:t>
+      </w:r>
+      <w:r>
+        <w:rPr>
+          <w:rFonts w:ascii="Consolas" w:cs="Consolas" w:eastAsia="Consolas" w:hAnsi="Consolas"/>
+          <w:color w:val="0F172A"/>
+          <w:sz w:val="19"/>
+          <w:szCs w:val="19"/>
+          <w:shd w:fill="F1F5F9"/>
+        </w:rPr>
+        <w:t xml:space="preserve">roles/iam.securityReviewer</w:t>
+      </w:r>
+      <w:r>
+        <w:rPr>
+          <w:rFonts w:ascii="Arial" w:cs="Arial" w:eastAsia="Arial" w:hAnsi="Arial"/>
+          <w:color w:val="1E293B"/>
+          <w:sz w:val="21"/>
+          <w:szCs w:val="21"/>
+        </w:rPr>
+        <w:t xml:space="preserve"> on the Source Project is mandatory. Administrative pre-flight checks and project IAM discovery are isolated to the configured Service Account key, ensuring that user-scoped WiF tokens are never erroneously used for administrative engine validation.</w:t>
       </w:r>
     </w:p>
     <w:p>
@@ -4577,7 +4702,7 @@
           <w:sz w:val="21"/>
           <w:szCs w:val="21"/>
         </w:rPr>
-        <w:t xml:space="preserve">Assign required IAM roles to the service account:</w:t>
+        <w:t xml:space="preserve">Assign required IAM roles to the service account across BOTH Target and Source Projects:</w:t>
       </w:r>
     </w:p>
     <w:p>
@@ -4599,6 +4724,16 @@
           <w:sz w:val="19"/>
           <w:szCs w:val="19"/>
         </w:rPr>
+        <w:t xml:space="preserve"># Grant roles on TARGET Project (Restore &amp; Token Minting)
+</w:t>
+      </w:r>
+      <w:r>
+        <w:rPr>
+          <w:rFonts w:ascii="Consolas" w:cs="Consolas" w:eastAsia="Consolas" w:hAnsi="Consolas"/>
+          <w:color w:val="0F172A"/>
+          <w:sz w:val="19"/>
+          <w:szCs w:val="19"/>
+        </w:rPr>
         <w:t xml:space="preserve">gcloud projects add-iam-policy-binding &lt;TARGET_PROJECT_ID&gt; \
 </w:t>
       </w:r>
@@ -4659,7 +4794,177 @@
           <w:sz w:val="19"/>
           <w:szCs w:val="19"/>
         </w:rPr>
-        <w:t xml:space="preserve">    --role="roles/serviceusage.serviceUsageConsumer"</w:t>
+        <w:t xml:space="preserve">    --role="roles/iam.serviceAccountTokenCreator"
+</w:t>
+      </w:r>
+      <w:r>
+        <w:rPr>
+          <w:rFonts w:ascii="Consolas" w:cs="Consolas" w:eastAsia="Consolas" w:hAnsi="Consolas"/>
+          <w:color w:val="0F172A"/>
+          <w:sz w:val="19"/>
+          <w:szCs w:val="19"/>
+        </w:rPr>
+        <w:t xml:space="preserve">
+</w:t>
+      </w:r>
+      <w:r>
+        <w:rPr>
+          <w:rFonts w:ascii="Consolas" w:cs="Consolas" w:eastAsia="Consolas" w:hAnsi="Consolas"/>
+          <w:color w:val="0F172A"/>
+          <w:sz w:val="19"/>
+          <w:szCs w:val="19"/>
+        </w:rPr>
+        <w:t xml:space="preserve">gcloud projects add-iam-policy-binding &lt;TARGET_PROJECT_ID&gt; \
+</w:t>
+      </w:r>
+      <w:r>
+        <w:rPr>
+          <w:rFonts w:ascii="Consolas" w:cs="Consolas" w:eastAsia="Consolas" w:hAnsi="Consolas"/>
+          <w:color w:val="0F172A"/>
+          <w:sz w:val="19"/>
+          <w:szCs w:val="19"/>
+        </w:rPr>
+        <w:t xml:space="preserve">    --member="serviceAccount:gemini-dwd-migrator@&lt;TARGET_PROJECT_ID&gt;.iam.gserviceaccount.com" \
+</w:t>
+      </w:r>
+      <w:r>
+        <w:rPr>
+          <w:rFonts w:ascii="Consolas" w:cs="Consolas" w:eastAsia="Consolas" w:hAnsi="Consolas"/>
+          <w:color w:val="0F172A"/>
+          <w:sz w:val="19"/>
+          <w:szCs w:val="19"/>
+        </w:rPr>
+        <w:t xml:space="preserve">    --role="roles/serviceusage.serviceUsageConsumer"
+</w:t>
+      </w:r>
+      <w:r>
+        <w:rPr>
+          <w:rFonts w:ascii="Consolas" w:cs="Consolas" w:eastAsia="Consolas" w:hAnsi="Consolas"/>
+          <w:color w:val="0F172A"/>
+          <w:sz w:val="19"/>
+          <w:szCs w:val="19"/>
+        </w:rPr>
+        <w:t xml:space="preserve">
+</w:t>
+      </w:r>
+      <w:r>
+        <w:rPr>
+          <w:rFonts w:ascii="Consolas" w:cs="Consolas" w:eastAsia="Consolas" w:hAnsi="Consolas"/>
+          <w:color w:val="0F172A"/>
+          <w:sz w:val="19"/>
+          <w:szCs w:val="19"/>
+        </w:rPr>
+        <w:t xml:space="preserve"># Grant roles on SOURCE Project (MANDATORY for Cross-Project Discovery &amp; Parity Audit)
+</w:t>
+      </w:r>
+      <w:r>
+        <w:rPr>
+          <w:rFonts w:ascii="Consolas" w:cs="Consolas" w:eastAsia="Consolas" w:hAnsi="Consolas"/>
+          <w:color w:val="0F172A"/>
+          <w:sz w:val="19"/>
+          <w:szCs w:val="19"/>
+        </w:rPr>
+        <w:t xml:space="preserve">gcloud projects add-iam-policy-binding &lt;SOURCE_PROJECT_ID&gt; \
+</w:t>
+      </w:r>
+      <w:r>
+        <w:rPr>
+          <w:rFonts w:ascii="Consolas" w:cs="Consolas" w:eastAsia="Consolas" w:hAnsi="Consolas"/>
+          <w:color w:val="0F172A"/>
+          <w:sz w:val="19"/>
+          <w:szCs w:val="19"/>
+        </w:rPr>
+        <w:t xml:space="preserve">    --member="serviceAccount:gemini-dwd-migrator@&lt;TARGET_PROJECT_ID&gt;.iam.gserviceaccount.com" \
+</w:t>
+      </w:r>
+      <w:r>
+        <w:rPr>
+          <w:rFonts w:ascii="Consolas" w:cs="Consolas" w:eastAsia="Consolas" w:hAnsi="Consolas"/>
+          <w:color w:val="0F172A"/>
+          <w:sz w:val="19"/>
+          <w:szCs w:val="19"/>
+        </w:rPr>
+        <w:t xml:space="preserve">    --role="roles/discoveryengine.admin"
+</w:t>
+      </w:r>
+      <w:r>
+        <w:rPr>
+          <w:rFonts w:ascii="Consolas" w:cs="Consolas" w:eastAsia="Consolas" w:hAnsi="Consolas"/>
+          <w:color w:val="0F172A"/>
+          <w:sz w:val="19"/>
+          <w:szCs w:val="19"/>
+        </w:rPr>
+        <w:t xml:space="preserve">
+</w:t>
+      </w:r>
+      <w:r>
+        <w:rPr>
+          <w:rFonts w:ascii="Consolas" w:cs="Consolas" w:eastAsia="Consolas" w:hAnsi="Consolas"/>
+          <w:color w:val="0F172A"/>
+          <w:sz w:val="19"/>
+          <w:szCs w:val="19"/>
+        </w:rPr>
+        <w:t xml:space="preserve">gcloud projects add-iam-policy-binding &lt;SOURCE_PROJECT_ID&gt; \
+</w:t>
+      </w:r>
+      <w:r>
+        <w:rPr>
+          <w:rFonts w:ascii="Consolas" w:cs="Consolas" w:eastAsia="Consolas" w:hAnsi="Consolas"/>
+          <w:color w:val="0F172A"/>
+          <w:sz w:val="19"/>
+          <w:szCs w:val="19"/>
+        </w:rPr>
+        <w:t xml:space="preserve">    --member="serviceAccount:gemini-dwd-migrator@&lt;TARGET_PROJECT_ID&gt;.iam.gserviceaccount.com" \
+</w:t>
+      </w:r>
+      <w:r>
+        <w:rPr>
+          <w:rFonts w:ascii="Consolas" w:cs="Consolas" w:eastAsia="Consolas" w:hAnsi="Consolas"/>
+          <w:color w:val="0F172A"/>
+          <w:sz w:val="19"/>
+          <w:szCs w:val="19"/>
+        </w:rPr>
+        <w:t xml:space="preserve">    --role="roles/serviceusage.serviceUsageConsumer"
+</w:t>
+      </w:r>
+      <w:r>
+        <w:rPr>
+          <w:rFonts w:ascii="Consolas" w:cs="Consolas" w:eastAsia="Consolas" w:hAnsi="Consolas"/>
+          <w:color w:val="0F172A"/>
+          <w:sz w:val="19"/>
+          <w:szCs w:val="19"/>
+        </w:rPr>
+        <w:t xml:space="preserve">
+</w:t>
+      </w:r>
+      <w:r>
+        <w:rPr>
+          <w:rFonts w:ascii="Consolas" w:cs="Consolas" w:eastAsia="Consolas" w:hAnsi="Consolas"/>
+          <w:color w:val="0F172A"/>
+          <w:sz w:val="19"/>
+          <w:szCs w:val="19"/>
+        </w:rPr>
+        <w:t xml:space="preserve">gcloud projects add-iam-policy-binding &lt;SOURCE_PROJECT_ID&gt; \
+</w:t>
+      </w:r>
+      <w:r>
+        <w:rPr>
+          <w:rFonts w:ascii="Consolas" w:cs="Consolas" w:eastAsia="Consolas" w:hAnsi="Consolas"/>
+          <w:color w:val="0F172A"/>
+          <w:sz w:val="19"/>
+          <w:szCs w:val="19"/>
+        </w:rPr>
+        <w:t xml:space="preserve">    --member="serviceAccount:gemini-dwd-migrator@&lt;TARGET_PROJECT_ID&gt;.iam.gserviceaccount.com" \
+</w:t>
+      </w:r>
+      <w:r>
+        <w:rPr>
+          <w:rFonts w:ascii="Consolas" w:cs="Consolas" w:eastAsia="Consolas" w:hAnsi="Consolas"/>
+          <w:color w:val="0F172A"/>
+          <w:sz w:val="19"/>
+          <w:szCs w:val="19"/>
+        </w:rPr>
+        <w:t xml:space="preserve">    --role="roles/iam.securityReviewer"</w:t>
       </w:r>
     </w:p>
     <w:p>
@@ -5206,13 +5511,20 @@
     </w:p>
     <w:p>
       <w:pPr>
-        <w:pStyle w:val="ListParagraph"/>
-        <w:numPr>
-          <w:ilvl w:val="0"/>
-          <w:numId w:val="1"/>
-        </w:numPr>
-        <w:spacing w:after="60" w:line="260"/>
-      </w:pPr>
+        <w:spacing w:after="80" w:line="260"/>
+        <w:ind w:left="360" w:hanging="360"/>
+      </w:pPr>
+      <w:r>
+        <w:rPr>
+          <w:rFonts w:ascii="Arial" w:cs="Arial" w:eastAsia="Arial" w:hAnsi="Arial"/>
+          <w:b/>
+          <w:bCs/>
+          <w:color w:val="1A73E8"/>
+          <w:sz w:val="21"/>
+          <w:szCs w:val="21"/>
+        </w:rPr>
+        <w:t xml:space="preserve">1.  </w:t>
+      </w:r>
       <w:r>
         <w:rPr>
           <w:rFonts w:ascii="Arial" w:cs="Arial" w:eastAsia="Arial" w:hAnsi="Arial"/>
@@ -5244,13 +5556,20 @@
     </w:p>
     <w:p>
       <w:pPr>
-        <w:pStyle w:val="ListParagraph"/>
-        <w:numPr>
-          <w:ilvl w:val="0"/>
-          <w:numId w:val="1"/>
-        </w:numPr>
-        <w:spacing w:after="60" w:line="260"/>
-      </w:pPr>
+        <w:spacing w:after="80" w:line="260"/>
+        <w:ind w:left="360" w:hanging="360"/>
+      </w:pPr>
+      <w:r>
+        <w:rPr>
+          <w:rFonts w:ascii="Arial" w:cs="Arial" w:eastAsia="Arial" w:hAnsi="Arial"/>
+          <w:b/>
+          <w:bCs/>
+          <w:color w:val="1A73E8"/>
+          <w:sz w:val="21"/>
+          <w:szCs w:val="21"/>
+        </w:rPr>
+        <w:t xml:space="preserve">2.  </w:t>
+      </w:r>
       <w:r>
         <w:rPr>
           <w:rFonts w:ascii="Arial" w:cs="Arial" w:eastAsia="Arial" w:hAnsi="Arial"/>
@@ -5301,13 +5620,20 @@
     </w:p>
     <w:p>
       <w:pPr>
-        <w:pStyle w:val="ListParagraph"/>
-        <w:numPr>
-          <w:ilvl w:val="0"/>
-          <w:numId w:val="1"/>
-        </w:numPr>
-        <w:spacing w:after="60" w:line="260"/>
-      </w:pPr>
+        <w:spacing w:after="80" w:line="260"/>
+        <w:ind w:left="360" w:hanging="360"/>
+      </w:pPr>
+      <w:r>
+        <w:rPr>
+          <w:rFonts w:ascii="Arial" w:cs="Arial" w:eastAsia="Arial" w:hAnsi="Arial"/>
+          <w:b/>
+          <w:bCs/>
+          <w:color w:val="1A73E8"/>
+          <w:sz w:val="21"/>
+          <w:szCs w:val="21"/>
+        </w:rPr>
+        <w:t xml:space="preserve">3.  </w:t>
+      </w:r>
       <w:r>
         <w:rPr>
           <w:rFonts w:ascii="Arial" w:cs="Arial" w:eastAsia="Arial" w:hAnsi="Arial"/>
@@ -5469,7 +5795,7 @@
           <w:sz w:val="21"/>
           <w:szCs w:val="21"/>
         </w:rPr>
-        <w:t xml:space="preserve">Clone the repository to your local machine:</w:t>
+        <w:t xml:space="preserve">Clone the repository:</w:t>
       </w:r>
     </w:p>
     <w:p>
@@ -5906,6 +6232,16 @@
           <w:sz w:val="19"/>
           <w:szCs w:val="19"/>
         </w:rPr>
+        <w:t xml:space="preserve">    "migrateSkills": true,
+</w:t>
+      </w:r>
+      <w:r>
+        <w:rPr>
+          <w:rFonts w:ascii="Consolas" w:cs="Consolas" w:eastAsia="Consolas" w:hAnsi="Consolas"/>
+          <w:color w:val="0F172A"/>
+          <w:sz w:val="19"/>
+          <w:szCs w:val="19"/>
+        </w:rPr>
         <w:t xml:space="preserve">    "migrateSessions": true,
 </w:t>
       </w:r>
@@ -6225,7 +6561,7 @@
           <w:sz w:val="19"/>
           <w:szCs w:val="19"/>
         </w:rPr>
-        <w:t xml:space="preserve"># Executes 74 unit tests across 10 test suites covering auth, parsing, and export</w:t>
+        <w:t xml:space="preserve"># Executes 106 automated tests across 14 test suites covering auth, cross-project parity pre-checks, export, decommissioning, and rollback validation</w:t>
       </w:r>
     </w:p>
     <w:p>

</xml_diff>

<commit_message>
feat: implement human-in-the-loop workflow for connector and data store mapping validation
</commit_message>
<xml_diff>
--- a/INSTALLATION_GUIDE.docx
+++ b/INSTALLATION_GUIDE.docx
@@ -96,7 +96,7 @@
                 <w:sz w:val="19"/>
                 <w:szCs w:val="19"/>
               </w:rPr>
-              <w:t xml:space="preserve">v1.5.5 (Enterprise Release)</w:t>
+              <w:t xml:space="preserve">v1.6.0 (Enterprise Release)</w:t>
             </w:r>
           </w:p>
         </w:tc>
@@ -443,7 +443,26 @@
           <w:sz w:val="21"/>
           <w:szCs w:val="21"/>
         </w:rPr>
-        <w:t xml:space="preserve"> (Low-Code and Workflow agents), </w:t>
+        <w:t xml:space="preserve"> (Low-Code and Workflow agents with dynamic </w:t>
+      </w:r>
+      <w:r>
+        <w:rPr>
+          <w:rFonts w:ascii="Consolas" w:cs="Consolas" w:eastAsia="Consolas" w:hAnsi="Consolas"/>
+          <w:color w:val="0F172A"/>
+          <w:sz w:val="19"/>
+          <w:szCs w:val="19"/>
+          <w:shd w:fill="F1F5F9"/>
+        </w:rPr>
+        <w:t xml:space="preserve">_#####</w:t>
+      </w:r>
+      <w:r>
+        <w:rPr>
+          <w:rFonts w:ascii="Arial" w:cs="Arial" w:eastAsia="Arial" w:hAnsi="Arial"/>
+          <w:color w:val="1E293B"/>
+          <w:sz w:val="21"/>
+          <w:szCs w:val="21"/>
+        </w:rPr>
+        <w:t xml:space="preserve"> Connector Auto-Mapping &amp; HITL validation), </w:t>
       </w:r>
       <w:r>
         <w:rPr>
@@ -6272,7 +6291,57 @@
           <w:sz w:val="19"/>
           <w:szCs w:val="19"/>
         </w:rPr>
-        <w:t xml:space="preserve">    "userFilter": ["*@company.com"]
+        <w:t xml:space="preserve">    "userFilter": ["*@company.com"],
+</w:t>
+      </w:r>
+      <w:r>
+        <w:rPr>
+          <w:rFonts w:ascii="Consolas" w:cs="Consolas" w:eastAsia="Consolas" w:hAnsi="Consolas"/>
+          <w:color w:val="0F172A"/>
+          <w:sz w:val="19"/>
+          <w:szCs w:val="19"/>
+        </w:rPr>
+        <w:t xml:space="preserve">    "promptForAdminNotebookHitl": false,
+</w:t>
+      </w:r>
+      <w:r>
+        <w:rPr>
+          <w:rFonts w:ascii="Consolas" w:cs="Consolas" w:eastAsia="Consolas" w:hAnsi="Consolas"/>
+          <w:color w:val="0F172A"/>
+          <w:sz w:val="19"/>
+          <w:szCs w:val="19"/>
+        </w:rPr>
+        <w:t xml:space="preserve">    "promptForConnectorHitl": true
+</w:t>
+      </w:r>
+      <w:r>
+        <w:rPr>
+          <w:rFonts w:ascii="Consolas" w:cs="Consolas" w:eastAsia="Consolas" w:hAnsi="Consolas"/>
+          <w:color w:val="0F172A"/>
+          <w:sz w:val="19"/>
+          <w:szCs w:val="19"/>
+        </w:rPr>
+        <w:t xml:space="preserve">  },
+</w:t>
+      </w:r>
+      <w:r>
+        <w:rPr>
+          <w:rFonts w:ascii="Consolas" w:cs="Consolas" w:eastAsia="Consolas" w:hAnsi="Consolas"/>
+          <w:color w:val="0F172A"/>
+          <w:sz w:val="19"/>
+          <w:szCs w:val="19"/>
+        </w:rPr>
+        <w:t xml:space="preserve">  "collectionMapping": {
+</w:t>
+      </w:r>
+      <w:r>
+        <w:rPr>
+          <w:rFonts w:ascii="Consolas" w:cs="Consolas" w:eastAsia="Consolas" w:hAnsi="Consolas"/>
+          <w:color w:val="0F172A"/>
+          <w:sz w:val="19"/>
+          <w:szCs w:val="19"/>
+        </w:rPr>
+        <w:t xml:space="preserve">    "github_1773757636775": "github_1780931139999"
 </w:t>
       </w:r>
       <w:r>
@@ -6561,7 +6630,7 @@
           <w:sz w:val="19"/>
           <w:szCs w:val="19"/>
         </w:rPr>
-        <w:t xml:space="preserve"># Executes 106 automated tests across 14 test suites covering auth, cross-project parity pre-checks, export, decommissioning, and rollback validation</w:t>
+        <w:t xml:space="preserve"># Executes 323 automated tests across 26 test suites covering auth, cross-project parity pre-checks, dynamic _##### connector Regex Pattern Matching, HITL validation, export, decommissioning, and rollback validation</w:t>
       </w:r>
     </w:p>
     <w:p>
@@ -7976,6 +8045,218 @@
                 <w:szCs w:val="21"/>
               </w:rPr>
               <w:t xml:space="preserve">Replicate</w:t>
+            </w:r>
+          </w:p>
+        </w:tc>
+      </w:tr>
+      <w:tr>
+        <w:tc>
+          <w:tcPr>
+            <w:tcW w:type="pct" w:w="25%"/>
+            <w:shd w:fill="FFFFFF"/>
+            <w:tcMar>
+              <w:top w:type="dxa" w:w="80"/>
+              <w:left w:type="dxa" w:w="140"/>
+              <w:bottom w:type="dxa" w:w="80"/>
+              <w:right w:type="dxa" w:w="140"/>
+            </w:tcMar>
+          </w:tcPr>
+          <w:p>
+            <w:pPr>
+              <w:spacing w:after="40"/>
+            </w:pPr>
+            <w:r>
+              <w:rPr>
+                <w:rFonts w:ascii="Arial" w:cs="Arial" w:eastAsia="Arial" w:hAnsi="Arial"/>
+                <w:color w:val="1E293B"/>
+                <w:sz w:val="21"/>
+                <w:szCs w:val="21"/>
+              </w:rPr>
+              <w:t xml:space="preserve">--prompt-admin-hitl</w:t>
+            </w:r>
+          </w:p>
+        </w:tc>
+        <w:tc>
+          <w:tcPr>
+            <w:tcW w:type="pct" w:w="15%"/>
+            <w:shd w:fill="FFFFFF"/>
+            <w:tcMar>
+              <w:top w:type="dxa" w:w="80"/>
+              <w:left w:type="dxa" w:w="140"/>
+              <w:bottom w:type="dxa" w:w="80"/>
+              <w:right w:type="dxa" w:w="140"/>
+            </w:tcMar>
+          </w:tcPr>
+          <w:p>
+            <w:pPr>
+              <w:spacing w:after="40"/>
+            </w:pPr>
+            <w:r>
+              <w:rPr>
+                <w:rFonts w:ascii="Arial" w:cs="Arial" w:eastAsia="Arial" w:hAnsi="Arial"/>
+                <w:color w:val="1E293B"/>
+                <w:sz w:val="21"/>
+                <w:szCs w:val="21"/>
+              </w:rPr>
+              <w:t xml:space="preserve">—</w:t>
+            </w:r>
+          </w:p>
+        </w:tc>
+        <w:tc>
+          <w:tcPr>
+            <w:tcW w:type="pct" w:w="45%"/>
+            <w:shd w:fill="FFFFFF"/>
+            <w:tcMar>
+              <w:top w:type="dxa" w:w="80"/>
+              <w:left w:type="dxa" w:w="140"/>
+              <w:bottom w:type="dxa" w:w="80"/>
+              <w:right w:type="dxa" w:w="140"/>
+            </w:tcMar>
+          </w:tcPr>
+          <w:p>
+            <w:pPr>
+              <w:spacing w:after="40"/>
+            </w:pPr>
+            <w:r>
+              <w:rPr>
+                <w:rFonts w:ascii="Arial" w:cs="Arial" w:eastAsia="Arial" w:hAnsi="Arial"/>
+                <w:color w:val="1E293B"/>
+                <w:sz w:val="21"/>
+                <w:szCs w:val="21"/>
+              </w:rPr>
+              <w:t xml:space="preserve">Pause migration for HITL confirmation when shared Admin notebooks are detected</w:t>
+            </w:r>
+          </w:p>
+        </w:tc>
+        <w:tc>
+          <w:tcPr>
+            <w:tcW w:type="pct" w:w="15%"/>
+            <w:shd w:fill="FFFFFF"/>
+            <w:tcMar>
+              <w:top w:type="dxa" w:w="80"/>
+              <w:left w:type="dxa" w:w="140"/>
+              <w:bottom w:type="dxa" w:w="80"/>
+              <w:right w:type="dxa" w:w="140"/>
+            </w:tcMar>
+          </w:tcPr>
+          <w:p>
+            <w:pPr>
+              <w:spacing w:after="40"/>
+            </w:pPr>
+            <w:r>
+              <w:rPr>
+                <w:rFonts w:ascii="Arial" w:cs="Arial" w:eastAsia="Arial" w:hAnsi="Arial"/>
+                <w:color w:val="1E293B"/>
+                <w:sz w:val="21"/>
+                <w:szCs w:val="21"/>
+              </w:rPr>
+              <w:t xml:space="preserve">false</w:t>
+            </w:r>
+          </w:p>
+        </w:tc>
+      </w:tr>
+      <w:tr>
+        <w:tc>
+          <w:tcPr>
+            <w:tcW w:type="pct" w:w="25%"/>
+            <w:shd w:fill="F8FAFC"/>
+            <w:tcMar>
+              <w:top w:type="dxa" w:w="80"/>
+              <w:left w:type="dxa" w:w="140"/>
+              <w:bottom w:type="dxa" w:w="80"/>
+              <w:right w:type="dxa" w:w="140"/>
+            </w:tcMar>
+          </w:tcPr>
+          <w:p>
+            <w:pPr>
+              <w:spacing w:after="40"/>
+            </w:pPr>
+            <w:r>
+              <w:rPr>
+                <w:rFonts w:ascii="Arial" w:cs="Arial" w:eastAsia="Arial" w:hAnsi="Arial"/>
+                <w:color w:val="1E293B"/>
+                <w:sz w:val="21"/>
+                <w:szCs w:val="21"/>
+              </w:rPr>
+              <w:t xml:space="preserve">--no-connector-hitl</w:t>
+            </w:r>
+          </w:p>
+        </w:tc>
+        <w:tc>
+          <w:tcPr>
+            <w:tcW w:type="pct" w:w="15%"/>
+            <w:shd w:fill="F8FAFC"/>
+            <w:tcMar>
+              <w:top w:type="dxa" w:w="80"/>
+              <w:left w:type="dxa" w:w="140"/>
+              <w:bottom w:type="dxa" w:w="80"/>
+              <w:right w:type="dxa" w:w="140"/>
+            </w:tcMar>
+          </w:tcPr>
+          <w:p>
+            <w:pPr>
+              <w:spacing w:after="40"/>
+            </w:pPr>
+            <w:r>
+              <w:rPr>
+                <w:rFonts w:ascii="Arial" w:cs="Arial" w:eastAsia="Arial" w:hAnsi="Arial"/>
+                <w:color w:val="1E293B"/>
+                <w:sz w:val="21"/>
+                <w:szCs w:val="21"/>
+              </w:rPr>
+              <w:t xml:space="preserve">—</w:t>
+            </w:r>
+          </w:p>
+        </w:tc>
+        <w:tc>
+          <w:tcPr>
+            <w:tcW w:type="pct" w:w="45%"/>
+            <w:shd w:fill="F8FAFC"/>
+            <w:tcMar>
+              <w:top w:type="dxa" w:w="80"/>
+              <w:left w:type="dxa" w:w="140"/>
+              <w:bottom w:type="dxa" w:w="80"/>
+              <w:right w:type="dxa" w:w="140"/>
+            </w:tcMar>
+          </w:tcPr>
+          <w:p>
+            <w:pPr>
+              <w:spacing w:after="40"/>
+            </w:pPr>
+            <w:r>
+              <w:rPr>
+                <w:rFonts w:ascii="Arial" w:cs="Arial" w:eastAsia="Arial" w:hAnsi="Arial"/>
+                <w:color w:val="1E293B"/>
+                <w:sz w:val="21"/>
+                <w:szCs w:val="21"/>
+              </w:rPr>
+              <w:t xml:space="preserve">Disable HITL validation prompts when unmapped agent connectors/datastores are detected</w:t>
+            </w:r>
+          </w:p>
+        </w:tc>
+        <w:tc>
+          <w:tcPr>
+            <w:tcW w:type="pct" w:w="15%"/>
+            <w:shd w:fill="F8FAFC"/>
+            <w:tcMar>
+              <w:top w:type="dxa" w:w="80"/>
+              <w:left w:type="dxa" w:w="140"/>
+              <w:bottom w:type="dxa" w:w="80"/>
+              <w:right w:type="dxa" w:w="140"/>
+            </w:tcMar>
+          </w:tcPr>
+          <w:p>
+            <w:pPr>
+              <w:spacing w:after="40"/>
+            </w:pPr>
+            <w:r>
+              <w:rPr>
+                <w:rFonts w:ascii="Arial" w:cs="Arial" w:eastAsia="Arial" w:hAnsi="Arial"/>
+                <w:color w:val="1E293B"/>
+                <w:sz w:val="21"/>
+                <w:szCs w:val="21"/>
+              </w:rPr>
+              <w:t xml:space="preserve">Prompts enabled</w:t>
             </w:r>
           </w:p>
         </w:tc>

</xml_diff>

<commit_message>
feat: update UI to mark Skills and Memory migrations as experimental and add a placeholder for Projects
</commit_message>
<xml_diff>
--- a/INSTALLATION_GUIDE.docx
+++ b/INSTALLATION_GUIDE.docx
@@ -482,7 +482,26 @@
           <w:sz w:val="21"/>
           <w:szCs w:val="21"/>
         </w:rPr>
-        <w:t xml:space="preserve">, </w:t>
+        <w:t xml:space="preserve"> (</w:t>
+      </w:r>
+      <w:r>
+        <w:rPr>
+          <w:rFonts w:ascii="Consolas" w:cs="Consolas" w:eastAsia="Consolas" w:hAnsi="Consolas"/>
+          <w:color w:val="0F172A"/>
+          <w:sz w:val="19"/>
+          <w:szCs w:val="19"/>
+          <w:shd w:fill="F1F5F9"/>
+        </w:rPr>
+        <w:t xml:space="preserve">Experimental</w:t>
+      </w:r>
+      <w:r>
+        <w:rPr>
+          <w:rFonts w:ascii="Arial" w:cs="Arial" w:eastAsia="Arial" w:hAnsi="Arial"/>
+          <w:color w:val="1E293B"/>
+          <w:sz w:val="21"/>
+          <w:szCs w:val="21"/>
+        </w:rPr>
+        <w:t xml:space="preserve"> — may not work for everyone), </w:t>
       </w:r>
       <w:r>
         <w:rPr>
@@ -522,7 +541,26 @@
           <w:sz w:val="21"/>
           <w:szCs w:val="21"/>
         </w:rPr>
-        <w:t xml:space="preserve">, and </w:t>
+        <w:t xml:space="preserve"> (</w:t>
+      </w:r>
+      <w:r>
+        <w:rPr>
+          <w:rFonts w:ascii="Consolas" w:cs="Consolas" w:eastAsia="Consolas" w:hAnsi="Consolas"/>
+          <w:color w:val="0F172A"/>
+          <w:sz w:val="19"/>
+          <w:szCs w:val="19"/>
+          <w:shd w:fill="F1F5F9"/>
+        </w:rPr>
+        <w:t xml:space="preserve">Experimental</w:t>
+      </w:r>
+      <w:r>
+        <w:rPr>
+          <w:rFonts w:ascii="Arial" w:cs="Arial" w:eastAsia="Arial" w:hAnsi="Arial"/>
+          <w:color w:val="1E293B"/>
+          <w:sz w:val="21"/>
+          <w:szCs w:val="21"/>
+        </w:rPr>
+        <w:t xml:space="preserve"> — may not work for everyone), </w:t>
       </w:r>
       <w:r>
         <w:rPr>
@@ -542,7 +580,46 @@
           <w:sz w:val="21"/>
           <w:szCs w:val="21"/>
         </w:rPr>
-        <w:t xml:space="preserve"> (Presentations, Infographics, Videos, Interactive Quizzes, and Flashcards).</w:t>
+        <w:t xml:space="preserve"> (Presentations, Infographics, Videos, Interactive Quizzes, and Flashcards), and </w:t>
+      </w:r>
+      <w:r>
+        <w:rPr>
+          <w:rFonts w:ascii="Arial" w:cs="Arial" w:eastAsia="Arial" w:hAnsi="Arial"/>
+          <w:b/>
+          <w:bCs/>
+          <w:color w:val="0F172A"/>
+          <w:sz w:val="21"/>
+          <w:szCs w:val="21"/>
+        </w:rPr>
+        <w:t xml:space="preserve">Gemini Enterprise Projects</w:t>
+      </w:r>
+      <w:r>
+        <w:rPr>
+          <w:rFonts w:ascii="Arial" w:cs="Arial" w:eastAsia="Arial" w:hAnsi="Arial"/>
+          <w:color w:val="1E293B"/>
+          <w:sz w:val="21"/>
+          <w:szCs w:val="21"/>
+        </w:rPr>
+        <w:t xml:space="preserve"> (</w:t>
+      </w:r>
+      <w:r>
+        <w:rPr>
+          <w:rFonts w:ascii="Consolas" w:cs="Consolas" w:eastAsia="Consolas" w:hAnsi="Consolas"/>
+          <w:color w:val="0F172A"/>
+          <w:sz w:val="19"/>
+          <w:szCs w:val="19"/>
+          <w:shd w:fill="F1F5F9"/>
+        </w:rPr>
+        <w:t xml:space="preserve">WIP</w:t>
+      </w:r>
+      <w:r>
+        <w:rPr>
+          <w:rFonts w:ascii="Arial" w:cs="Arial" w:eastAsia="Arial" w:hAnsi="Arial"/>
+          <w:color w:val="1E293B"/>
+          <w:sz w:val="21"/>
+          <w:szCs w:val="21"/>
+        </w:rPr>
+        <w:t xml:space="preserve">).</w:t>
       </w:r>
     </w:p>
     <w:p>
@@ -7382,7 +7459,7 @@
                 <w:sz w:val="21"/>
                 <w:szCs w:val="21"/>
               </w:rPr>
-              <w:t xml:space="preserve">Skip personalized memories and facts migration</w:t>
+              <w:t xml:space="preserve">Skip personalized memories and facts migration (Experimental — may not work for everyone)</w:t>
             </w:r>
           </w:p>
         </w:tc>
@@ -7408,7 +7485,7 @@
                 <w:sz w:val="21"/>
                 <w:szCs w:val="21"/>
               </w:rPr>
-              <w:t xml:space="preserve">Enabled</w:t>
+              <w:t xml:space="preserve">Enabled (Exp)</w:t>
             </w:r>
           </w:p>
         </w:tc>
@@ -7488,7 +7565,7 @@
                 <w:sz w:val="21"/>
                 <w:szCs w:val="21"/>
               </w:rPr>
-              <w:t xml:space="preserve">Skip Agent Registry custom skills migration</w:t>
+              <w:t xml:space="preserve">Skip Agent Registry custom skills migration (Experimental — may not work for everyone)</w:t>
             </w:r>
           </w:p>
         </w:tc>
@@ -7514,7 +7591,7 @@
                 <w:sz w:val="21"/>
                 <w:szCs w:val="21"/>
               </w:rPr>
-              <w:t xml:space="preserve">Enabled</w:t>
+              <w:t xml:space="preserve">Enabled (Exp)</w:t>
             </w:r>
           </w:p>
         </w:tc>
@@ -7594,7 +7671,7 @@
                 <w:sz w:val="21"/>
                 <w:szCs w:val="21"/>
               </w:rPr>
-              <w:t xml:space="preserve">Export JSON snapshot of user memories to local disk</w:t>
+              <w:t xml:space="preserve">Export JSON snapshot of user memories to local disk (Experimental)</w:t>
             </w:r>
           </w:p>
         </w:tc>

</xml_diff>

<commit_message>
feat: upgrade to v1.7.0, add excludeDraftAgents option, and refine concurrency limits
</commit_message>
<xml_diff>
--- a/INSTALLATION_GUIDE.docx
+++ b/INSTALLATION_GUIDE.docx
@@ -37,7 +37,7 @@
     </w:p>
     <w:tbl>
       <w:tblPr>
-        <w:tblW w:type="pct" w:w="100%"/>
+        <w:tblW w:type="pct" w:w="5000"/>
         <w:tblBorders>
           <w:top w:val="single" w:color="CBD5E1" w:sz="1"/>
           <w:left w:val="single" w:color="CBD5E1" w:sz="1"/>
@@ -48,14 +48,14 @@
         </w:tblBorders>
       </w:tblPr>
       <w:tblGrid>
-        <w:gridCol w:w="100"/>
-        <w:gridCol w:w="100"/>
+        <w:gridCol w:w="2708"/>
+        <w:gridCol w:w="6318"/>
       </w:tblGrid>
       <w:tr>
         <w:tc>
           <w:tcPr>
-            <w:tcW w:type="pct" w:w="30%"/>
-            <w:shd w:fill="F1F5F9"/>
+            <w:tcW w:type="pct" w:w="1500"/>
+            <w:shd w:fill="F1F5F9" w:val="clear"/>
             <w:tcMar>
               <w:top w:type="dxa" w:w="80"/>
               <w:left w:type="dxa" w:w="140"/>
@@ -79,8 +79,8 @@
         </w:tc>
         <w:tc>
           <w:tcPr>
-            <w:tcW w:type="pct" w:w="70%"/>
-            <w:shd w:fill="FFFFFF"/>
+            <w:tcW w:type="pct" w:w="3500"/>
+            <w:shd w:fill="FFFFFF" w:val="clear"/>
             <w:tcMar>
               <w:top w:type="dxa" w:w="80"/>
               <w:left w:type="dxa" w:w="140"/>
@@ -96,7 +96,7 @@
                 <w:sz w:val="19"/>
                 <w:szCs w:val="19"/>
               </w:rPr>
-              <w:t xml:space="preserve">v1.6.3 (Enterprise Release)</w:t>
+              <w:t xml:space="preserve">v1.7.0 (Enterprise Release)</w:t>
             </w:r>
           </w:p>
         </w:tc>
@@ -104,8 +104,8 @@
       <w:tr>
         <w:tc>
           <w:tcPr>
-            <w:tcW w:type="pct" w:w="30%"/>
-            <w:shd w:fill="F1F5F9"/>
+            <w:tcW w:type="pct" w:w="1500"/>
+            <w:shd w:fill="F1F5F9" w:val="clear"/>
             <w:tcMar>
               <w:top w:type="dxa" w:w="80"/>
               <w:left w:type="dxa" w:w="140"/>
@@ -129,8 +129,8 @@
         </w:tc>
         <w:tc>
           <w:tcPr>
-            <w:tcW w:type="pct" w:w="70%"/>
-            <w:shd w:fill="FFFFFF"/>
+            <w:tcW w:type="pct" w:w="3500"/>
+            <w:shd w:fill="FFFFFF" w:val="clear"/>
             <w:tcMar>
               <w:top w:type="dxa" w:w="80"/>
               <w:left w:type="dxa" w:w="140"/>
@@ -154,8 +154,8 @@
       <w:tr>
         <w:tc>
           <w:tcPr>
-            <w:tcW w:type="pct" w:w="30%"/>
-            <w:shd w:fill="F1F5F9"/>
+            <w:tcW w:type="pct" w:w="1500"/>
+            <w:shd w:fill="F1F5F9" w:val="clear"/>
             <w:tcMar>
               <w:top w:type="dxa" w:w="80"/>
               <w:left w:type="dxa" w:w="140"/>
@@ -179,8 +179,8 @@
         </w:tc>
         <w:tc>
           <w:tcPr>
-            <w:tcW w:type="pct" w:w="70%"/>
-            <w:shd w:fill="FFFFFF"/>
+            <w:tcW w:type="pct" w:w="3500"/>
+            <w:shd w:fill="FFFFFF" w:val="clear"/>
             <w:tcMar>
               <w:top w:type="dxa" w:w="80"/>
               <w:left w:type="dxa" w:w="140"/>
@@ -204,8 +204,8 @@
       <w:tr>
         <w:tc>
           <w:tcPr>
-            <w:tcW w:type="pct" w:w="30%"/>
-            <w:shd w:fill="F1F5F9"/>
+            <w:tcW w:type="pct" w:w="1500"/>
+            <w:shd w:fill="F1F5F9" w:val="clear"/>
             <w:tcMar>
               <w:top w:type="dxa" w:w="80"/>
               <w:left w:type="dxa" w:w="140"/>
@@ -229,8 +229,8 @@
         </w:tc>
         <w:tc>
           <w:tcPr>
-            <w:tcW w:type="pct" w:w="70%"/>
-            <w:shd w:fill="FFFFFF"/>
+            <w:tcW w:type="pct" w:w="3500"/>
+            <w:shd w:fill="FFFFFF" w:val="clear"/>
             <w:tcMar>
               <w:top w:type="dxa" w:w="80"/>
               <w:left w:type="dxa" w:w="140"/>
@@ -254,8 +254,8 @@
       <w:tr>
         <w:tc>
           <w:tcPr>
-            <w:tcW w:type="pct" w:w="30%"/>
-            <w:shd w:fill="F1F5F9"/>
+            <w:tcW w:type="pct" w:w="1500"/>
+            <w:shd w:fill="F1F5F9" w:val="clear"/>
             <w:tcMar>
               <w:top w:type="dxa" w:w="80"/>
               <w:left w:type="dxa" w:w="140"/>
@@ -279,8 +279,8 @@
         </w:tc>
         <w:tc>
           <w:tcPr>
-            <w:tcW w:type="pct" w:w="70%"/>
-            <w:shd w:fill="FFFFFF"/>
+            <w:tcW w:type="pct" w:w="3500"/>
+            <w:shd w:fill="FFFFFF" w:val="clear"/>
             <w:tcMar>
               <w:top w:type="dxa" w:w="80"/>
               <w:left w:type="dxa" w:w="140"/>
@@ -358,7 +358,7 @@
           <w:color w:val="0F172A"/>
           <w:sz w:val="19"/>
           <w:szCs w:val="19"/>
-          <w:shd w:fill="F1F5F9"/>
+          <w:shd w:fill="F1F5F9" w:val="clear"/>
         </w:rPr>
         <w:t xml:space="preserve">gemini-migrate</w:t>
       </w:r>
@@ -451,7 +451,7 @@
           <w:color w:val="0F172A"/>
           <w:sz w:val="19"/>
           <w:szCs w:val="19"/>
-          <w:shd w:fill="F1F5F9"/>
+          <w:shd w:fill="F1F5F9" w:val="clear"/>
         </w:rPr>
         <w:t xml:space="preserve">_#####</w:t>
       </w:r>
@@ -490,7 +490,7 @@
           <w:color w:val="0F172A"/>
           <w:sz w:val="19"/>
           <w:szCs w:val="19"/>
-          <w:shd w:fill="F1F5F9"/>
+          <w:shd w:fill="F1F5F9" w:val="clear"/>
         </w:rPr>
         <w:t xml:space="preserve">Experimental</w:t>
       </w:r>
@@ -549,7 +549,7 @@
           <w:color w:val="0F172A"/>
           <w:sz w:val="19"/>
           <w:szCs w:val="19"/>
-          <w:shd w:fill="F1F5F9"/>
+          <w:shd w:fill="F1F5F9" w:val="clear"/>
         </w:rPr>
         <w:t xml:space="preserve">Experimental</w:t>
       </w:r>
@@ -608,7 +608,7 @@
           <w:color w:val="0F172A"/>
           <w:sz w:val="19"/>
           <w:szCs w:val="19"/>
-          <w:shd w:fill="F1F5F9"/>
+          <w:shd w:fill="F1F5F9" w:val="clear"/>
         </w:rPr>
         <w:t xml:space="preserve">WIP</w:t>
       </w:r>
@@ -627,7 +627,7 @@
         <w:pBdr>
           <w:left w:val="single" w:color="DC2626" w:sz="24" w:space="140"/>
         </w:pBdr>
-        <w:shd w:fill="FEF2F2"/>
+        <w:shd w:fill="FEF2F2" w:val="clear"/>
         <w:spacing w:after="160" w:before="140"/>
         <w:ind w:left="400" w:right="200"/>
       </w:pPr>
@@ -699,7 +699,7 @@
           <w:color w:val="0F172A"/>
           <w:sz w:val="19"/>
           <w:szCs w:val="19"/>
-          <w:shd w:fill="F1F5F9"/>
+          <w:shd w:fill="F1F5F9" w:val="clear"/>
         </w:rPr>
         <w:t xml:space="preserve">127.0.0.1</w:t>
       </w:r>
@@ -718,7 +718,7 @@
           <w:color w:val="0F172A"/>
           <w:sz w:val="19"/>
           <w:szCs w:val="19"/>
-          <w:shd w:fill="F1F5F9"/>
+          <w:shd w:fill="F1F5F9" w:val="clear"/>
         </w:rPr>
         <w:t xml:space="preserve">localhost</w:t>
       </w:r>
@@ -767,7 +767,7 @@
           <w:color w:val="0F172A"/>
           <w:sz w:val="19"/>
           <w:szCs w:val="19"/>
-          <w:shd w:fill="F1F5F9"/>
+          <w:shd w:fill="F1F5F9" w:val="clear"/>
         </w:rPr>
         <w:t xml:space="preserve">discoveryengine.googleapis.com</w:t>
       </w:r>
@@ -786,7 +786,7 @@
           <w:color w:val="0F172A"/>
           <w:sz w:val="19"/>
           <w:szCs w:val="19"/>
-          <w:shd w:fill="F1F5F9"/>
+          <w:shd w:fill="F1F5F9" w:val="clear"/>
         </w:rPr>
         <w:t xml:space="preserve">agentregistry.googleapis.com</w:t>
       </w:r>
@@ -805,7 +805,7 @@
           <w:color w:val="0F172A"/>
           <w:sz w:val="19"/>
           <w:szCs w:val="19"/>
-          <w:shd w:fill="F1F5F9"/>
+          <w:shd w:fill="F1F5F9" w:val="clear"/>
         </w:rPr>
         <w:t xml:space="preserve">gmail.googleapis.com</w:t>
       </w:r>
@@ -824,7 +824,7 @@
           <w:color w:val="0F172A"/>
           <w:sz w:val="19"/>
           <w:szCs w:val="19"/>
-          <w:shd w:fill="F1F5F9"/>
+          <w:shd w:fill="F1F5F9" w:val="clear"/>
         </w:rPr>
         <w:t xml:space="preserve">sts.googleapis.com</w:t>
       </w:r>
@@ -843,7 +843,7 @@
           <w:color w:val="0F172A"/>
           <w:sz w:val="19"/>
           <w:szCs w:val="19"/>
-          <w:shd w:fill="F1F5F9"/>
+          <w:shd w:fill="F1F5F9" w:val="clear"/>
         </w:rPr>
         <w:t xml:space="preserve">secretmanager.googleapis.com</w:t>
       </w:r>
@@ -892,7 +892,7 @@
           <w:color w:val="0F172A"/>
           <w:sz w:val="19"/>
           <w:szCs w:val="19"/>
-          <w:shd w:fill="F1F5F9"/>
+          <w:shd w:fill="F1F5F9" w:val="clear"/>
         </w:rPr>
         <w:t xml:space="preserve">sa-dwd-key.json</w:t>
       </w:r>
@@ -911,7 +911,7 @@
           <w:color w:val="0F172A"/>
           <w:sz w:val="19"/>
           <w:szCs w:val="19"/>
-          <w:shd w:fill="F1F5F9"/>
+          <w:shd w:fill="F1F5F9" w:val="clear"/>
         </w:rPr>
         <w:t xml:space="preserve">wif-migration-key.pem</w:t>
       </w:r>
@@ -960,7 +960,7 @@
           <w:color w:val="0F172A"/>
           <w:sz w:val="19"/>
           <w:szCs w:val="19"/>
-          <w:shd w:fill="F1F5F9"/>
+          <w:shd w:fill="F1F5F9" w:val="clear"/>
         </w:rPr>
         <w:t xml:space="preserve">Authorization: Bearer</w:t>
       </w:r>
@@ -1062,7 +1062,7 @@
     </w:p>
     <w:tbl>
       <w:tblPr>
-        <w:tblW w:type="pct" w:w="100%"/>
+        <w:tblW w:type="pct" w:w="5000"/>
         <w:tblBorders>
           <w:top w:val="single" w:color="CBD5E1" w:sz="1"/>
           <w:left w:val="single" w:color="CBD5E1" w:sz="1"/>
@@ -1073,10 +1073,10 @@
         </w:tblBorders>
       </w:tblPr>
       <w:tblGrid>
-        <w:gridCol w:w="100"/>
-        <w:gridCol w:w="100"/>
-        <w:gridCol w:w="100"/>
-        <w:gridCol w:w="100"/>
+        <w:gridCol w:w="1805"/>
+        <w:gridCol w:w="1805"/>
+        <w:gridCol w:w="2257"/>
+        <w:gridCol w:w="3159"/>
       </w:tblGrid>
       <w:tr>
         <w:trPr>
@@ -1084,8 +1084,8 @@
         </w:trPr>
         <w:tc>
           <w:tcPr>
-            <w:tcW w:type="pct" w:w="20%"/>
-            <w:shd w:fill="1E293B"/>
+            <w:tcW w:type="pct" w:w="1000"/>
+            <w:shd w:fill="1E293B" w:val="clear"/>
             <w:tcMar>
               <w:top w:type="dxa" w:w="100"/>
               <w:left w:type="dxa" w:w="140"/>
@@ -1112,8 +1112,8 @@
         </w:tc>
         <w:tc>
           <w:tcPr>
-            <w:tcW w:type="pct" w:w="20%"/>
-            <w:shd w:fill="1E293B"/>
+            <w:tcW w:type="pct" w:w="1000"/>
+            <w:shd w:fill="1E293B" w:val="clear"/>
             <w:tcMar>
               <w:top w:type="dxa" w:w="100"/>
               <w:left w:type="dxa" w:w="140"/>
@@ -1140,8 +1140,8 @@
         </w:tc>
         <w:tc>
           <w:tcPr>
-            <w:tcW w:type="pct" w:w="25%"/>
-            <w:shd w:fill="1E293B"/>
+            <w:tcW w:type="pct" w:w="1250"/>
+            <w:shd w:fill="1E293B" w:val="clear"/>
             <w:tcMar>
               <w:top w:type="dxa" w:w="100"/>
               <w:left w:type="dxa" w:w="140"/>
@@ -1168,8 +1168,8 @@
         </w:tc>
         <w:tc>
           <w:tcPr>
-            <w:tcW w:type="pct" w:w="35%"/>
-            <w:shd w:fill="1E293B"/>
+            <w:tcW w:type="pct" w:w="1750"/>
+            <w:shd w:fill="1E293B" w:val="clear"/>
             <w:tcMar>
               <w:top w:type="dxa" w:w="100"/>
               <w:left w:type="dxa" w:w="140"/>
@@ -1198,8 +1198,8 @@
       <w:tr>
         <w:tc>
           <w:tcPr>
-            <w:tcW w:type="pct" w:w="20%"/>
-            <w:shd w:fill="FFFFFF"/>
+            <w:tcW w:type="pct" w:w="1000"/>
+            <w:shd w:fill="FFFFFF" w:val="clear"/>
             <w:tcMar>
               <w:top w:type="dxa" w:w="80"/>
               <w:left w:type="dxa" w:w="140"/>
@@ -1224,8 +1224,8 @@
         </w:tc>
         <w:tc>
           <w:tcPr>
-            <w:tcW w:type="pct" w:w="20%"/>
-            <w:shd w:fill="FFFFFF"/>
+            <w:tcW w:type="pct" w:w="1000"/>
+            <w:shd w:fill="FFFFFF" w:val="clear"/>
             <w:tcMar>
               <w:top w:type="dxa" w:w="80"/>
               <w:left w:type="dxa" w:w="140"/>
@@ -1250,8 +1250,8 @@
         </w:tc>
         <w:tc>
           <w:tcPr>
-            <w:tcW w:type="pct" w:w="25%"/>
-            <w:shd w:fill="FFFFFF"/>
+            <w:tcW w:type="pct" w:w="1250"/>
+            <w:shd w:fill="FFFFFF" w:val="clear"/>
             <w:tcMar>
               <w:top w:type="dxa" w:w="80"/>
               <w:left w:type="dxa" w:w="140"/>
@@ -1276,8 +1276,8 @@
         </w:tc>
         <w:tc>
           <w:tcPr>
-            <w:tcW w:type="pct" w:w="35%"/>
-            <w:shd w:fill="FFFFFF"/>
+            <w:tcW w:type="pct" w:w="1750"/>
+            <w:shd w:fill="FFFFFF" w:val="clear"/>
             <w:tcMar>
               <w:top w:type="dxa" w:w="80"/>
               <w:left w:type="dxa" w:w="140"/>
@@ -1304,8 +1304,8 @@
       <w:tr>
         <w:tc>
           <w:tcPr>
-            <w:tcW w:type="pct" w:w="20%"/>
-            <w:shd w:fill="F8FAFC"/>
+            <w:tcW w:type="pct" w:w="1000"/>
+            <w:shd w:fill="F8FAFC" w:val="clear"/>
             <w:tcMar>
               <w:top w:type="dxa" w:w="80"/>
               <w:left w:type="dxa" w:w="140"/>
@@ -1330,8 +1330,8 @@
         </w:tc>
         <w:tc>
           <w:tcPr>
-            <w:tcW w:type="pct" w:w="20%"/>
-            <w:shd w:fill="F8FAFC"/>
+            <w:tcW w:type="pct" w:w="1000"/>
+            <w:shd w:fill="F8FAFC" w:val="clear"/>
             <w:tcMar>
               <w:top w:type="dxa" w:w="80"/>
               <w:left w:type="dxa" w:w="140"/>
@@ -1356,8 +1356,8 @@
         </w:tc>
         <w:tc>
           <w:tcPr>
-            <w:tcW w:type="pct" w:w="25%"/>
-            <w:shd w:fill="F8FAFC"/>
+            <w:tcW w:type="pct" w:w="1250"/>
+            <w:shd w:fill="F8FAFC" w:val="clear"/>
             <w:tcMar>
               <w:top w:type="dxa" w:w="80"/>
               <w:left w:type="dxa" w:w="140"/>
@@ -1382,8 +1382,8 @@
         </w:tc>
         <w:tc>
           <w:tcPr>
-            <w:tcW w:type="pct" w:w="35%"/>
-            <w:shd w:fill="F8FAFC"/>
+            <w:tcW w:type="pct" w:w="1750"/>
+            <w:shd w:fill="F8FAFC" w:val="clear"/>
             <w:tcMar>
               <w:top w:type="dxa" w:w="80"/>
               <w:left w:type="dxa" w:w="140"/>
@@ -1410,8 +1410,8 @@
       <w:tr>
         <w:tc>
           <w:tcPr>
-            <w:tcW w:type="pct" w:w="20%"/>
-            <w:shd w:fill="FFFFFF"/>
+            <w:tcW w:type="pct" w:w="1000"/>
+            <w:shd w:fill="FFFFFF" w:val="clear"/>
             <w:tcMar>
               <w:top w:type="dxa" w:w="80"/>
               <w:left w:type="dxa" w:w="140"/>
@@ -1436,8 +1436,8 @@
         </w:tc>
         <w:tc>
           <w:tcPr>
-            <w:tcW w:type="pct" w:w="20%"/>
-            <w:shd w:fill="FFFFFF"/>
+            <w:tcW w:type="pct" w:w="1000"/>
+            <w:shd w:fill="FFFFFF" w:val="clear"/>
             <w:tcMar>
               <w:top w:type="dxa" w:w="80"/>
               <w:left w:type="dxa" w:w="140"/>
@@ -1462,8 +1462,8 @@
         </w:tc>
         <w:tc>
           <w:tcPr>
-            <w:tcW w:type="pct" w:w="25%"/>
-            <w:shd w:fill="FFFFFF"/>
+            <w:tcW w:type="pct" w:w="1250"/>
+            <w:shd w:fill="FFFFFF" w:val="clear"/>
             <w:tcMar>
               <w:top w:type="dxa" w:w="80"/>
               <w:left w:type="dxa" w:w="140"/>
@@ -1490,7 +1490,7 @@
                 <w:color w:val="0F172A"/>
                 <w:sz w:val="19"/>
                 <w:szCs w:val="19"/>
-                <w:shd w:fill="F1F5F9"/>
+                <w:shd w:fill="F1F5F9" w:val="clear"/>
               </w:rPr>
               <w:t xml:space="preserve">gcloud components update</w:t>
             </w:r>
@@ -1507,8 +1507,8 @@
         </w:tc>
         <w:tc>
           <w:tcPr>
-            <w:tcW w:type="pct" w:w="35%"/>
-            <w:shd w:fill="FFFFFF"/>
+            <w:tcW w:type="pct" w:w="1750"/>
+            <w:shd w:fill="FFFFFF" w:val="clear"/>
             <w:tcMar>
               <w:top w:type="dxa" w:w="80"/>
               <w:left w:type="dxa" w:w="140"/>
@@ -1535,8 +1535,8 @@
       <w:tr>
         <w:tc>
           <w:tcPr>
-            <w:tcW w:type="pct" w:w="20%"/>
-            <w:shd w:fill="F8FAFC"/>
+            <w:tcW w:type="pct" w:w="1000"/>
+            <w:shd w:fill="F8FAFC" w:val="clear"/>
             <w:tcMar>
               <w:top w:type="dxa" w:w="80"/>
               <w:left w:type="dxa" w:w="140"/>
@@ -1561,8 +1561,8 @@
         </w:tc>
         <w:tc>
           <w:tcPr>
-            <w:tcW w:type="pct" w:w="20%"/>
-            <w:shd w:fill="F8FAFC"/>
+            <w:tcW w:type="pct" w:w="1000"/>
+            <w:shd w:fill="F8FAFC" w:val="clear"/>
             <w:tcMar>
               <w:top w:type="dxa" w:w="80"/>
               <w:left w:type="dxa" w:w="140"/>
@@ -1587,8 +1587,8 @@
         </w:tc>
         <w:tc>
           <w:tcPr>
-            <w:tcW w:type="pct" w:w="25%"/>
-            <w:shd w:fill="F8FAFC"/>
+            <w:tcW w:type="pct" w:w="1250"/>
+            <w:shd w:fill="F8FAFC" w:val="clear"/>
             <w:tcMar>
               <w:top w:type="dxa" w:w="80"/>
               <w:left w:type="dxa" w:w="140"/>
@@ -1613,8 +1613,8 @@
         </w:tc>
         <w:tc>
           <w:tcPr>
-            <w:tcW w:type="pct" w:w="35%"/>
-            <w:shd w:fill="F8FAFC"/>
+            <w:tcW w:type="pct" w:w="1750"/>
+            <w:shd w:fill="F8FAFC" w:val="clear"/>
             <w:tcMar>
               <w:top w:type="dxa" w:w="80"/>
               <w:left w:type="dxa" w:w="140"/>
@@ -1641,8 +1641,8 @@
       <w:tr>
         <w:tc>
           <w:tcPr>
-            <w:tcW w:type="pct" w:w="20%"/>
-            <w:shd w:fill="FFFFFF"/>
+            <w:tcW w:type="pct" w:w="1000"/>
+            <w:shd w:fill="FFFFFF" w:val="clear"/>
             <w:tcMar>
               <w:top w:type="dxa" w:w="80"/>
               <w:left w:type="dxa" w:w="140"/>
@@ -1667,8 +1667,8 @@
         </w:tc>
         <w:tc>
           <w:tcPr>
-            <w:tcW w:type="pct" w:w="20%"/>
-            <w:shd w:fill="FFFFFF"/>
+            <w:tcW w:type="pct" w:w="1000"/>
+            <w:shd w:fill="FFFFFF" w:val="clear"/>
             <w:tcMar>
               <w:top w:type="dxa" w:w="80"/>
               <w:left w:type="dxa" w:w="140"/>
@@ -1693,8 +1693,8 @@
         </w:tc>
         <w:tc>
           <w:tcPr>
-            <w:tcW w:type="pct" w:w="25%"/>
-            <w:shd w:fill="FFFFFF"/>
+            <w:tcW w:type="pct" w:w="1250"/>
+            <w:shd w:fill="FFFFFF" w:val="clear"/>
             <w:tcMar>
               <w:top w:type="dxa" w:w="80"/>
               <w:left w:type="dxa" w:w="140"/>
@@ -1721,7 +1721,7 @@
                 <w:color w:val="0F172A"/>
                 <w:sz w:val="19"/>
                 <w:szCs w:val="19"/>
-                <w:shd w:fill="F1F5F9"/>
+                <w:shd w:fill="F1F5F9" w:val="clear"/>
               </w:rPr>
               <w:t xml:space="preserve">apt install ffmpeg</w:t>
             </w:r>
@@ -1738,8 +1738,8 @@
         </w:tc>
         <w:tc>
           <w:tcPr>
-            <w:tcW w:type="pct" w:w="35%"/>
-            <w:shd w:fill="FFFFFF"/>
+            <w:tcW w:type="pct" w:w="1750"/>
+            <w:shd w:fill="FFFFFF" w:val="clear"/>
             <w:tcMar>
               <w:top w:type="dxa" w:w="80"/>
               <w:left w:type="dxa" w:w="140"/>
@@ -1787,11 +1787,11 @@
       <w:pPr>
         <w:pBdr>
           <w:top w:val="single" w:color="CBD5E1" w:sz="6" w:space="60"/>
+          <w:left w:val="single" w:color="3B82F6" w:sz="18" w:space="100"/>
           <w:bottom w:val="single" w:color="CBD5E1" w:sz="6" w:space="60"/>
-          <w:left w:val="single" w:color="3B82F6" w:sz="18" w:space="100"/>
           <w:right w:val="single" w:color="CBD5E1" w:sz="6" w:space="60"/>
         </w:pBdr>
-        <w:shd w:fill="F8FAFC"/>
+        <w:shd w:fill="F8FAFC" w:val="clear"/>
         <w:spacing w:after="140" w:before="120"/>
         <w:ind w:left="400" w:right="200"/>
       </w:pPr>
@@ -1900,7 +1900,7 @@
     </w:p>
     <w:tbl>
       <w:tblPr>
-        <w:tblW w:type="pct" w:w="100%"/>
+        <w:tblW w:type="pct" w:w="5000"/>
         <w:tblBorders>
           <w:top w:val="single" w:color="CBD5E1" w:sz="1"/>
           <w:left w:val="single" w:color="CBD5E1" w:sz="1"/>
@@ -1911,10 +1911,10 @@
         </w:tblBorders>
       </w:tblPr>
       <w:tblGrid>
-        <w:gridCol w:w="100"/>
-        <w:gridCol w:w="100"/>
-        <w:gridCol w:w="100"/>
-        <w:gridCol w:w="100"/>
+        <w:gridCol w:w="2257"/>
+        <w:gridCol w:w="2708"/>
+        <w:gridCol w:w="1805"/>
+        <w:gridCol w:w="2257"/>
       </w:tblGrid>
       <w:tr>
         <w:trPr>
@@ -1922,8 +1922,8 @@
         </w:trPr>
         <w:tc>
           <w:tcPr>
-            <w:tcW w:type="pct" w:w="25%"/>
-            <w:shd w:fill="1E293B"/>
+            <w:tcW w:type="pct" w:w="1250"/>
+            <w:shd w:fill="1E293B" w:val="clear"/>
             <w:tcMar>
               <w:top w:type="dxa" w:w="100"/>
               <w:left w:type="dxa" w:w="140"/>
@@ -1950,8 +1950,8 @@
         </w:tc>
         <w:tc>
           <w:tcPr>
-            <w:tcW w:type="pct" w:w="30%"/>
-            <w:shd w:fill="1E293B"/>
+            <w:tcW w:type="pct" w:w="1500"/>
+            <w:shd w:fill="1E293B" w:val="clear"/>
             <w:tcMar>
               <w:top w:type="dxa" w:w="100"/>
               <w:left w:type="dxa" w:w="140"/>
@@ -1978,8 +1978,8 @@
         </w:tc>
         <w:tc>
           <w:tcPr>
-            <w:tcW w:type="pct" w:w="20%"/>
-            <w:shd w:fill="1E293B"/>
+            <w:tcW w:type="pct" w:w="1000"/>
+            <w:shd w:fill="1E293B" w:val="clear"/>
             <w:tcMar>
               <w:top w:type="dxa" w:w="100"/>
               <w:left w:type="dxa" w:w="140"/>
@@ -2006,8 +2006,8 @@
         </w:tc>
         <w:tc>
           <w:tcPr>
-            <w:tcW w:type="pct" w:w="25%"/>
-            <w:shd w:fill="1E293B"/>
+            <w:tcW w:type="pct" w:w="1250"/>
+            <w:shd w:fill="1E293B" w:val="clear"/>
             <w:tcMar>
               <w:top w:type="dxa" w:w="100"/>
               <w:left w:type="dxa" w:w="140"/>
@@ -2036,8 +2036,8 @@
       <w:tr>
         <w:tc>
           <w:tcPr>
-            <w:tcW w:type="pct" w:w="25%"/>
-            <w:shd w:fill="FFFFFF"/>
+            <w:tcW w:type="pct" w:w="1250"/>
+            <w:shd w:fill="FFFFFF" w:val="clear"/>
             <w:tcMar>
               <w:top w:type="dxa" w:w="80"/>
               <w:left w:type="dxa" w:w="140"/>
@@ -2062,8 +2062,8 @@
         </w:tc>
         <w:tc>
           <w:tcPr>
-            <w:tcW w:type="pct" w:w="30%"/>
-            <w:shd w:fill="FFFFFF"/>
+            <w:tcW w:type="pct" w:w="1500"/>
+            <w:shd w:fill="FFFFFF" w:val="clear"/>
             <w:tcMar>
               <w:top w:type="dxa" w:w="80"/>
               <w:left w:type="dxa" w:w="140"/>
@@ -2088,8 +2088,8 @@
         </w:tc>
         <w:tc>
           <w:tcPr>
-            <w:tcW w:type="pct" w:w="20%"/>
-            <w:shd w:fill="FFFFFF"/>
+            <w:tcW w:type="pct" w:w="1000"/>
+            <w:shd w:fill="FFFFFF" w:val="clear"/>
             <w:tcMar>
               <w:top w:type="dxa" w:w="80"/>
               <w:left w:type="dxa" w:w="140"/>
@@ -2114,8 +2114,8 @@
         </w:tc>
         <w:tc>
           <w:tcPr>
-            <w:tcW w:type="pct" w:w="25%"/>
-            <w:shd w:fill="FFFFFF"/>
+            <w:tcW w:type="pct" w:w="1250"/>
+            <w:shd w:fill="FFFFFF" w:val="clear"/>
             <w:tcMar>
               <w:top w:type="dxa" w:w="80"/>
               <w:left w:type="dxa" w:w="140"/>
@@ -2142,8 +2142,8 @@
       <w:tr>
         <w:tc>
           <w:tcPr>
-            <w:tcW w:type="pct" w:w="25%"/>
-            <w:shd w:fill="F8FAFC"/>
+            <w:tcW w:type="pct" w:w="1250"/>
+            <w:shd w:fill="F8FAFC" w:val="clear"/>
             <w:tcMar>
               <w:top w:type="dxa" w:w="80"/>
               <w:left w:type="dxa" w:w="140"/>
@@ -2168,8 +2168,8 @@
         </w:tc>
         <w:tc>
           <w:tcPr>
-            <w:tcW w:type="pct" w:w="30%"/>
-            <w:shd w:fill="F8FAFC"/>
+            <w:tcW w:type="pct" w:w="1500"/>
+            <w:shd w:fill="F8FAFC" w:val="clear"/>
             <w:tcMar>
               <w:top w:type="dxa" w:w="80"/>
               <w:left w:type="dxa" w:w="140"/>
@@ -2194,8 +2194,8 @@
         </w:tc>
         <w:tc>
           <w:tcPr>
-            <w:tcW w:type="pct" w:w="20%"/>
-            <w:shd w:fill="F8FAFC"/>
+            <w:tcW w:type="pct" w:w="1000"/>
+            <w:shd w:fill="F8FAFC" w:val="clear"/>
             <w:tcMar>
               <w:top w:type="dxa" w:w="80"/>
               <w:left w:type="dxa" w:w="140"/>
@@ -2220,8 +2220,8 @@
         </w:tc>
         <w:tc>
           <w:tcPr>
-            <w:tcW w:type="pct" w:w="25%"/>
-            <w:shd w:fill="F8FAFC"/>
+            <w:tcW w:type="pct" w:w="1250"/>
+            <w:shd w:fill="F8FAFC" w:val="clear"/>
             <w:tcMar>
               <w:top w:type="dxa" w:w="80"/>
               <w:left w:type="dxa" w:w="140"/>
@@ -2248,8 +2248,8 @@
       <w:tr>
         <w:tc>
           <w:tcPr>
-            <w:tcW w:type="pct" w:w="25%"/>
-            <w:shd w:fill="FFFFFF"/>
+            <w:tcW w:type="pct" w:w="1250"/>
+            <w:shd w:fill="FFFFFF" w:val="clear"/>
             <w:tcMar>
               <w:top w:type="dxa" w:w="80"/>
               <w:left w:type="dxa" w:w="140"/>
@@ -2274,8 +2274,8 @@
         </w:tc>
         <w:tc>
           <w:tcPr>
-            <w:tcW w:type="pct" w:w="30%"/>
-            <w:shd w:fill="FFFFFF"/>
+            <w:tcW w:type="pct" w:w="1500"/>
+            <w:shd w:fill="FFFFFF" w:val="clear"/>
             <w:tcMar>
               <w:top w:type="dxa" w:w="80"/>
               <w:left w:type="dxa" w:w="140"/>
@@ -2300,8 +2300,8 @@
         </w:tc>
         <w:tc>
           <w:tcPr>
-            <w:tcW w:type="pct" w:w="20%"/>
-            <w:shd w:fill="FFFFFF"/>
+            <w:tcW w:type="pct" w:w="1000"/>
+            <w:shd w:fill="FFFFFF" w:val="clear"/>
             <w:tcMar>
               <w:top w:type="dxa" w:w="80"/>
               <w:left w:type="dxa" w:w="140"/>
@@ -2326,8 +2326,8 @@
         </w:tc>
         <w:tc>
           <w:tcPr>
-            <w:tcW w:type="pct" w:w="25%"/>
-            <w:shd w:fill="FFFFFF"/>
+            <w:tcW w:type="pct" w:w="1250"/>
+            <w:shd w:fill="FFFFFF" w:val="clear"/>
             <w:tcMar>
               <w:top w:type="dxa" w:w="80"/>
               <w:left w:type="dxa" w:w="140"/>
@@ -2354,8 +2354,8 @@
       <w:tr>
         <w:tc>
           <w:tcPr>
-            <w:tcW w:type="pct" w:w="25%"/>
-            <w:shd w:fill="F8FAFC"/>
+            <w:tcW w:type="pct" w:w="1250"/>
+            <w:shd w:fill="F8FAFC" w:val="clear"/>
             <w:tcMar>
               <w:top w:type="dxa" w:w="80"/>
               <w:left w:type="dxa" w:w="140"/>
@@ -2380,8 +2380,8 @@
         </w:tc>
         <w:tc>
           <w:tcPr>
-            <w:tcW w:type="pct" w:w="30%"/>
-            <w:shd w:fill="F8FAFC"/>
+            <w:tcW w:type="pct" w:w="1500"/>
+            <w:shd w:fill="F8FAFC" w:val="clear"/>
             <w:tcMar>
               <w:top w:type="dxa" w:w="80"/>
               <w:left w:type="dxa" w:w="140"/>
@@ -2406,8 +2406,8 @@
         </w:tc>
         <w:tc>
           <w:tcPr>
-            <w:tcW w:type="pct" w:w="20%"/>
-            <w:shd w:fill="F8FAFC"/>
+            <w:tcW w:type="pct" w:w="1000"/>
+            <w:shd w:fill="F8FAFC" w:val="clear"/>
             <w:tcMar>
               <w:top w:type="dxa" w:w="80"/>
               <w:left w:type="dxa" w:w="140"/>
@@ -2432,8 +2432,8 @@
         </w:tc>
         <w:tc>
           <w:tcPr>
-            <w:tcW w:type="pct" w:w="25%"/>
-            <w:shd w:fill="F8FAFC"/>
+            <w:tcW w:type="pct" w:w="1250"/>
+            <w:shd w:fill="F8FAFC" w:val="clear"/>
             <w:tcMar>
               <w:top w:type="dxa" w:w="80"/>
               <w:left w:type="dxa" w:w="140"/>
@@ -2460,8 +2460,8 @@
       <w:tr>
         <w:tc>
           <w:tcPr>
-            <w:tcW w:type="pct" w:w="25%"/>
-            <w:shd w:fill="FFFFFF"/>
+            <w:tcW w:type="pct" w:w="1250"/>
+            <w:shd w:fill="FFFFFF" w:val="clear"/>
             <w:tcMar>
               <w:top w:type="dxa" w:w="80"/>
               <w:left w:type="dxa" w:w="140"/>
@@ -2486,8 +2486,8 @@
         </w:tc>
         <w:tc>
           <w:tcPr>
-            <w:tcW w:type="pct" w:w="30%"/>
-            <w:shd w:fill="FFFFFF"/>
+            <w:tcW w:type="pct" w:w="1500"/>
+            <w:shd w:fill="FFFFFF" w:val="clear"/>
             <w:tcMar>
               <w:top w:type="dxa" w:w="80"/>
               <w:left w:type="dxa" w:w="140"/>
@@ -2512,8 +2512,8 @@
         </w:tc>
         <w:tc>
           <w:tcPr>
-            <w:tcW w:type="pct" w:w="20%"/>
-            <w:shd w:fill="FFFFFF"/>
+            <w:tcW w:type="pct" w:w="1000"/>
+            <w:shd w:fill="FFFFFF" w:val="clear"/>
             <w:tcMar>
               <w:top w:type="dxa" w:w="80"/>
               <w:left w:type="dxa" w:w="140"/>
@@ -2538,8 +2538,8 @@
         </w:tc>
         <w:tc>
           <w:tcPr>
-            <w:tcW w:type="pct" w:w="25%"/>
-            <w:shd w:fill="FFFFFF"/>
+            <w:tcW w:type="pct" w:w="1250"/>
+            <w:shd w:fill="FFFFFF" w:val="clear"/>
             <w:tcMar>
               <w:top w:type="dxa" w:w="80"/>
               <w:left w:type="dxa" w:w="140"/>
@@ -2566,8 +2566,8 @@
       <w:tr>
         <w:tc>
           <w:tcPr>
-            <w:tcW w:type="pct" w:w="25%"/>
-            <w:shd w:fill="F8FAFC"/>
+            <w:tcW w:type="pct" w:w="1250"/>
+            <w:shd w:fill="F8FAFC" w:val="clear"/>
             <w:tcMar>
               <w:top w:type="dxa" w:w="80"/>
               <w:left w:type="dxa" w:w="140"/>
@@ -2592,8 +2592,8 @@
         </w:tc>
         <w:tc>
           <w:tcPr>
-            <w:tcW w:type="pct" w:w="30%"/>
-            <w:shd w:fill="F8FAFC"/>
+            <w:tcW w:type="pct" w:w="1500"/>
+            <w:shd w:fill="F8FAFC" w:val="clear"/>
             <w:tcMar>
               <w:top w:type="dxa" w:w="80"/>
               <w:left w:type="dxa" w:w="140"/>
@@ -2618,8 +2618,8 @@
         </w:tc>
         <w:tc>
           <w:tcPr>
-            <w:tcW w:type="pct" w:w="20%"/>
-            <w:shd w:fill="F8FAFC"/>
+            <w:tcW w:type="pct" w:w="1000"/>
+            <w:shd w:fill="F8FAFC" w:val="clear"/>
             <w:tcMar>
               <w:top w:type="dxa" w:w="80"/>
               <w:left w:type="dxa" w:w="140"/>
@@ -2644,8 +2644,8 @@
         </w:tc>
         <w:tc>
           <w:tcPr>
-            <w:tcW w:type="pct" w:w="25%"/>
-            <w:shd w:fill="F8FAFC"/>
+            <w:tcW w:type="pct" w:w="1250"/>
+            <w:shd w:fill="F8FAFC" w:val="clear"/>
             <w:tcMar>
               <w:top w:type="dxa" w:w="80"/>
               <w:left w:type="dxa" w:w="140"/>
@@ -2672,8 +2672,8 @@
       <w:tr>
         <w:tc>
           <w:tcPr>
-            <w:tcW w:type="pct" w:w="25%"/>
-            <w:shd w:fill="FFFFFF"/>
+            <w:tcW w:type="pct" w:w="1250"/>
+            <w:shd w:fill="FFFFFF" w:val="clear"/>
             <w:tcMar>
               <w:top w:type="dxa" w:w="80"/>
               <w:left w:type="dxa" w:w="140"/>
@@ -2698,8 +2698,8 @@
         </w:tc>
         <w:tc>
           <w:tcPr>
-            <w:tcW w:type="pct" w:w="30%"/>
-            <w:shd w:fill="FFFFFF"/>
+            <w:tcW w:type="pct" w:w="1500"/>
+            <w:shd w:fill="FFFFFF" w:val="clear"/>
             <w:tcMar>
               <w:top w:type="dxa" w:w="80"/>
               <w:left w:type="dxa" w:w="140"/>
@@ -2724,8 +2724,8 @@
         </w:tc>
         <w:tc>
           <w:tcPr>
-            <w:tcW w:type="pct" w:w="20%"/>
-            <w:shd w:fill="FFFFFF"/>
+            <w:tcW w:type="pct" w:w="1000"/>
+            <w:shd w:fill="FFFFFF" w:val="clear"/>
             <w:tcMar>
               <w:top w:type="dxa" w:w="80"/>
               <w:left w:type="dxa" w:w="140"/>
@@ -2750,8 +2750,8 @@
         </w:tc>
         <w:tc>
           <w:tcPr>
-            <w:tcW w:type="pct" w:w="25%"/>
-            <w:shd w:fill="FFFFFF"/>
+            <w:tcW w:type="pct" w:w="1250"/>
+            <w:shd w:fill="FFFFFF" w:val="clear"/>
             <w:tcMar>
               <w:top w:type="dxa" w:w="80"/>
               <w:left w:type="dxa" w:w="140"/>
@@ -2800,7 +2800,7 @@
           <w:color w:val="0F172A"/>
           <w:sz w:val="19"/>
           <w:szCs w:val="19"/>
-          <w:shd w:fill="F1F5F9"/>
+          <w:shd w:fill="F1F5F9" w:val="clear"/>
         </w:rPr>
         <w:t xml:space="preserve">gcloud</w:t>
       </w:r>
@@ -2818,11 +2818,11 @@
       <w:pPr>
         <w:pBdr>
           <w:top w:val="single" w:color="CBD5E1" w:sz="6" w:space="60"/>
+          <w:left w:val="single" w:color="3B82F6" w:sz="18" w:space="100"/>
           <w:bottom w:val="single" w:color="CBD5E1" w:sz="6" w:space="60"/>
-          <w:left w:val="single" w:color="3B82F6" w:sz="18" w:space="100"/>
           <w:right w:val="single" w:color="CBD5E1" w:sz="6" w:space="60"/>
         </w:pBdr>
-        <w:shd w:fill="F8FAFC"/>
+        <w:shd w:fill="F8FAFC" w:val="clear"/>
         <w:spacing w:after="140" w:before="120"/>
         <w:ind w:left="400" w:right="200"/>
       </w:pPr>
@@ -3011,7 +3011,7 @@
     </w:p>
     <w:tbl>
       <w:tblPr>
-        <w:tblW w:type="pct" w:w="100%"/>
+        <w:tblW w:type="pct" w:w="5000"/>
         <w:tblBorders>
           <w:top w:val="single" w:color="CBD5E1" w:sz="1"/>
           <w:left w:val="single" w:color="CBD5E1" w:sz="1"/>
@@ -3022,10 +3022,10 @@
         </w:tblBorders>
       </w:tblPr>
       <w:tblGrid>
-        <w:gridCol w:w="100"/>
-        <w:gridCol w:w="100"/>
-        <w:gridCol w:w="100"/>
-        <w:gridCol w:w="100"/>
+        <w:gridCol w:w="1805"/>
+        <w:gridCol w:w="3159"/>
+        <w:gridCol w:w="1805"/>
+        <w:gridCol w:w="2257"/>
       </w:tblGrid>
       <w:tr>
         <w:trPr>
@@ -3033,8 +3033,8 @@
         </w:trPr>
         <w:tc>
           <w:tcPr>
-            <w:tcW w:type="pct" w:w="20%"/>
-            <w:shd w:fill="1E293B"/>
+            <w:tcW w:type="pct" w:w="1000"/>
+            <w:shd w:fill="1E293B" w:val="clear"/>
             <w:tcMar>
               <w:top w:type="dxa" w:w="100"/>
               <w:left w:type="dxa" w:w="140"/>
@@ -3061,8 +3061,8 @@
         </w:tc>
         <w:tc>
           <w:tcPr>
-            <w:tcW w:type="pct" w:w="35%"/>
-            <w:shd w:fill="1E293B"/>
+            <w:tcW w:type="pct" w:w="1750"/>
+            <w:shd w:fill="1E293B" w:val="clear"/>
             <w:tcMar>
               <w:top w:type="dxa" w:w="100"/>
               <w:left w:type="dxa" w:w="140"/>
@@ -3089,8 +3089,8 @@
         </w:tc>
         <w:tc>
           <w:tcPr>
-            <w:tcW w:type="pct" w:w="20%"/>
-            <w:shd w:fill="1E293B"/>
+            <w:tcW w:type="pct" w:w="1000"/>
+            <w:shd w:fill="1E293B" w:val="clear"/>
             <w:tcMar>
               <w:top w:type="dxa" w:w="100"/>
               <w:left w:type="dxa" w:w="140"/>
@@ -3117,8 +3117,8 @@
         </w:tc>
         <w:tc>
           <w:tcPr>
-            <w:tcW w:type="pct" w:w="25%"/>
-            <w:shd w:fill="1E293B"/>
+            <w:tcW w:type="pct" w:w="1250"/>
+            <w:shd w:fill="1E293B" w:val="clear"/>
             <w:tcMar>
               <w:top w:type="dxa" w:w="100"/>
               <w:left w:type="dxa" w:w="140"/>
@@ -3147,8 +3147,8 @@
       <w:tr>
         <w:tc>
           <w:tcPr>
-            <w:tcW w:type="pct" w:w="20%"/>
-            <w:shd w:fill="FFFFFF"/>
+            <w:tcW w:type="pct" w:w="1000"/>
+            <w:shd w:fill="FFFFFF" w:val="clear"/>
             <w:tcMar>
               <w:top w:type="dxa" w:w="80"/>
               <w:left w:type="dxa" w:w="140"/>
@@ -3173,8 +3173,8 @@
         </w:tc>
         <w:tc>
           <w:tcPr>
-            <w:tcW w:type="pct" w:w="35%"/>
-            <w:shd w:fill="FFFFFF"/>
+            <w:tcW w:type="pct" w:w="1750"/>
+            <w:shd w:fill="FFFFFF" w:val="clear"/>
             <w:tcMar>
               <w:top w:type="dxa" w:w="80"/>
               <w:left w:type="dxa" w:w="140"/>
@@ -3199,8 +3199,8 @@
         </w:tc>
         <w:tc>
           <w:tcPr>
-            <w:tcW w:type="pct" w:w="20%"/>
-            <w:shd w:fill="FFFFFF"/>
+            <w:tcW w:type="pct" w:w="1000"/>
+            <w:shd w:fill="FFFFFF" w:val="clear"/>
             <w:tcMar>
               <w:top w:type="dxa" w:w="80"/>
               <w:left w:type="dxa" w:w="140"/>
@@ -3225,8 +3225,8 @@
         </w:tc>
         <w:tc>
           <w:tcPr>
-            <w:tcW w:type="pct" w:w="25%"/>
-            <w:shd w:fill="FFFFFF"/>
+            <w:tcW w:type="pct" w:w="1250"/>
+            <w:shd w:fill="FFFFFF" w:val="clear"/>
             <w:tcMar>
               <w:top w:type="dxa" w:w="80"/>
               <w:left w:type="dxa" w:w="140"/>
@@ -3253,8 +3253,8 @@
       <w:tr>
         <w:tc>
           <w:tcPr>
-            <w:tcW w:type="pct" w:w="20%"/>
-            <w:shd w:fill="F8FAFC"/>
+            <w:tcW w:type="pct" w:w="1000"/>
+            <w:shd w:fill="F8FAFC" w:val="clear"/>
             <w:tcMar>
               <w:top w:type="dxa" w:w="80"/>
               <w:left w:type="dxa" w:w="140"/>
@@ -3279,8 +3279,8 @@
         </w:tc>
         <w:tc>
           <w:tcPr>
-            <w:tcW w:type="pct" w:w="35%"/>
-            <w:shd w:fill="F8FAFC"/>
+            <w:tcW w:type="pct" w:w="1750"/>
+            <w:shd w:fill="F8FAFC" w:val="clear"/>
             <w:tcMar>
               <w:top w:type="dxa" w:w="80"/>
               <w:left w:type="dxa" w:w="140"/>
@@ -3305,8 +3305,8 @@
         </w:tc>
         <w:tc>
           <w:tcPr>
-            <w:tcW w:type="pct" w:w="20%"/>
-            <w:shd w:fill="F8FAFC"/>
+            <w:tcW w:type="pct" w:w="1000"/>
+            <w:shd w:fill="F8FAFC" w:val="clear"/>
             <w:tcMar>
               <w:top w:type="dxa" w:w="80"/>
               <w:left w:type="dxa" w:w="140"/>
@@ -3331,8 +3331,8 @@
         </w:tc>
         <w:tc>
           <w:tcPr>
-            <w:tcW w:type="pct" w:w="25%"/>
-            <w:shd w:fill="F8FAFC"/>
+            <w:tcW w:type="pct" w:w="1250"/>
+            <w:shd w:fill="F8FAFC" w:val="clear"/>
             <w:tcMar>
               <w:top w:type="dxa" w:w="80"/>
               <w:left w:type="dxa" w:w="140"/>
@@ -3359,8 +3359,8 @@
       <w:tr>
         <w:tc>
           <w:tcPr>
-            <w:tcW w:type="pct" w:w="20%"/>
-            <w:shd w:fill="FFFFFF"/>
+            <w:tcW w:type="pct" w:w="1000"/>
+            <w:shd w:fill="FFFFFF" w:val="clear"/>
             <w:tcMar>
               <w:top w:type="dxa" w:w="80"/>
               <w:left w:type="dxa" w:w="140"/>
@@ -3385,8 +3385,8 @@
         </w:tc>
         <w:tc>
           <w:tcPr>
-            <w:tcW w:type="pct" w:w="35%"/>
-            <w:shd w:fill="FFFFFF"/>
+            <w:tcW w:type="pct" w:w="1750"/>
+            <w:shd w:fill="FFFFFF" w:val="clear"/>
             <w:tcMar>
               <w:top w:type="dxa" w:w="80"/>
               <w:left w:type="dxa" w:w="140"/>
@@ -3411,8 +3411,8 @@
         </w:tc>
         <w:tc>
           <w:tcPr>
-            <w:tcW w:type="pct" w:w="20%"/>
-            <w:shd w:fill="FFFFFF"/>
+            <w:tcW w:type="pct" w:w="1000"/>
+            <w:shd w:fill="FFFFFF" w:val="clear"/>
             <w:tcMar>
               <w:top w:type="dxa" w:w="80"/>
               <w:left w:type="dxa" w:w="140"/>
@@ -3437,8 +3437,8 @@
         </w:tc>
         <w:tc>
           <w:tcPr>
-            <w:tcW w:type="pct" w:w="25%"/>
-            <w:shd w:fill="FFFFFF"/>
+            <w:tcW w:type="pct" w:w="1250"/>
+            <w:shd w:fill="FFFFFF" w:val="clear"/>
             <w:tcMar>
               <w:top w:type="dxa" w:w="80"/>
               <w:left w:type="dxa" w:w="140"/>
@@ -3465,8 +3465,8 @@
       <w:tr>
         <w:tc>
           <w:tcPr>
-            <w:tcW w:type="pct" w:w="20%"/>
-            <w:shd w:fill="F8FAFC"/>
+            <w:tcW w:type="pct" w:w="1000"/>
+            <w:shd w:fill="F8FAFC" w:val="clear"/>
             <w:tcMar>
               <w:top w:type="dxa" w:w="80"/>
               <w:left w:type="dxa" w:w="140"/>
@@ -3491,8 +3491,8 @@
         </w:tc>
         <w:tc>
           <w:tcPr>
-            <w:tcW w:type="pct" w:w="35%"/>
-            <w:shd w:fill="F8FAFC"/>
+            <w:tcW w:type="pct" w:w="1750"/>
+            <w:shd w:fill="F8FAFC" w:val="clear"/>
             <w:tcMar>
               <w:top w:type="dxa" w:w="80"/>
               <w:left w:type="dxa" w:w="140"/>
@@ -3517,8 +3517,8 @@
         </w:tc>
         <w:tc>
           <w:tcPr>
-            <w:tcW w:type="pct" w:w="20%"/>
-            <w:shd w:fill="F8FAFC"/>
+            <w:tcW w:type="pct" w:w="1000"/>
+            <w:shd w:fill="F8FAFC" w:val="clear"/>
             <w:tcMar>
               <w:top w:type="dxa" w:w="80"/>
               <w:left w:type="dxa" w:w="140"/>
@@ -3543,8 +3543,8 @@
         </w:tc>
         <w:tc>
           <w:tcPr>
-            <w:tcW w:type="pct" w:w="25%"/>
-            <w:shd w:fill="F8FAFC"/>
+            <w:tcW w:type="pct" w:w="1250"/>
+            <w:shd w:fill="F8FAFC" w:val="clear"/>
             <w:tcMar>
               <w:top w:type="dxa" w:w="80"/>
               <w:left w:type="dxa" w:w="140"/>
@@ -3571,8 +3571,8 @@
       <w:tr>
         <w:tc>
           <w:tcPr>
-            <w:tcW w:type="pct" w:w="20%"/>
-            <w:shd w:fill="FFFFFF"/>
+            <w:tcW w:type="pct" w:w="1000"/>
+            <w:shd w:fill="FFFFFF" w:val="clear"/>
             <w:tcMar>
               <w:top w:type="dxa" w:w="80"/>
               <w:left w:type="dxa" w:w="140"/>
@@ -3597,8 +3597,8 @@
         </w:tc>
         <w:tc>
           <w:tcPr>
-            <w:tcW w:type="pct" w:w="35%"/>
-            <w:shd w:fill="FFFFFF"/>
+            <w:tcW w:type="pct" w:w="1750"/>
+            <w:shd w:fill="FFFFFF" w:val="clear"/>
             <w:tcMar>
               <w:top w:type="dxa" w:w="80"/>
               <w:left w:type="dxa" w:w="140"/>
@@ -3623,8 +3623,8 @@
         </w:tc>
         <w:tc>
           <w:tcPr>
-            <w:tcW w:type="pct" w:w="20%"/>
-            <w:shd w:fill="FFFFFF"/>
+            <w:tcW w:type="pct" w:w="1000"/>
+            <w:shd w:fill="FFFFFF" w:val="clear"/>
             <w:tcMar>
               <w:top w:type="dxa" w:w="80"/>
               <w:left w:type="dxa" w:w="140"/>
@@ -3649,8 +3649,8 @@
         </w:tc>
         <w:tc>
           <w:tcPr>
-            <w:tcW w:type="pct" w:w="25%"/>
-            <w:shd w:fill="FFFFFF"/>
+            <w:tcW w:type="pct" w:w="1250"/>
+            <w:shd w:fill="FFFFFF" w:val="clear"/>
             <w:tcMar>
               <w:top w:type="dxa" w:w="80"/>
               <w:left w:type="dxa" w:w="140"/>
@@ -3677,8 +3677,8 @@
       <w:tr>
         <w:tc>
           <w:tcPr>
-            <w:tcW w:type="pct" w:w="20%"/>
-            <w:shd w:fill="F8FAFC"/>
+            <w:tcW w:type="pct" w:w="1000"/>
+            <w:shd w:fill="F8FAFC" w:val="clear"/>
             <w:tcMar>
               <w:top w:type="dxa" w:w="80"/>
               <w:left w:type="dxa" w:w="140"/>
@@ -3703,8 +3703,8 @@
         </w:tc>
         <w:tc>
           <w:tcPr>
-            <w:tcW w:type="pct" w:w="35%"/>
-            <w:shd w:fill="F8FAFC"/>
+            <w:tcW w:type="pct" w:w="1750"/>
+            <w:shd w:fill="F8FAFC" w:val="clear"/>
             <w:tcMar>
               <w:top w:type="dxa" w:w="80"/>
               <w:left w:type="dxa" w:w="140"/>
@@ -3729,8 +3729,8 @@
         </w:tc>
         <w:tc>
           <w:tcPr>
-            <w:tcW w:type="pct" w:w="20%"/>
-            <w:shd w:fill="F8FAFC"/>
+            <w:tcW w:type="pct" w:w="1000"/>
+            <w:shd w:fill="F8FAFC" w:val="clear"/>
             <w:tcMar>
               <w:top w:type="dxa" w:w="80"/>
               <w:left w:type="dxa" w:w="140"/>
@@ -3755,8 +3755,8 @@
         </w:tc>
         <w:tc>
           <w:tcPr>
-            <w:tcW w:type="pct" w:w="25%"/>
-            <w:shd w:fill="F8FAFC"/>
+            <w:tcW w:type="pct" w:w="1250"/>
+            <w:shd w:fill="F8FAFC" w:val="clear"/>
             <w:tcMar>
               <w:top w:type="dxa" w:w="80"/>
               <w:left w:type="dxa" w:w="140"/>
@@ -3791,7 +3791,7 @@
         <w:pBdr>
           <w:left w:val="single" w:color="16A34A" w:sz="24" w:space="140"/>
         </w:pBdr>
-        <w:shd w:fill="F0FDF4"/>
+        <w:shd w:fill="F0FDF4" w:val="clear"/>
         <w:spacing w:after="160" w:before="140"/>
         <w:ind w:left="400" w:right="200"/>
       </w:pPr>
@@ -3833,7 +3833,7 @@
           <w:color w:val="0F172A"/>
           <w:sz w:val="19"/>
           <w:szCs w:val="19"/>
-          <w:shd w:fill="F1F5F9"/>
+          <w:shd w:fill="F1F5F9" w:val="clear"/>
         </w:rPr>
         <w:t xml:space="preserve">roles/serviceusage.serviceUsageConsumer</w:t>
       </w:r>
@@ -3852,7 +3852,7 @@
           <w:color w:val="0F172A"/>
           <w:sz w:val="19"/>
           <w:szCs w:val="19"/>
-          <w:shd w:fill="F1F5F9"/>
+          <w:shd w:fill="F1F5F9" w:val="clear"/>
         </w:rPr>
         <w:t xml:space="preserve">roles/iam.securityReviewer</w:t>
       </w:r>
@@ -3891,7 +3891,7 @@
     </w:p>
     <w:tbl>
       <w:tblPr>
-        <w:tblW w:type="pct" w:w="100%"/>
+        <w:tblW w:type="pct" w:w="5000"/>
         <w:tblBorders>
           <w:top w:val="single" w:color="CBD5E1" w:sz="1"/>
           <w:left w:val="single" w:color="CBD5E1" w:sz="1"/>
@@ -3902,10 +3902,10 @@
         </w:tblBorders>
       </w:tblPr>
       <w:tblGrid>
-        <w:gridCol w:w="100"/>
-        <w:gridCol w:w="100"/>
-        <w:gridCol w:w="100"/>
-        <w:gridCol w:w="100"/>
+        <w:gridCol w:w="2708"/>
+        <w:gridCol w:w="1805"/>
+        <w:gridCol w:w="2257"/>
+        <w:gridCol w:w="2257"/>
       </w:tblGrid>
       <w:tr>
         <w:trPr>
@@ -3913,8 +3913,8 @@
         </w:trPr>
         <w:tc>
           <w:tcPr>
-            <w:tcW w:type="pct" w:w="30%"/>
-            <w:shd w:fill="1E293B"/>
+            <w:tcW w:type="pct" w:w="1500"/>
+            <w:shd w:fill="1E293B" w:val="clear"/>
             <w:tcMar>
               <w:top w:type="dxa" w:w="100"/>
               <w:left w:type="dxa" w:w="140"/>
@@ -3941,8 +3941,8 @@
         </w:tc>
         <w:tc>
           <w:tcPr>
-            <w:tcW w:type="pct" w:w="20%"/>
-            <w:shd w:fill="1E293B"/>
+            <w:tcW w:type="pct" w:w="1000"/>
+            <w:shd w:fill="1E293B" w:val="clear"/>
             <w:tcMar>
               <w:top w:type="dxa" w:w="100"/>
               <w:left w:type="dxa" w:w="140"/>
@@ -3969,8 +3969,8 @@
         </w:tc>
         <w:tc>
           <w:tcPr>
-            <w:tcW w:type="pct" w:w="25%"/>
-            <w:shd w:fill="1E293B"/>
+            <w:tcW w:type="pct" w:w="1250"/>
+            <w:shd w:fill="1E293B" w:val="clear"/>
             <w:tcMar>
               <w:top w:type="dxa" w:w="100"/>
               <w:left w:type="dxa" w:w="140"/>
@@ -3997,8 +3997,8 @@
         </w:tc>
         <w:tc>
           <w:tcPr>
-            <w:tcW w:type="pct" w:w="25%"/>
-            <w:shd w:fill="1E293B"/>
+            <w:tcW w:type="pct" w:w="1250"/>
+            <w:shd w:fill="1E293B" w:val="clear"/>
             <w:tcMar>
               <w:top w:type="dxa" w:w="100"/>
               <w:left w:type="dxa" w:w="140"/>
@@ -4027,8 +4027,8 @@
       <w:tr>
         <w:tc>
           <w:tcPr>
-            <w:tcW w:type="pct" w:w="30%"/>
-            <w:shd w:fill="FFFFFF"/>
+            <w:tcW w:type="pct" w:w="1500"/>
+            <w:shd w:fill="FFFFFF" w:val="clear"/>
             <w:tcMar>
               <w:top w:type="dxa" w:w="80"/>
               <w:left w:type="dxa" w:w="140"/>
@@ -4053,8 +4053,8 @@
         </w:tc>
         <w:tc>
           <w:tcPr>
-            <w:tcW w:type="pct" w:w="20%"/>
-            <w:shd w:fill="FFFFFF"/>
+            <w:tcW w:type="pct" w:w="1000"/>
+            <w:shd w:fill="FFFFFF" w:val="clear"/>
             <w:tcMar>
               <w:top w:type="dxa" w:w="80"/>
               <w:left w:type="dxa" w:w="140"/>
@@ -4079,8 +4079,8 @@
         </w:tc>
         <w:tc>
           <w:tcPr>
-            <w:tcW w:type="pct" w:w="25%"/>
-            <w:shd w:fill="FFFFFF"/>
+            <w:tcW w:type="pct" w:w="1250"/>
+            <w:shd w:fill="FFFFFF" w:val="clear"/>
             <w:tcMar>
               <w:top w:type="dxa" w:w="80"/>
               <w:left w:type="dxa" w:w="140"/>
@@ -4105,8 +4105,8 @@
         </w:tc>
         <w:tc>
           <w:tcPr>
-            <w:tcW w:type="pct" w:w="25%"/>
-            <w:shd w:fill="FFFFFF"/>
+            <w:tcW w:type="pct" w:w="1250"/>
+            <w:shd w:fill="FFFFFF" w:val="clear"/>
             <w:tcMar>
               <w:top w:type="dxa" w:w="80"/>
               <w:left w:type="dxa" w:w="140"/>
@@ -4133,8 +4133,8 @@
       <w:tr>
         <w:tc>
           <w:tcPr>
-            <w:tcW w:type="pct" w:w="30%"/>
-            <w:shd w:fill="F8FAFC"/>
+            <w:tcW w:type="pct" w:w="1500"/>
+            <w:shd w:fill="F8FAFC" w:val="clear"/>
             <w:tcMar>
               <w:top w:type="dxa" w:w="80"/>
               <w:left w:type="dxa" w:w="140"/>
@@ -4159,8 +4159,8 @@
         </w:tc>
         <w:tc>
           <w:tcPr>
-            <w:tcW w:type="pct" w:w="20%"/>
-            <w:shd w:fill="F8FAFC"/>
+            <w:tcW w:type="pct" w:w="1000"/>
+            <w:shd w:fill="F8FAFC" w:val="clear"/>
             <w:tcMar>
               <w:top w:type="dxa" w:w="80"/>
               <w:left w:type="dxa" w:w="140"/>
@@ -4185,8 +4185,8 @@
         </w:tc>
         <w:tc>
           <w:tcPr>
-            <w:tcW w:type="pct" w:w="25%"/>
-            <w:shd w:fill="F8FAFC"/>
+            <w:tcW w:type="pct" w:w="1250"/>
+            <w:shd w:fill="F8FAFC" w:val="clear"/>
             <w:tcMar>
               <w:top w:type="dxa" w:w="80"/>
               <w:left w:type="dxa" w:w="140"/>
@@ -4211,8 +4211,8 @@
         </w:tc>
         <w:tc>
           <w:tcPr>
-            <w:tcW w:type="pct" w:w="25%"/>
-            <w:shd w:fill="F8FAFC"/>
+            <w:tcW w:type="pct" w:w="1250"/>
+            <w:shd w:fill="F8FAFC" w:val="clear"/>
             <w:tcMar>
               <w:top w:type="dxa" w:w="80"/>
               <w:left w:type="dxa" w:w="140"/>
@@ -4239,8 +4239,8 @@
       <w:tr>
         <w:tc>
           <w:tcPr>
-            <w:tcW w:type="pct" w:w="30%"/>
-            <w:shd w:fill="FFFFFF"/>
+            <w:tcW w:type="pct" w:w="1500"/>
+            <w:shd w:fill="FFFFFF" w:val="clear"/>
             <w:tcMar>
               <w:top w:type="dxa" w:w="80"/>
               <w:left w:type="dxa" w:w="140"/>
@@ -4265,8 +4265,8 @@
         </w:tc>
         <w:tc>
           <w:tcPr>
-            <w:tcW w:type="pct" w:w="20%"/>
-            <w:shd w:fill="FFFFFF"/>
+            <w:tcW w:type="pct" w:w="1000"/>
+            <w:shd w:fill="FFFFFF" w:val="clear"/>
             <w:tcMar>
               <w:top w:type="dxa" w:w="80"/>
               <w:left w:type="dxa" w:w="140"/>
@@ -4291,8 +4291,8 @@
         </w:tc>
         <w:tc>
           <w:tcPr>
-            <w:tcW w:type="pct" w:w="25%"/>
-            <w:shd w:fill="FFFFFF"/>
+            <w:tcW w:type="pct" w:w="1250"/>
+            <w:shd w:fill="FFFFFF" w:val="clear"/>
             <w:tcMar>
               <w:top w:type="dxa" w:w="80"/>
               <w:left w:type="dxa" w:w="140"/>
@@ -4317,8 +4317,8 @@
         </w:tc>
         <w:tc>
           <w:tcPr>
-            <w:tcW w:type="pct" w:w="25%"/>
-            <w:shd w:fill="FFFFFF"/>
+            <w:tcW w:type="pct" w:w="1250"/>
+            <w:shd w:fill="FFFFFF" w:val="clear"/>
             <w:tcMar>
               <w:top w:type="dxa" w:w="80"/>
               <w:left w:type="dxa" w:w="140"/>
@@ -4345,8 +4345,8 @@
       <w:tr>
         <w:tc>
           <w:tcPr>
-            <w:tcW w:type="pct" w:w="30%"/>
-            <w:shd w:fill="F8FAFC"/>
+            <w:tcW w:type="pct" w:w="1500"/>
+            <w:shd w:fill="F8FAFC" w:val="clear"/>
             <w:tcMar>
               <w:top w:type="dxa" w:w="80"/>
               <w:left w:type="dxa" w:w="140"/>
@@ -4371,8 +4371,8 @@
         </w:tc>
         <w:tc>
           <w:tcPr>
-            <w:tcW w:type="pct" w:w="20%"/>
-            <w:shd w:fill="F8FAFC"/>
+            <w:tcW w:type="pct" w:w="1000"/>
+            <w:shd w:fill="F8FAFC" w:val="clear"/>
             <w:tcMar>
               <w:top w:type="dxa" w:w="80"/>
               <w:left w:type="dxa" w:w="140"/>
@@ -4397,8 +4397,8 @@
         </w:tc>
         <w:tc>
           <w:tcPr>
-            <w:tcW w:type="pct" w:w="25%"/>
-            <w:shd w:fill="F8FAFC"/>
+            <w:tcW w:type="pct" w:w="1250"/>
+            <w:shd w:fill="F8FAFC" w:val="clear"/>
             <w:tcMar>
               <w:top w:type="dxa" w:w="80"/>
               <w:left w:type="dxa" w:w="140"/>
@@ -4423,8 +4423,8 @@
         </w:tc>
         <w:tc>
           <w:tcPr>
-            <w:tcW w:type="pct" w:w="25%"/>
-            <w:shd w:fill="F8FAFC"/>
+            <w:tcW w:type="pct" w:w="1250"/>
+            <w:shd w:fill="F8FAFC" w:val="clear"/>
             <w:tcMar>
               <w:top w:type="dxa" w:w="80"/>
               <w:left w:type="dxa" w:w="140"/>
@@ -4451,8 +4451,8 @@
       <w:tr>
         <w:tc>
           <w:tcPr>
-            <w:tcW w:type="pct" w:w="30%"/>
-            <w:shd w:fill="FFFFFF"/>
+            <w:tcW w:type="pct" w:w="1500"/>
+            <w:shd w:fill="FFFFFF" w:val="clear"/>
             <w:tcMar>
               <w:top w:type="dxa" w:w="80"/>
               <w:left w:type="dxa" w:w="140"/>
@@ -4477,8 +4477,8 @@
         </w:tc>
         <w:tc>
           <w:tcPr>
-            <w:tcW w:type="pct" w:w="20%"/>
-            <w:shd w:fill="FFFFFF"/>
+            <w:tcW w:type="pct" w:w="1000"/>
+            <w:shd w:fill="FFFFFF" w:val="clear"/>
             <w:tcMar>
               <w:top w:type="dxa" w:w="80"/>
               <w:left w:type="dxa" w:w="140"/>
@@ -4503,8 +4503,8 @@
         </w:tc>
         <w:tc>
           <w:tcPr>
-            <w:tcW w:type="pct" w:w="25%"/>
-            <w:shd w:fill="FFFFFF"/>
+            <w:tcW w:type="pct" w:w="1250"/>
+            <w:shd w:fill="FFFFFF" w:val="clear"/>
             <w:tcMar>
               <w:top w:type="dxa" w:w="80"/>
               <w:left w:type="dxa" w:w="140"/>
@@ -4529,8 +4529,8 @@
         </w:tc>
         <w:tc>
           <w:tcPr>
-            <w:tcW w:type="pct" w:w="25%"/>
-            <w:shd w:fill="FFFFFF"/>
+            <w:tcW w:type="pct" w:w="1250"/>
+            <w:shd w:fill="FFFFFF" w:val="clear"/>
             <w:tcMar>
               <w:top w:type="dxa" w:w="80"/>
               <w:left w:type="dxa" w:w="140"/>
@@ -4737,11 +4737,11 @@
       <w:pPr>
         <w:pBdr>
           <w:top w:val="single" w:color="CBD5E1" w:sz="6" w:space="60"/>
+          <w:left w:val="single" w:color="3B82F6" w:sz="18" w:space="100"/>
           <w:bottom w:val="single" w:color="CBD5E1" w:sz="6" w:space="60"/>
-          <w:left w:val="single" w:color="3B82F6" w:sz="18" w:space="100"/>
           <w:right w:val="single" w:color="CBD5E1" w:sz="6" w:space="60"/>
         </w:pBdr>
-        <w:shd w:fill="F8FAFC"/>
+        <w:shd w:fill="F8FAFC" w:val="clear"/>
         <w:spacing w:after="140" w:before="120"/>
         <w:ind w:left="400" w:right="200"/>
       </w:pPr>
@@ -4805,11 +4805,11 @@
       <w:pPr>
         <w:pBdr>
           <w:top w:val="single" w:color="CBD5E1" w:sz="6" w:space="60"/>
+          <w:left w:val="single" w:color="3B82F6" w:sz="18" w:space="100"/>
           <w:bottom w:val="single" w:color="CBD5E1" w:sz="6" w:space="60"/>
-          <w:left w:val="single" w:color="3B82F6" w:sz="18" w:space="100"/>
           <w:right w:val="single" w:color="CBD5E1" w:sz="6" w:space="60"/>
         </w:pBdr>
-        <w:shd w:fill="F8FAFC"/>
+        <w:shd w:fill="F8FAFC" w:val="clear"/>
         <w:spacing w:after="140" w:before="120"/>
         <w:ind w:left="400" w:right="200"/>
       </w:pPr>
@@ -5093,11 +5093,11 @@
       <w:pPr>
         <w:pBdr>
           <w:top w:val="single" w:color="CBD5E1" w:sz="6" w:space="60"/>
+          <w:left w:val="single" w:color="3B82F6" w:sz="18" w:space="100"/>
           <w:bottom w:val="single" w:color="CBD5E1" w:sz="6" w:space="60"/>
-          <w:left w:val="single" w:color="3B82F6" w:sz="18" w:space="100"/>
           <w:right w:val="single" w:color="CBD5E1" w:sz="6" w:space="60"/>
         </w:pBdr>
-        <w:shd w:fill="F8FAFC"/>
+        <w:shd w:fill="F8FAFC" w:val="clear"/>
         <w:spacing w:after="140" w:before="120"/>
         <w:ind w:left="400" w:right="200"/>
       </w:pPr>
@@ -5126,7 +5126,7 @@
         <w:pBdr>
           <w:left w:val="single" w:color="DC2626" w:sz="24" w:space="140"/>
         </w:pBdr>
-        <w:shd w:fill="FEF2F2"/>
+        <w:shd w:fill="FEF2F2" w:val="clear"/>
         <w:spacing w:after="160" w:before="140"/>
         <w:ind w:left="400" w:right="200"/>
       </w:pPr>
@@ -5194,7 +5194,7 @@
           <w:color w:val="0F172A"/>
           <w:sz w:val="19"/>
           <w:szCs w:val="19"/>
-          <w:shd w:fill="F1F5F9"/>
+          <w:shd w:fill="F1F5F9" w:val="clear"/>
         </w:rPr>
         <w:t xml:space="preserve">admin.google.com</w:t>
       </w:r>
@@ -5449,7 +5449,7 @@
           <w:color w:val="0F172A"/>
           <w:sz w:val="19"/>
           <w:szCs w:val="19"/>
-          <w:shd w:fill="F1F5F9"/>
+          <w:shd w:fill="F1F5F9" w:val="clear"/>
         </w:rPr>
         <w:t xml:space="preserve">sa-dwd-key.json</w:t>
       </w:r>
@@ -5468,7 +5468,7 @@
           <w:color w:val="0F172A"/>
           <w:sz w:val="19"/>
           <w:szCs w:val="19"/>
-          <w:shd w:fill="F1F5F9"/>
+          <w:shd w:fill="F1F5F9" w:val="clear"/>
         </w:rPr>
         <w:t xml:space="preserve">client_id</w:t>
       </w:r>
@@ -5525,11 +5525,11 @@
       <w:pPr>
         <w:pBdr>
           <w:top w:val="single" w:color="CBD5E1" w:sz="6" w:space="60"/>
+          <w:left w:val="single" w:color="3B82F6" w:sz="18" w:space="100"/>
           <w:bottom w:val="single" w:color="CBD5E1" w:sz="6" w:space="60"/>
-          <w:left w:val="single" w:color="3B82F6" w:sz="18" w:space="100"/>
           <w:right w:val="single" w:color="CBD5E1" w:sz="6" w:space="60"/>
         </w:pBdr>
-        <w:shd w:fill="F8FAFC"/>
+        <w:shd w:fill="F8FAFC" w:val="clear"/>
         <w:spacing w:after="140" w:before="120"/>
         <w:ind w:left="400" w:right="200"/>
       </w:pPr>
@@ -5636,7 +5636,7 @@
           <w:color w:val="0F172A"/>
           <w:sz w:val="19"/>
           <w:szCs w:val="19"/>
-          <w:shd w:fill="F1F5F9"/>
+          <w:shd w:fill="F1F5F9" w:val="clear"/>
         </w:rPr>
         <w:t xml:space="preserve">workforce-identity-config.json</w:t>
       </w:r>
@@ -5681,7 +5681,7 @@
           <w:color w:val="0F172A"/>
           <w:sz w:val="19"/>
           <w:szCs w:val="19"/>
-          <w:shd w:fill="F1F5F9"/>
+          <w:shd w:fill="F1F5F9" w:val="clear"/>
         </w:rPr>
         <w:t xml:space="preserve">wif-migration-key.pem</w:t>
       </w:r>
@@ -5700,7 +5700,7 @@
           <w:color w:val="0F172A"/>
           <w:sz w:val="19"/>
           <w:szCs w:val="19"/>
-          <w:shd w:fill="F1F5F9"/>
+          <w:shd w:fill="F1F5F9" w:val="clear"/>
         </w:rPr>
         <w:t xml:space="preserve">wif-migration-jwks.json</w:t>
       </w:r>
@@ -5745,7 +5745,7 @@
         <w:pBdr>
           <w:left w:val="single" w:color="16A34A" w:sz="24" w:space="140"/>
         </w:pBdr>
-        <w:shd w:fill="F0FDF4"/>
+        <w:shd w:fill="F0FDF4" w:val="clear"/>
         <w:spacing w:after="160" w:before="140"/>
         <w:ind w:left="400" w:right="200"/>
       </w:pPr>
@@ -5792,7 +5792,7 @@
           <wp:inline distT="0" distB="0" distL="0" distR="0">
             <wp:extent cx="5334000" cy="3333750"/>
             <wp:effectExtent t="0" r="0" b="0" l="0"/>
-            <wp:docPr id="1" name="" descr="" title=""/>
+            <wp:docPr id="2" name="" descr="" title=""/>
             <wp:cNvGraphicFramePr>
               <a:graphicFrameLocks xmlns:a="http://schemas.openxmlformats.org/drawingml/2006/main" noChangeAspect="1"/>
             </wp:cNvGraphicFramePr>
@@ -5898,11 +5898,11 @@
       <w:pPr>
         <w:pBdr>
           <w:top w:val="single" w:color="CBD5E1" w:sz="6" w:space="60"/>
+          <w:left w:val="single" w:color="3B82F6" w:sz="18" w:space="100"/>
           <w:bottom w:val="single" w:color="CBD5E1" w:sz="6" w:space="60"/>
-          <w:left w:val="single" w:color="3B82F6" w:sz="18" w:space="100"/>
           <w:right w:val="single" w:color="CBD5E1" w:sz="6" w:space="60"/>
         </w:pBdr>
-        <w:shd w:fill="F8FAFC"/>
+        <w:shd w:fill="F8FAFC" w:val="clear"/>
         <w:spacing w:after="140" w:before="120"/>
         <w:ind w:left="400" w:right="200"/>
       </w:pPr>
@@ -5956,11 +5956,11 @@
       <w:pPr>
         <w:pBdr>
           <w:top w:val="single" w:color="CBD5E1" w:sz="6" w:space="60"/>
+          <w:left w:val="single" w:color="3B82F6" w:sz="18" w:space="100"/>
           <w:bottom w:val="single" w:color="CBD5E1" w:sz="6" w:space="60"/>
-          <w:left w:val="single" w:color="3B82F6" w:sz="18" w:space="100"/>
           <w:right w:val="single" w:color="CBD5E1" w:sz="6" w:space="60"/>
         </w:pBdr>
-        <w:shd w:fill="F8FAFC"/>
+        <w:shd w:fill="F8FAFC" w:val="clear"/>
         <w:spacing w:after="140" w:before="120"/>
         <w:ind w:left="400" w:right="200"/>
       </w:pPr>
@@ -6004,11 +6004,11 @@
       <w:pPr>
         <w:pBdr>
           <w:top w:val="single" w:color="CBD5E1" w:sz="6" w:space="60"/>
+          <w:left w:val="single" w:color="3B82F6" w:sz="18" w:space="100"/>
           <w:bottom w:val="single" w:color="CBD5E1" w:sz="6" w:space="60"/>
-          <w:left w:val="single" w:color="3B82F6" w:sz="18" w:space="100"/>
           <w:right w:val="single" w:color="CBD5E1" w:sz="6" w:space="60"/>
         </w:pBdr>
-        <w:shd w:fill="F8FAFC"/>
+        <w:shd w:fill="F8FAFC" w:val="clear"/>
         <w:spacing w:after="140" w:before="120"/>
         <w:ind w:left="400" w:right="200"/>
       </w:pPr>
@@ -6053,7 +6053,7 @@
           <w:color w:val="0F172A"/>
           <w:sz w:val="19"/>
           <w:szCs w:val="19"/>
-          <w:shd w:fill="F1F5F9"/>
+          <w:shd w:fill="F1F5F9" w:val="clear"/>
         </w:rPr>
         <w:t xml:space="preserve">migration-config.json</w:t>
       </w:r>
@@ -6086,7 +6086,7 @@
           <w:color w:val="0F172A"/>
           <w:sz w:val="19"/>
           <w:szCs w:val="19"/>
-          <w:shd w:fill="F1F5F9"/>
+          <w:shd w:fill="F1F5F9" w:val="clear"/>
         </w:rPr>
         <w:t xml:space="preserve">config.example.json</w:t>
       </w:r>
@@ -6105,7 +6105,7 @@
           <w:color w:val="0F172A"/>
           <w:sz w:val="19"/>
           <w:szCs w:val="19"/>
-          <w:shd w:fill="F1F5F9"/>
+          <w:shd w:fill="F1F5F9" w:val="clear"/>
         </w:rPr>
         <w:t xml:space="preserve">migration-config.json</w:t>
       </w:r>
@@ -6123,11 +6123,11 @@
       <w:pPr>
         <w:pBdr>
           <w:top w:val="single" w:color="CBD5E1" w:sz="6" w:space="60"/>
+          <w:left w:val="single" w:color="3B82F6" w:sz="18" w:space="100"/>
           <w:bottom w:val="single" w:color="CBD5E1" w:sz="6" w:space="60"/>
-          <w:left w:val="single" w:color="3B82F6" w:sz="18" w:space="100"/>
           <w:right w:val="single" w:color="CBD5E1" w:sz="6" w:space="60"/>
         </w:pBdr>
-        <w:shd w:fill="F8FAFC"/>
+        <w:shd w:fill="F8FAFC" w:val="clear"/>
         <w:spacing w:after="140" w:before="120"/>
         <w:ind w:left="400" w:right="200"/>
       </w:pPr>
@@ -6517,11 +6517,11 @@
       <w:pPr>
         <w:pBdr>
           <w:top w:val="single" w:color="CBD5E1" w:sz="6" w:space="60"/>
+          <w:left w:val="single" w:color="3B82F6" w:sz="18" w:space="100"/>
           <w:bottom w:val="single" w:color="CBD5E1" w:sz="6" w:space="60"/>
-          <w:left w:val="single" w:color="3B82F6" w:sz="18" w:space="100"/>
           <w:right w:val="single" w:color="CBD5E1" w:sz="6" w:space="60"/>
         </w:pBdr>
-        <w:shd w:fill="F8FAFC"/>
+        <w:shd w:fill="F8FAFC" w:val="clear"/>
         <w:spacing w:after="140" w:before="120"/>
         <w:ind w:left="400" w:right="200"/>
       </w:pPr>
@@ -6564,7 +6564,7 @@
           <w:color w:val="0F172A"/>
           <w:sz w:val="19"/>
           <w:szCs w:val="19"/>
-          <w:shd w:fill="F1F5F9"/>
+          <w:shd w:fill="F1F5F9" w:val="clear"/>
         </w:rPr>
         <w:t xml:space="preserve">http://127.0.0.1:8080</w:t>
       </w:r>
@@ -6611,11 +6611,11 @@
       <w:pPr>
         <w:pBdr>
           <w:top w:val="single" w:color="CBD5E1" w:sz="6" w:space="60"/>
+          <w:left w:val="single" w:color="3B82F6" w:sz="18" w:space="100"/>
           <w:bottom w:val="single" w:color="CBD5E1" w:sz="6" w:space="60"/>
-          <w:left w:val="single" w:color="3B82F6" w:sz="18" w:space="100"/>
           <w:right w:val="single" w:color="CBD5E1" w:sz="6" w:space="60"/>
         </w:pBdr>
-        <w:shd w:fill="F8FAFC"/>
+        <w:shd w:fill="F8FAFC" w:val="clear"/>
         <w:spacing w:after="140" w:before="120"/>
         <w:ind w:left="400" w:right="200"/>
       </w:pPr>
@@ -6682,11 +6682,11 @@
       <w:pPr>
         <w:pBdr>
           <w:top w:val="single" w:color="CBD5E1" w:sz="6" w:space="60"/>
+          <w:left w:val="single" w:color="3B82F6" w:sz="18" w:space="100"/>
           <w:bottom w:val="single" w:color="CBD5E1" w:sz="6" w:space="60"/>
-          <w:left w:val="single" w:color="3B82F6" w:sz="18" w:space="100"/>
           <w:right w:val="single" w:color="CBD5E1" w:sz="6" w:space="60"/>
         </w:pBdr>
-        <w:shd w:fill="F8FAFC"/>
+        <w:shd w:fill="F8FAFC" w:val="clear"/>
         <w:spacing w:after="140" w:before="120"/>
         <w:ind w:left="400" w:right="200"/>
       </w:pPr>
@@ -6721,7 +6721,7 @@
     </w:p>
     <w:tbl>
       <w:tblPr>
-        <w:tblW w:type="pct" w:w="100%"/>
+        <w:tblW w:type="pct" w:w="5000"/>
         <w:tblBorders>
           <w:top w:val="single" w:color="CBD5E1" w:sz="1"/>
           <w:left w:val="single" w:color="CBD5E1" w:sz="1"/>
@@ -6732,10 +6732,10 @@
         </w:tblBorders>
       </w:tblPr>
       <w:tblGrid>
-        <w:gridCol w:w="100"/>
-        <w:gridCol w:w="100"/>
-        <w:gridCol w:w="100"/>
-        <w:gridCol w:w="100"/>
+        <w:gridCol w:w="2257"/>
+        <w:gridCol w:w="1354"/>
+        <w:gridCol w:w="4062"/>
+        <w:gridCol w:w="1354"/>
       </w:tblGrid>
       <w:tr>
         <w:trPr>
@@ -6743,8 +6743,8 @@
         </w:trPr>
         <w:tc>
           <w:tcPr>
-            <w:tcW w:type="pct" w:w="25%"/>
-            <w:shd w:fill="1E293B"/>
+            <w:tcW w:type="pct" w:w="1250"/>
+            <w:shd w:fill="1E293B" w:val="clear"/>
             <w:tcMar>
               <w:top w:type="dxa" w:w="100"/>
               <w:left w:type="dxa" w:w="140"/>
@@ -6771,8 +6771,8 @@
         </w:tc>
         <w:tc>
           <w:tcPr>
-            <w:tcW w:type="pct" w:w="15%"/>
-            <w:shd w:fill="1E293B"/>
+            <w:tcW w:type="pct" w:w="750"/>
+            <w:shd w:fill="1E293B" w:val="clear"/>
             <w:tcMar>
               <w:top w:type="dxa" w:w="100"/>
               <w:left w:type="dxa" w:w="140"/>
@@ -6799,8 +6799,8 @@
         </w:tc>
         <w:tc>
           <w:tcPr>
-            <w:tcW w:type="pct" w:w="45%"/>
-            <w:shd w:fill="1E293B"/>
+            <w:tcW w:type="pct" w:w="2250"/>
+            <w:shd w:fill="1E293B" w:val="clear"/>
             <w:tcMar>
               <w:top w:type="dxa" w:w="100"/>
               <w:left w:type="dxa" w:w="140"/>
@@ -6827,8 +6827,8 @@
         </w:tc>
         <w:tc>
           <w:tcPr>
-            <w:tcW w:type="pct" w:w="15%"/>
-            <w:shd w:fill="1E293B"/>
+            <w:tcW w:type="pct" w:w="750"/>
+            <w:shd w:fill="1E293B" w:val="clear"/>
             <w:tcMar>
               <w:top w:type="dxa" w:w="100"/>
               <w:left w:type="dxa" w:w="140"/>
@@ -6857,8 +6857,8 @@
       <w:tr>
         <w:tc>
           <w:tcPr>
-            <w:tcW w:type="pct" w:w="25%"/>
-            <w:shd w:fill="FFFFFF"/>
+            <w:tcW w:type="pct" w:w="1250"/>
+            <w:shd w:fill="FFFFFF" w:val="clear"/>
             <w:tcMar>
               <w:top w:type="dxa" w:w="80"/>
               <w:left w:type="dxa" w:w="140"/>
@@ -6883,8 +6883,8 @@
         </w:tc>
         <w:tc>
           <w:tcPr>
-            <w:tcW w:type="pct" w:w="15%"/>
-            <w:shd w:fill="FFFFFF"/>
+            <w:tcW w:type="pct" w:w="750"/>
+            <w:shd w:fill="FFFFFF" w:val="clear"/>
             <w:tcMar>
               <w:top w:type="dxa" w:w="80"/>
               <w:left w:type="dxa" w:w="140"/>
@@ -6909,8 +6909,8 @@
         </w:tc>
         <w:tc>
           <w:tcPr>
-            <w:tcW w:type="pct" w:w="45%"/>
-            <w:shd w:fill="FFFFFF"/>
+            <w:tcW w:type="pct" w:w="2250"/>
+            <w:shd w:fill="FFFFFF" w:val="clear"/>
             <w:tcMar>
               <w:top w:type="dxa" w:w="80"/>
               <w:left w:type="dxa" w:w="140"/>
@@ -6935,8 +6935,8 @@
         </w:tc>
         <w:tc>
           <w:tcPr>
-            <w:tcW w:type="pct" w:w="15%"/>
-            <w:shd w:fill="FFFFFF"/>
+            <w:tcW w:type="pct" w:w="750"/>
+            <w:shd w:fill="FFFFFF" w:val="clear"/>
             <w:tcMar>
               <w:top w:type="dxa" w:w="80"/>
               <w:left w:type="dxa" w:w="140"/>
@@ -6963,8 +6963,8 @@
       <w:tr>
         <w:tc>
           <w:tcPr>
-            <w:tcW w:type="pct" w:w="25%"/>
-            <w:shd w:fill="F8FAFC"/>
+            <w:tcW w:type="pct" w:w="1250"/>
+            <w:shd w:fill="F8FAFC" w:val="clear"/>
             <w:tcMar>
               <w:top w:type="dxa" w:w="80"/>
               <w:left w:type="dxa" w:w="140"/>
@@ -6989,8 +6989,8 @@
         </w:tc>
         <w:tc>
           <w:tcPr>
-            <w:tcW w:type="pct" w:w="15%"/>
-            <w:shd w:fill="F8FAFC"/>
+            <w:tcW w:type="pct" w:w="750"/>
+            <w:shd w:fill="F8FAFC" w:val="clear"/>
             <w:tcMar>
               <w:top w:type="dxa" w:w="80"/>
               <w:left w:type="dxa" w:w="140"/>
@@ -7015,8 +7015,8 @@
         </w:tc>
         <w:tc>
           <w:tcPr>
-            <w:tcW w:type="pct" w:w="45%"/>
-            <w:shd w:fill="F8FAFC"/>
+            <w:tcW w:type="pct" w:w="2250"/>
+            <w:shd w:fill="F8FAFC" w:val="clear"/>
             <w:tcMar>
               <w:top w:type="dxa" w:w="80"/>
               <w:left w:type="dxa" w:w="140"/>
@@ -7041,8 +7041,8 @@
         </w:tc>
         <w:tc>
           <w:tcPr>
-            <w:tcW w:type="pct" w:w="15%"/>
-            <w:shd w:fill="F8FAFC"/>
+            <w:tcW w:type="pct" w:w="750"/>
+            <w:shd w:fill="F8FAFC" w:val="clear"/>
             <w:tcMar>
               <w:top w:type="dxa" w:w="80"/>
               <w:left w:type="dxa" w:w="140"/>
@@ -7069,8 +7069,8 @@
       <w:tr>
         <w:tc>
           <w:tcPr>
-            <w:tcW w:type="pct" w:w="25%"/>
-            <w:shd w:fill="FFFFFF"/>
+            <w:tcW w:type="pct" w:w="1250"/>
+            <w:shd w:fill="FFFFFF" w:val="clear"/>
             <w:tcMar>
               <w:top w:type="dxa" w:w="80"/>
               <w:left w:type="dxa" w:w="140"/>
@@ -7095,8 +7095,8 @@
         </w:tc>
         <w:tc>
           <w:tcPr>
-            <w:tcW w:type="pct" w:w="15%"/>
-            <w:shd w:fill="FFFFFF"/>
+            <w:tcW w:type="pct" w:w="750"/>
+            <w:shd w:fill="FFFFFF" w:val="clear"/>
             <w:tcMar>
               <w:top w:type="dxa" w:w="80"/>
               <w:left w:type="dxa" w:w="140"/>
@@ -7121,8 +7121,8 @@
         </w:tc>
         <w:tc>
           <w:tcPr>
-            <w:tcW w:type="pct" w:w="45%"/>
-            <w:shd w:fill="FFFFFF"/>
+            <w:tcW w:type="pct" w:w="2250"/>
+            <w:shd w:fill="FFFFFF" w:val="clear"/>
             <w:tcMar>
               <w:top w:type="dxa" w:w="80"/>
               <w:left w:type="dxa" w:w="140"/>
@@ -7147,8 +7147,8 @@
         </w:tc>
         <w:tc>
           <w:tcPr>
-            <w:tcW w:type="pct" w:w="15%"/>
-            <w:shd w:fill="FFFFFF"/>
+            <w:tcW w:type="pct" w:w="750"/>
+            <w:shd w:fill="FFFFFF" w:val="clear"/>
             <w:tcMar>
               <w:top w:type="dxa" w:w="80"/>
               <w:left w:type="dxa" w:w="140"/>
@@ -7175,8 +7175,8 @@
       <w:tr>
         <w:tc>
           <w:tcPr>
-            <w:tcW w:type="pct" w:w="25%"/>
-            <w:shd w:fill="F8FAFC"/>
+            <w:tcW w:type="pct" w:w="1250"/>
+            <w:shd w:fill="F8FAFC" w:val="clear"/>
             <w:tcMar>
               <w:top w:type="dxa" w:w="80"/>
               <w:left w:type="dxa" w:w="140"/>
@@ -7201,8 +7201,8 @@
         </w:tc>
         <w:tc>
           <w:tcPr>
-            <w:tcW w:type="pct" w:w="15%"/>
-            <w:shd w:fill="F8FAFC"/>
+            <w:tcW w:type="pct" w:w="750"/>
+            <w:shd w:fill="F8FAFC" w:val="clear"/>
             <w:tcMar>
               <w:top w:type="dxa" w:w="80"/>
               <w:left w:type="dxa" w:w="140"/>
@@ -7227,8 +7227,8 @@
         </w:tc>
         <w:tc>
           <w:tcPr>
-            <w:tcW w:type="pct" w:w="45%"/>
-            <w:shd w:fill="F8FAFC"/>
+            <w:tcW w:type="pct" w:w="2250"/>
+            <w:shd w:fill="F8FAFC" w:val="clear"/>
             <w:tcMar>
               <w:top w:type="dxa" w:w="80"/>
               <w:left w:type="dxa" w:w="140"/>
@@ -7253,8 +7253,8 @@
         </w:tc>
         <w:tc>
           <w:tcPr>
-            <w:tcW w:type="pct" w:w="15%"/>
-            <w:shd w:fill="F8FAFC"/>
+            <w:tcW w:type="pct" w:w="750"/>
+            <w:shd w:fill="F8FAFC" w:val="clear"/>
             <w:tcMar>
               <w:top w:type="dxa" w:w="80"/>
               <w:left w:type="dxa" w:w="140"/>
@@ -7281,8 +7281,8 @@
       <w:tr>
         <w:tc>
           <w:tcPr>
-            <w:tcW w:type="pct" w:w="25%"/>
-            <w:shd w:fill="FFFFFF"/>
+            <w:tcW w:type="pct" w:w="1250"/>
+            <w:shd w:fill="FFFFFF" w:val="clear"/>
             <w:tcMar>
               <w:top w:type="dxa" w:w="80"/>
               <w:left w:type="dxa" w:w="140"/>
@@ -7307,8 +7307,8 @@
         </w:tc>
         <w:tc>
           <w:tcPr>
-            <w:tcW w:type="pct" w:w="15%"/>
-            <w:shd w:fill="FFFFFF"/>
+            <w:tcW w:type="pct" w:w="750"/>
+            <w:shd w:fill="FFFFFF" w:val="clear"/>
             <w:tcMar>
               <w:top w:type="dxa" w:w="80"/>
               <w:left w:type="dxa" w:w="140"/>
@@ -7333,8 +7333,8 @@
         </w:tc>
         <w:tc>
           <w:tcPr>
-            <w:tcW w:type="pct" w:w="45%"/>
-            <w:shd w:fill="FFFFFF"/>
+            <w:tcW w:type="pct" w:w="2250"/>
+            <w:shd w:fill="FFFFFF" w:val="clear"/>
             <w:tcMar>
               <w:top w:type="dxa" w:w="80"/>
               <w:left w:type="dxa" w:w="140"/>
@@ -7359,8 +7359,8 @@
         </w:tc>
         <w:tc>
           <w:tcPr>
-            <w:tcW w:type="pct" w:w="15%"/>
-            <w:shd w:fill="FFFFFF"/>
+            <w:tcW w:type="pct" w:w="750"/>
+            <w:shd w:fill="FFFFFF" w:val="clear"/>
             <w:tcMar>
               <w:top w:type="dxa" w:w="80"/>
               <w:left w:type="dxa" w:w="140"/>
@@ -7387,8 +7387,8 @@
       <w:tr>
         <w:tc>
           <w:tcPr>
-            <w:tcW w:type="pct" w:w="25%"/>
-            <w:shd w:fill="F8FAFC"/>
+            <w:tcW w:type="pct" w:w="1250"/>
+            <w:shd w:fill="F8FAFC" w:val="clear"/>
             <w:tcMar>
               <w:top w:type="dxa" w:w="80"/>
               <w:left w:type="dxa" w:w="140"/>
@@ -7413,8 +7413,8 @@
         </w:tc>
         <w:tc>
           <w:tcPr>
-            <w:tcW w:type="pct" w:w="15%"/>
-            <w:shd w:fill="F8FAFC"/>
+            <w:tcW w:type="pct" w:w="750"/>
+            <w:shd w:fill="F8FAFC" w:val="clear"/>
             <w:tcMar>
               <w:top w:type="dxa" w:w="80"/>
               <w:left w:type="dxa" w:w="140"/>
@@ -7439,8 +7439,8 @@
         </w:tc>
         <w:tc>
           <w:tcPr>
-            <w:tcW w:type="pct" w:w="45%"/>
-            <w:shd w:fill="F8FAFC"/>
+            <w:tcW w:type="pct" w:w="2250"/>
+            <w:shd w:fill="F8FAFC" w:val="clear"/>
             <w:tcMar>
               <w:top w:type="dxa" w:w="80"/>
               <w:left w:type="dxa" w:w="140"/>
@@ -7465,8 +7465,8 @@
         </w:tc>
         <w:tc>
           <w:tcPr>
-            <w:tcW w:type="pct" w:w="15%"/>
-            <w:shd w:fill="F8FAFC"/>
+            <w:tcW w:type="pct" w:w="750"/>
+            <w:shd w:fill="F8FAFC" w:val="clear"/>
             <w:tcMar>
               <w:top w:type="dxa" w:w="80"/>
               <w:left w:type="dxa" w:w="140"/>
@@ -7493,8 +7493,8 @@
       <w:tr>
         <w:tc>
           <w:tcPr>
-            <w:tcW w:type="pct" w:w="25%"/>
-            <w:shd w:fill="FFFFFF"/>
+            <w:tcW w:type="pct" w:w="1250"/>
+            <w:shd w:fill="FFFFFF" w:val="clear"/>
             <w:tcMar>
               <w:top w:type="dxa" w:w="80"/>
               <w:left w:type="dxa" w:w="140"/>
@@ -7519,8 +7519,8 @@
         </w:tc>
         <w:tc>
           <w:tcPr>
-            <w:tcW w:type="pct" w:w="15%"/>
-            <w:shd w:fill="FFFFFF"/>
+            <w:tcW w:type="pct" w:w="750"/>
+            <w:shd w:fill="FFFFFF" w:val="clear"/>
             <w:tcMar>
               <w:top w:type="dxa" w:w="80"/>
               <w:left w:type="dxa" w:w="140"/>
@@ -7545,8 +7545,8 @@
         </w:tc>
         <w:tc>
           <w:tcPr>
-            <w:tcW w:type="pct" w:w="45%"/>
-            <w:shd w:fill="FFFFFF"/>
+            <w:tcW w:type="pct" w:w="2250"/>
+            <w:shd w:fill="FFFFFF" w:val="clear"/>
             <w:tcMar>
               <w:top w:type="dxa" w:w="80"/>
               <w:left w:type="dxa" w:w="140"/>
@@ -7571,8 +7571,8 @@
         </w:tc>
         <w:tc>
           <w:tcPr>
-            <w:tcW w:type="pct" w:w="15%"/>
-            <w:shd w:fill="FFFFFF"/>
+            <w:tcW w:type="pct" w:w="750"/>
+            <w:shd w:fill="FFFFFF" w:val="clear"/>
             <w:tcMar>
               <w:top w:type="dxa" w:w="80"/>
               <w:left w:type="dxa" w:w="140"/>
@@ -7599,8 +7599,8 @@
       <w:tr>
         <w:tc>
           <w:tcPr>
-            <w:tcW w:type="pct" w:w="25%"/>
-            <w:shd w:fill="F8FAFC"/>
+            <w:tcW w:type="pct" w:w="1250"/>
+            <w:shd w:fill="F8FAFC" w:val="clear"/>
             <w:tcMar>
               <w:top w:type="dxa" w:w="80"/>
               <w:left w:type="dxa" w:w="140"/>
@@ -7625,8 +7625,8 @@
         </w:tc>
         <w:tc>
           <w:tcPr>
-            <w:tcW w:type="pct" w:w="15%"/>
-            <w:shd w:fill="F8FAFC"/>
+            <w:tcW w:type="pct" w:w="750"/>
+            <w:shd w:fill="F8FAFC" w:val="clear"/>
             <w:tcMar>
               <w:top w:type="dxa" w:w="80"/>
               <w:left w:type="dxa" w:w="140"/>
@@ -7651,8 +7651,8 @@
         </w:tc>
         <w:tc>
           <w:tcPr>
-            <w:tcW w:type="pct" w:w="45%"/>
-            <w:shd w:fill="F8FAFC"/>
+            <w:tcW w:type="pct" w:w="2250"/>
+            <w:shd w:fill="F8FAFC" w:val="clear"/>
             <w:tcMar>
               <w:top w:type="dxa" w:w="80"/>
               <w:left w:type="dxa" w:w="140"/>
@@ -7677,8 +7677,8 @@
         </w:tc>
         <w:tc>
           <w:tcPr>
-            <w:tcW w:type="pct" w:w="15%"/>
-            <w:shd w:fill="F8FAFC"/>
+            <w:tcW w:type="pct" w:w="750"/>
+            <w:shd w:fill="F8FAFC" w:val="clear"/>
             <w:tcMar>
               <w:top w:type="dxa" w:w="80"/>
               <w:left w:type="dxa" w:w="140"/>
@@ -7705,8 +7705,8 @@
       <w:tr>
         <w:tc>
           <w:tcPr>
-            <w:tcW w:type="pct" w:w="25%"/>
-            <w:shd w:fill="FFFFFF"/>
+            <w:tcW w:type="pct" w:w="1250"/>
+            <w:shd w:fill="FFFFFF" w:val="clear"/>
             <w:tcMar>
               <w:top w:type="dxa" w:w="80"/>
               <w:left w:type="dxa" w:w="140"/>
@@ -7731,8 +7731,8 @@
         </w:tc>
         <w:tc>
           <w:tcPr>
-            <w:tcW w:type="pct" w:w="15%"/>
-            <w:shd w:fill="FFFFFF"/>
+            <w:tcW w:type="pct" w:w="750"/>
+            <w:shd w:fill="FFFFFF" w:val="clear"/>
             <w:tcMar>
               <w:top w:type="dxa" w:w="80"/>
               <w:left w:type="dxa" w:w="140"/>
@@ -7757,8 +7757,8 @@
         </w:tc>
         <w:tc>
           <w:tcPr>
-            <w:tcW w:type="pct" w:w="45%"/>
-            <w:shd w:fill="FFFFFF"/>
+            <w:tcW w:type="pct" w:w="2250"/>
+            <w:shd w:fill="FFFFFF" w:val="clear"/>
             <w:tcMar>
               <w:top w:type="dxa" w:w="80"/>
               <w:left w:type="dxa" w:w="140"/>
@@ -7783,8 +7783,8 @@
         </w:tc>
         <w:tc>
           <w:tcPr>
-            <w:tcW w:type="pct" w:w="15%"/>
-            <w:shd w:fill="FFFFFF"/>
+            <w:tcW w:type="pct" w:w="750"/>
+            <w:shd w:fill="FFFFFF" w:val="clear"/>
             <w:tcMar>
               <w:top w:type="dxa" w:w="80"/>
               <w:left w:type="dxa" w:w="140"/>
@@ -7811,8 +7811,8 @@
       <w:tr>
         <w:tc>
           <w:tcPr>
-            <w:tcW w:type="pct" w:w="25%"/>
-            <w:shd w:fill="F8FAFC"/>
+            <w:tcW w:type="pct" w:w="1250"/>
+            <w:shd w:fill="F8FAFC" w:val="clear"/>
             <w:tcMar>
               <w:top w:type="dxa" w:w="80"/>
               <w:left w:type="dxa" w:w="140"/>
@@ -7837,8 +7837,8 @@
         </w:tc>
         <w:tc>
           <w:tcPr>
-            <w:tcW w:type="pct" w:w="15%"/>
-            <w:shd w:fill="F8FAFC"/>
+            <w:tcW w:type="pct" w:w="750"/>
+            <w:shd w:fill="F8FAFC" w:val="clear"/>
             <w:tcMar>
               <w:top w:type="dxa" w:w="80"/>
               <w:left w:type="dxa" w:w="140"/>
@@ -7863,8 +7863,8 @@
         </w:tc>
         <w:tc>
           <w:tcPr>
-            <w:tcW w:type="pct" w:w="45%"/>
-            <w:shd w:fill="F8FAFC"/>
+            <w:tcW w:type="pct" w:w="2250"/>
+            <w:shd w:fill="F8FAFC" w:val="clear"/>
             <w:tcMar>
               <w:top w:type="dxa" w:w="80"/>
               <w:left w:type="dxa" w:w="140"/>
@@ -7889,8 +7889,8 @@
         </w:tc>
         <w:tc>
           <w:tcPr>
-            <w:tcW w:type="pct" w:w="15%"/>
-            <w:shd w:fill="F8FAFC"/>
+            <w:tcW w:type="pct" w:w="750"/>
+            <w:shd w:fill="F8FAFC" w:val="clear"/>
             <w:tcMar>
               <w:top w:type="dxa" w:w="80"/>
               <w:left w:type="dxa" w:w="140"/>
@@ -7917,8 +7917,8 @@
       <w:tr>
         <w:tc>
           <w:tcPr>
-            <w:tcW w:type="pct" w:w="25%"/>
-            <w:shd w:fill="FFFFFF"/>
+            <w:tcW w:type="pct" w:w="1250"/>
+            <w:shd w:fill="FFFFFF" w:val="clear"/>
             <w:tcMar>
               <w:top w:type="dxa" w:w="80"/>
               <w:left w:type="dxa" w:w="140"/>
@@ -7943,8 +7943,8 @@
         </w:tc>
         <w:tc>
           <w:tcPr>
-            <w:tcW w:type="pct" w:w="15%"/>
-            <w:shd w:fill="FFFFFF"/>
+            <w:tcW w:type="pct" w:w="750"/>
+            <w:shd w:fill="FFFFFF" w:val="clear"/>
             <w:tcMar>
               <w:top w:type="dxa" w:w="80"/>
               <w:left w:type="dxa" w:w="140"/>
@@ -7969,8 +7969,8 @@
         </w:tc>
         <w:tc>
           <w:tcPr>
-            <w:tcW w:type="pct" w:w="45%"/>
-            <w:shd w:fill="FFFFFF"/>
+            <w:tcW w:type="pct" w:w="2250"/>
+            <w:shd w:fill="FFFFFF" w:val="clear"/>
             <w:tcMar>
               <w:top w:type="dxa" w:w="80"/>
               <w:left w:type="dxa" w:w="140"/>
@@ -7995,8 +7995,8 @@
         </w:tc>
         <w:tc>
           <w:tcPr>
-            <w:tcW w:type="pct" w:w="15%"/>
-            <w:shd w:fill="FFFFFF"/>
+            <w:tcW w:type="pct" w:w="750"/>
+            <w:shd w:fill="FFFFFF" w:val="clear"/>
             <w:tcMar>
               <w:top w:type="dxa" w:w="80"/>
               <w:left w:type="dxa" w:w="140"/>
@@ -8023,8 +8023,8 @@
       <w:tr>
         <w:tc>
           <w:tcPr>
-            <w:tcW w:type="pct" w:w="25%"/>
-            <w:shd w:fill="F8FAFC"/>
+            <w:tcW w:type="pct" w:w="1250"/>
+            <w:shd w:fill="F8FAFC" w:val="clear"/>
             <w:tcMar>
               <w:top w:type="dxa" w:w="80"/>
               <w:left w:type="dxa" w:w="140"/>
@@ -8049,8 +8049,8 @@
         </w:tc>
         <w:tc>
           <w:tcPr>
-            <w:tcW w:type="pct" w:w="15%"/>
-            <w:shd w:fill="F8FAFC"/>
+            <w:tcW w:type="pct" w:w="750"/>
+            <w:shd w:fill="F8FAFC" w:val="clear"/>
             <w:tcMar>
               <w:top w:type="dxa" w:w="80"/>
               <w:left w:type="dxa" w:w="140"/>
@@ -8075,8 +8075,8 @@
         </w:tc>
         <w:tc>
           <w:tcPr>
-            <w:tcW w:type="pct" w:w="45%"/>
-            <w:shd w:fill="F8FAFC"/>
+            <w:tcW w:type="pct" w:w="2250"/>
+            <w:shd w:fill="F8FAFC" w:val="clear"/>
             <w:tcMar>
               <w:top w:type="dxa" w:w="80"/>
               <w:left w:type="dxa" w:w="140"/>
@@ -8101,8 +8101,8 @@
         </w:tc>
         <w:tc>
           <w:tcPr>
-            <w:tcW w:type="pct" w:w="15%"/>
-            <w:shd w:fill="F8FAFC"/>
+            <w:tcW w:type="pct" w:w="750"/>
+            <w:shd w:fill="F8FAFC" w:val="clear"/>
             <w:tcMar>
               <w:top w:type="dxa" w:w="80"/>
               <w:left w:type="dxa" w:w="140"/>
@@ -8129,8 +8129,8 @@
       <w:tr>
         <w:tc>
           <w:tcPr>
-            <w:tcW w:type="pct" w:w="25%"/>
-            <w:shd w:fill="FFFFFF"/>
+            <w:tcW w:type="pct" w:w="1250"/>
+            <w:shd w:fill="FFFFFF" w:val="clear"/>
             <w:tcMar>
               <w:top w:type="dxa" w:w="80"/>
               <w:left w:type="dxa" w:w="140"/>
@@ -8155,8 +8155,8 @@
         </w:tc>
         <w:tc>
           <w:tcPr>
-            <w:tcW w:type="pct" w:w="15%"/>
-            <w:shd w:fill="FFFFFF"/>
+            <w:tcW w:type="pct" w:w="750"/>
+            <w:shd w:fill="FFFFFF" w:val="clear"/>
             <w:tcMar>
               <w:top w:type="dxa" w:w="80"/>
               <w:left w:type="dxa" w:w="140"/>
@@ -8181,8 +8181,8 @@
         </w:tc>
         <w:tc>
           <w:tcPr>
-            <w:tcW w:type="pct" w:w="45%"/>
-            <w:shd w:fill="FFFFFF"/>
+            <w:tcW w:type="pct" w:w="2250"/>
+            <w:shd w:fill="FFFFFF" w:val="clear"/>
             <w:tcMar>
               <w:top w:type="dxa" w:w="80"/>
               <w:left w:type="dxa" w:w="140"/>
@@ -8207,8 +8207,8 @@
         </w:tc>
         <w:tc>
           <w:tcPr>
-            <w:tcW w:type="pct" w:w="15%"/>
-            <w:shd w:fill="FFFFFF"/>
+            <w:tcW w:type="pct" w:w="750"/>
+            <w:shd w:fill="FFFFFF" w:val="clear"/>
             <w:tcMar>
               <w:top w:type="dxa" w:w="80"/>
               <w:left w:type="dxa" w:w="140"/>
@@ -8235,8 +8235,8 @@
       <w:tr>
         <w:tc>
           <w:tcPr>
-            <w:tcW w:type="pct" w:w="25%"/>
-            <w:shd w:fill="F8FAFC"/>
+            <w:tcW w:type="pct" w:w="1250"/>
+            <w:shd w:fill="F8FAFC" w:val="clear"/>
             <w:tcMar>
               <w:top w:type="dxa" w:w="80"/>
               <w:left w:type="dxa" w:w="140"/>
@@ -8261,8 +8261,8 @@
         </w:tc>
         <w:tc>
           <w:tcPr>
-            <w:tcW w:type="pct" w:w="15%"/>
-            <w:shd w:fill="F8FAFC"/>
+            <w:tcW w:type="pct" w:w="750"/>
+            <w:shd w:fill="F8FAFC" w:val="clear"/>
             <w:tcMar>
               <w:top w:type="dxa" w:w="80"/>
               <w:left w:type="dxa" w:w="140"/>
@@ -8287,8 +8287,8 @@
         </w:tc>
         <w:tc>
           <w:tcPr>
-            <w:tcW w:type="pct" w:w="45%"/>
-            <w:shd w:fill="F8FAFC"/>
+            <w:tcW w:type="pct" w:w="2250"/>
+            <w:shd w:fill="F8FAFC" w:val="clear"/>
             <w:tcMar>
               <w:top w:type="dxa" w:w="80"/>
               <w:left w:type="dxa" w:w="140"/>
@@ -8313,8 +8313,8 @@
         </w:tc>
         <w:tc>
           <w:tcPr>
-            <w:tcW w:type="pct" w:w="15%"/>
-            <w:shd w:fill="F8FAFC"/>
+            <w:tcW w:type="pct" w:w="750"/>
+            <w:shd w:fill="F8FAFC" w:val="clear"/>
             <w:tcMar>
               <w:top w:type="dxa" w:w="80"/>
               <w:left w:type="dxa" w:w="140"/>
@@ -8341,8 +8341,8 @@
       <w:tr>
         <w:tc>
           <w:tcPr>
-            <w:tcW w:type="pct" w:w="25%"/>
-            <w:shd w:fill="FFFFFF"/>
+            <w:tcW w:type="pct" w:w="1250"/>
+            <w:shd w:fill="FFFFFF" w:val="clear"/>
             <w:tcMar>
               <w:top w:type="dxa" w:w="80"/>
               <w:left w:type="dxa" w:w="140"/>
@@ -8367,8 +8367,8 @@
         </w:tc>
         <w:tc>
           <w:tcPr>
-            <w:tcW w:type="pct" w:w="15%"/>
-            <w:shd w:fill="FFFFFF"/>
+            <w:tcW w:type="pct" w:w="750"/>
+            <w:shd w:fill="FFFFFF" w:val="clear"/>
             <w:tcMar>
               <w:top w:type="dxa" w:w="80"/>
               <w:left w:type="dxa" w:w="140"/>
@@ -8393,8 +8393,8 @@
         </w:tc>
         <w:tc>
           <w:tcPr>
-            <w:tcW w:type="pct" w:w="45%"/>
-            <w:shd w:fill="FFFFFF"/>
+            <w:tcW w:type="pct" w:w="2250"/>
+            <w:shd w:fill="FFFFFF" w:val="clear"/>
             <w:tcMar>
               <w:top w:type="dxa" w:w="80"/>
               <w:left w:type="dxa" w:w="140"/>
@@ -8419,8 +8419,8 @@
         </w:tc>
         <w:tc>
           <w:tcPr>
-            <w:tcW w:type="pct" w:w="15%"/>
-            <w:shd w:fill="FFFFFF"/>
+            <w:tcW w:type="pct" w:w="750"/>
+            <w:shd w:fill="FFFFFF" w:val="clear"/>
             <w:tcMar>
               <w:top w:type="dxa" w:w="80"/>
               <w:left w:type="dxa" w:w="140"/>
@@ -8447,8 +8447,8 @@
       <w:tr>
         <w:tc>
           <w:tcPr>
-            <w:tcW w:type="pct" w:w="25%"/>
-            <w:shd w:fill="F8FAFC"/>
+            <w:tcW w:type="pct" w:w="1250"/>
+            <w:shd w:fill="F8FAFC" w:val="clear"/>
             <w:tcMar>
               <w:top w:type="dxa" w:w="80"/>
               <w:left w:type="dxa" w:w="140"/>
@@ -8473,8 +8473,8 @@
         </w:tc>
         <w:tc>
           <w:tcPr>
-            <w:tcW w:type="pct" w:w="15%"/>
-            <w:shd w:fill="F8FAFC"/>
+            <w:tcW w:type="pct" w:w="750"/>
+            <w:shd w:fill="F8FAFC" w:val="clear"/>
             <w:tcMar>
               <w:top w:type="dxa" w:w="80"/>
               <w:left w:type="dxa" w:w="140"/>
@@ -8499,8 +8499,8 @@
         </w:tc>
         <w:tc>
           <w:tcPr>
-            <w:tcW w:type="pct" w:w="45%"/>
-            <w:shd w:fill="F8FAFC"/>
+            <w:tcW w:type="pct" w:w="2250"/>
+            <w:shd w:fill="F8FAFC" w:val="clear"/>
             <w:tcMar>
               <w:top w:type="dxa" w:w="80"/>
               <w:left w:type="dxa" w:w="140"/>
@@ -8525,8 +8525,8 @@
         </w:tc>
         <w:tc>
           <w:tcPr>
-            <w:tcW w:type="pct" w:w="15%"/>
-            <w:shd w:fill="F8FAFC"/>
+            <w:tcW w:type="pct" w:w="750"/>
+            <w:shd w:fill="F8FAFC" w:val="clear"/>
             <w:tcMar>
               <w:top w:type="dxa" w:w="80"/>
               <w:left w:type="dxa" w:w="140"/>
@@ -8553,8 +8553,8 @@
       <w:tr>
         <w:tc>
           <w:tcPr>
-            <w:tcW w:type="pct" w:w="25%"/>
-            <w:shd w:fill="FFFFFF"/>
+            <w:tcW w:type="pct" w:w="1250"/>
+            <w:shd w:fill="FFFFFF" w:val="clear"/>
             <w:tcMar>
               <w:top w:type="dxa" w:w="80"/>
               <w:left w:type="dxa" w:w="140"/>
@@ -8579,8 +8579,8 @@
         </w:tc>
         <w:tc>
           <w:tcPr>
-            <w:tcW w:type="pct" w:w="15%"/>
-            <w:shd w:fill="FFFFFF"/>
+            <w:tcW w:type="pct" w:w="750"/>
+            <w:shd w:fill="FFFFFF" w:val="clear"/>
             <w:tcMar>
               <w:top w:type="dxa" w:w="80"/>
               <w:left w:type="dxa" w:w="140"/>
@@ -8605,8 +8605,8 @@
         </w:tc>
         <w:tc>
           <w:tcPr>
-            <w:tcW w:type="pct" w:w="45%"/>
-            <w:shd w:fill="FFFFFF"/>
+            <w:tcW w:type="pct" w:w="2250"/>
+            <w:shd w:fill="FFFFFF" w:val="clear"/>
             <w:tcMar>
               <w:top w:type="dxa" w:w="80"/>
               <w:left w:type="dxa" w:w="140"/>
@@ -8631,8 +8631,8 @@
         </w:tc>
         <w:tc>
           <w:tcPr>
-            <w:tcW w:type="pct" w:w="15%"/>
-            <w:shd w:fill="FFFFFF"/>
+            <w:tcW w:type="pct" w:w="750"/>
+            <w:shd w:fill="FFFFFF" w:val="clear"/>
             <w:tcMar>
               <w:top w:type="dxa" w:w="80"/>
               <w:left w:type="dxa" w:w="140"/>
@@ -8659,8 +8659,8 @@
       <w:tr>
         <w:tc>
           <w:tcPr>
-            <w:tcW w:type="pct" w:w="25%"/>
-            <w:shd w:fill="F8FAFC"/>
+            <w:tcW w:type="pct" w:w="1250"/>
+            <w:shd w:fill="F8FAFC" w:val="clear"/>
             <w:tcMar>
               <w:top w:type="dxa" w:w="80"/>
               <w:left w:type="dxa" w:w="140"/>
@@ -8685,8 +8685,8 @@
         </w:tc>
         <w:tc>
           <w:tcPr>
-            <w:tcW w:type="pct" w:w="15%"/>
-            <w:shd w:fill="F8FAFC"/>
+            <w:tcW w:type="pct" w:w="750"/>
+            <w:shd w:fill="F8FAFC" w:val="clear"/>
             <w:tcMar>
               <w:top w:type="dxa" w:w="80"/>
               <w:left w:type="dxa" w:w="140"/>
@@ -8711,8 +8711,8 @@
         </w:tc>
         <w:tc>
           <w:tcPr>
-            <w:tcW w:type="pct" w:w="45%"/>
-            <w:shd w:fill="F8FAFC"/>
+            <w:tcW w:type="pct" w:w="2250"/>
+            <w:shd w:fill="F8FAFC" w:val="clear"/>
             <w:tcMar>
               <w:top w:type="dxa" w:w="80"/>
               <w:left w:type="dxa" w:w="140"/>
@@ -8737,8 +8737,8 @@
         </w:tc>
         <w:tc>
           <w:tcPr>
-            <w:tcW w:type="pct" w:w="15%"/>
-            <w:shd w:fill="F8FAFC"/>
+            <w:tcW w:type="pct" w:w="750"/>
+            <w:shd w:fill="F8FAFC" w:val="clear"/>
             <w:tcMar>
               <w:top w:type="dxa" w:w="80"/>
               <w:left w:type="dxa" w:w="140"/>
@@ -8765,8 +8765,8 @@
       <w:tr>
         <w:tc>
           <w:tcPr>
-            <w:tcW w:type="pct" w:w="25%"/>
-            <w:shd w:fill="FFFFFF"/>
+            <w:tcW w:type="pct" w:w="1250"/>
+            <w:shd w:fill="FFFFFF" w:val="clear"/>
             <w:tcMar>
               <w:top w:type="dxa" w:w="80"/>
               <w:left w:type="dxa" w:w="140"/>
@@ -8791,8 +8791,8 @@
         </w:tc>
         <w:tc>
           <w:tcPr>
-            <w:tcW w:type="pct" w:w="15%"/>
-            <w:shd w:fill="FFFFFF"/>
+            <w:tcW w:type="pct" w:w="750"/>
+            <w:shd w:fill="FFFFFF" w:val="clear"/>
             <w:tcMar>
               <w:top w:type="dxa" w:w="80"/>
               <w:left w:type="dxa" w:w="140"/>
@@ -8817,8 +8817,8 @@
         </w:tc>
         <w:tc>
           <w:tcPr>
-            <w:tcW w:type="pct" w:w="45%"/>
-            <w:shd w:fill="FFFFFF"/>
+            <w:tcW w:type="pct" w:w="2250"/>
+            <w:shd w:fill="FFFFFF" w:val="clear"/>
             <w:tcMar>
               <w:top w:type="dxa" w:w="80"/>
               <w:left w:type="dxa" w:w="140"/>
@@ -8843,8 +8843,8 @@
         </w:tc>
         <w:tc>
           <w:tcPr>
-            <w:tcW w:type="pct" w:w="15%"/>
-            <w:shd w:fill="FFFFFF"/>
+            <w:tcW w:type="pct" w:w="750"/>
+            <w:shd w:fill="FFFFFF" w:val="clear"/>
             <w:tcMar>
               <w:top w:type="dxa" w:w="80"/>
               <w:left w:type="dxa" w:w="140"/>
@@ -8871,8 +8871,8 @@
       <w:tr>
         <w:tc>
           <w:tcPr>
-            <w:tcW w:type="pct" w:w="25%"/>
-            <w:shd w:fill="F8FAFC"/>
+            <w:tcW w:type="pct" w:w="1250"/>
+            <w:shd w:fill="F8FAFC" w:val="clear"/>
             <w:tcMar>
               <w:top w:type="dxa" w:w="80"/>
               <w:left w:type="dxa" w:w="140"/>
@@ -8897,8 +8897,8 @@
         </w:tc>
         <w:tc>
           <w:tcPr>
-            <w:tcW w:type="pct" w:w="15%"/>
-            <w:shd w:fill="F8FAFC"/>
+            <w:tcW w:type="pct" w:w="750"/>
+            <w:shd w:fill="F8FAFC" w:val="clear"/>
             <w:tcMar>
               <w:top w:type="dxa" w:w="80"/>
               <w:left w:type="dxa" w:w="140"/>
@@ -8923,8 +8923,8 @@
         </w:tc>
         <w:tc>
           <w:tcPr>
-            <w:tcW w:type="pct" w:w="45%"/>
-            <w:shd w:fill="F8FAFC"/>
+            <w:tcW w:type="pct" w:w="2250"/>
+            <w:shd w:fill="F8FAFC" w:val="clear"/>
             <w:tcMar>
               <w:top w:type="dxa" w:w="80"/>
               <w:left w:type="dxa" w:w="140"/>
@@ -8949,8 +8949,8 @@
         </w:tc>
         <w:tc>
           <w:tcPr>
-            <w:tcW w:type="pct" w:w="15%"/>
-            <w:shd w:fill="F8FAFC"/>
+            <w:tcW w:type="pct" w:w="750"/>
+            <w:shd w:fill="F8FAFC" w:val="clear"/>
             <w:tcMar>
               <w:top w:type="dxa" w:w="80"/>
               <w:left w:type="dxa" w:w="140"/>
@@ -8977,8 +8977,8 @@
       <w:tr>
         <w:tc>
           <w:tcPr>
-            <w:tcW w:type="pct" w:w="25%"/>
-            <w:shd w:fill="FFFFFF"/>
+            <w:tcW w:type="pct" w:w="1250"/>
+            <w:shd w:fill="FFFFFF" w:val="clear"/>
             <w:tcMar>
               <w:top w:type="dxa" w:w="80"/>
               <w:left w:type="dxa" w:w="140"/>
@@ -9003,8 +9003,8 @@
         </w:tc>
         <w:tc>
           <w:tcPr>
-            <w:tcW w:type="pct" w:w="15%"/>
-            <w:shd w:fill="FFFFFF"/>
+            <w:tcW w:type="pct" w:w="750"/>
+            <w:shd w:fill="FFFFFF" w:val="clear"/>
             <w:tcMar>
               <w:top w:type="dxa" w:w="80"/>
               <w:left w:type="dxa" w:w="140"/>
@@ -9029,8 +9029,8 @@
         </w:tc>
         <w:tc>
           <w:tcPr>
-            <w:tcW w:type="pct" w:w="45%"/>
-            <w:shd w:fill="FFFFFF"/>
+            <w:tcW w:type="pct" w:w="2250"/>
+            <w:shd w:fill="FFFFFF" w:val="clear"/>
             <w:tcMar>
               <w:top w:type="dxa" w:w="80"/>
               <w:left w:type="dxa" w:w="140"/>
@@ -9055,8 +9055,8 @@
         </w:tc>
         <w:tc>
           <w:tcPr>
-            <w:tcW w:type="pct" w:w="15%"/>
-            <w:shd w:fill="FFFFFF"/>
+            <w:tcW w:type="pct" w:w="750"/>
+            <w:shd w:fill="FFFFFF" w:val="clear"/>
             <w:tcMar>
               <w:top w:type="dxa" w:w="80"/>
               <w:left w:type="dxa" w:w="140"/>
@@ -9083,8 +9083,8 @@
       <w:tr>
         <w:tc>
           <w:tcPr>
-            <w:tcW w:type="pct" w:w="25%"/>
-            <w:shd w:fill="F8FAFC"/>
+            <w:tcW w:type="pct" w:w="1250"/>
+            <w:shd w:fill="F8FAFC" w:val="clear"/>
             <w:tcMar>
               <w:top w:type="dxa" w:w="80"/>
               <w:left w:type="dxa" w:w="140"/>
@@ -9109,8 +9109,8 @@
         </w:tc>
         <w:tc>
           <w:tcPr>
-            <w:tcW w:type="pct" w:w="15%"/>
-            <w:shd w:fill="F8FAFC"/>
+            <w:tcW w:type="pct" w:w="750"/>
+            <w:shd w:fill="F8FAFC" w:val="clear"/>
             <w:tcMar>
               <w:top w:type="dxa" w:w="80"/>
               <w:left w:type="dxa" w:w="140"/>
@@ -9137,8 +9137,8 @@
         </w:tc>
         <w:tc>
           <w:tcPr>
-            <w:tcW w:type="pct" w:w="45%"/>
-            <w:shd w:fill="F8FAFC"/>
+            <w:tcW w:type="pct" w:w="2250"/>
+            <w:shd w:fill="F8FAFC" w:val="clear"/>
             <w:tcMar>
               <w:top w:type="dxa" w:w="80"/>
               <w:left w:type="dxa" w:w="140"/>
@@ -9163,8 +9163,8 @@
         </w:tc>
         <w:tc>
           <w:tcPr>
-            <w:tcW w:type="pct" w:w="15%"/>
-            <w:shd w:fill="F8FAFC"/>
+            <w:tcW w:type="pct" w:w="750"/>
+            <w:shd w:fill="F8FAFC" w:val="clear"/>
             <w:tcMar>
               <w:top w:type="dxa" w:w="80"/>
               <w:left w:type="dxa" w:w="140"/>
@@ -9191,8 +9191,8 @@
       <w:tr>
         <w:tc>
           <w:tcPr>
-            <w:tcW w:type="pct" w:w="25%"/>
-            <w:shd w:fill="FFFFFF"/>
+            <w:tcW w:type="pct" w:w="1250"/>
+            <w:shd w:fill="FFFFFF" w:val="clear"/>
             <w:tcMar>
               <w:top w:type="dxa" w:w="80"/>
               <w:left w:type="dxa" w:w="140"/>
@@ -9217,8 +9217,8 @@
         </w:tc>
         <w:tc>
           <w:tcPr>
-            <w:tcW w:type="pct" w:w="15%"/>
-            <w:shd w:fill="FFFFFF"/>
+            <w:tcW w:type="pct" w:w="750"/>
+            <w:shd w:fill="FFFFFF" w:val="clear"/>
             <w:tcMar>
               <w:top w:type="dxa" w:w="80"/>
               <w:left w:type="dxa" w:w="140"/>
@@ -9243,8 +9243,8 @@
         </w:tc>
         <w:tc>
           <w:tcPr>
-            <w:tcW w:type="pct" w:w="45%"/>
-            <w:shd w:fill="FFFFFF"/>
+            <w:tcW w:type="pct" w:w="2250"/>
+            <w:shd w:fill="FFFFFF" w:val="clear"/>
             <w:tcMar>
               <w:top w:type="dxa" w:w="80"/>
               <w:left w:type="dxa" w:w="140"/>
@@ -9269,8 +9269,8 @@
         </w:tc>
         <w:tc>
           <w:tcPr>
-            <w:tcW w:type="pct" w:w="15%"/>
-            <w:shd w:fill="FFFFFF"/>
+            <w:tcW w:type="pct" w:w="750"/>
+            <w:shd w:fill="FFFFFF" w:val="clear"/>
             <w:tcMar>
               <w:top w:type="dxa" w:w="80"/>
               <w:left w:type="dxa" w:w="140"/>
@@ -9297,8 +9297,8 @@
       <w:tr>
         <w:tc>
           <w:tcPr>
-            <w:tcW w:type="pct" w:w="25%"/>
-            <w:shd w:fill="F8FAFC"/>
+            <w:tcW w:type="pct" w:w="1250"/>
+            <w:shd w:fill="F8FAFC" w:val="clear"/>
             <w:tcMar>
               <w:top w:type="dxa" w:w="80"/>
               <w:left w:type="dxa" w:w="140"/>
@@ -9323,8 +9323,8 @@
         </w:tc>
         <w:tc>
           <w:tcPr>
-            <w:tcW w:type="pct" w:w="15%"/>
-            <w:shd w:fill="F8FAFC"/>
+            <w:tcW w:type="pct" w:w="750"/>
+            <w:shd w:fill="F8FAFC" w:val="clear"/>
             <w:tcMar>
               <w:top w:type="dxa" w:w="80"/>
               <w:left w:type="dxa" w:w="140"/>
@@ -9349,8 +9349,8 @@
         </w:tc>
         <w:tc>
           <w:tcPr>
-            <w:tcW w:type="pct" w:w="45%"/>
-            <w:shd w:fill="F8FAFC"/>
+            <w:tcW w:type="pct" w:w="2250"/>
+            <w:shd w:fill="F8FAFC" w:val="clear"/>
             <w:tcMar>
               <w:top w:type="dxa" w:w="80"/>
               <w:left w:type="dxa" w:w="140"/>
@@ -9375,8 +9375,8 @@
         </w:tc>
         <w:tc>
           <w:tcPr>
-            <w:tcW w:type="pct" w:w="15%"/>
-            <w:shd w:fill="F8FAFC"/>
+            <w:tcW w:type="pct" w:w="750"/>
+            <w:shd w:fill="F8FAFC" w:val="clear"/>
             <w:tcMar>
               <w:top w:type="dxa" w:w="80"/>
               <w:left w:type="dxa" w:w="140"/>
@@ -9417,7 +9417,7 @@
     </w:p>
     <w:tbl>
       <w:tblPr>
-        <w:tblW w:type="pct" w:w="100%"/>
+        <w:tblW w:type="pct" w:w="5000"/>
         <w:tblBorders>
           <w:top w:val="single" w:color="CBD5E1" w:sz="1"/>
           <w:left w:val="single" w:color="CBD5E1" w:sz="1"/>
@@ -9428,9 +9428,9 @@
         </w:tblBorders>
       </w:tblPr>
       <w:tblGrid>
-        <w:gridCol w:w="100"/>
-        <w:gridCol w:w="100"/>
-        <w:gridCol w:w="100"/>
+        <w:gridCol w:w="2708"/>
+        <w:gridCol w:w="2708"/>
+        <w:gridCol w:w="3610"/>
       </w:tblGrid>
       <w:tr>
         <w:trPr>
@@ -9438,8 +9438,8 @@
         </w:trPr>
         <w:tc>
           <w:tcPr>
-            <w:tcW w:type="pct" w:w="30%"/>
-            <w:shd w:fill="1E293B"/>
+            <w:tcW w:type="pct" w:w="1500"/>
+            <w:shd w:fill="1E293B" w:val="clear"/>
             <w:tcMar>
               <w:top w:type="dxa" w:w="100"/>
               <w:left w:type="dxa" w:w="140"/>
@@ -9466,8 +9466,8 @@
         </w:tc>
         <w:tc>
           <w:tcPr>
-            <w:tcW w:type="pct" w:w="30%"/>
-            <w:shd w:fill="1E293B"/>
+            <w:tcW w:type="pct" w:w="1500"/>
+            <w:shd w:fill="1E293B" w:val="clear"/>
             <w:tcMar>
               <w:top w:type="dxa" w:w="100"/>
               <w:left w:type="dxa" w:w="140"/>
@@ -9494,8 +9494,8 @@
         </w:tc>
         <w:tc>
           <w:tcPr>
-            <w:tcW w:type="pct" w:w="40%"/>
-            <w:shd w:fill="1E293B"/>
+            <w:tcW w:type="pct" w:w="2000"/>
+            <w:shd w:fill="1E293B" w:val="clear"/>
             <w:tcMar>
               <w:top w:type="dxa" w:w="100"/>
               <w:left w:type="dxa" w:w="140"/>
@@ -9524,8 +9524,8 @@
       <w:tr>
         <w:tc>
           <w:tcPr>
-            <w:tcW w:type="pct" w:w="30%"/>
-            <w:shd w:fill="FFFFFF"/>
+            <w:tcW w:type="pct" w:w="1500"/>
+            <w:shd w:fill="FFFFFF" w:val="clear"/>
             <w:tcMar>
               <w:top w:type="dxa" w:w="80"/>
               <w:left w:type="dxa" w:w="140"/>
@@ -9550,8 +9550,8 @@
         </w:tc>
         <w:tc>
           <w:tcPr>
-            <w:tcW w:type="pct" w:w="30%"/>
-            <w:shd w:fill="FFFFFF"/>
+            <w:tcW w:type="pct" w:w="1500"/>
+            <w:shd w:fill="FFFFFF" w:val="clear"/>
             <w:tcMar>
               <w:top w:type="dxa" w:w="80"/>
               <w:left w:type="dxa" w:w="140"/>
@@ -9578,7 +9578,7 @@
                 <w:color w:val="0F172A"/>
                 <w:sz w:val="19"/>
                 <w:szCs w:val="19"/>
-                <w:shd w:fill="F1F5F9"/>
+                <w:shd w:fill="F1F5F9" w:val="clear"/>
               </w:rPr>
               <w:t xml:space="preserve">roles/serviceusage.serviceUsageConsumer</w:t>
             </w:r>
@@ -9586,8 +9586,8 @@
         </w:tc>
         <w:tc>
           <w:tcPr>
-            <w:tcW w:type="pct" w:w="40%"/>
-            <w:shd w:fill="FFFFFF"/>
+            <w:tcW w:type="pct" w:w="2000"/>
+            <w:shd w:fill="FFFFFF" w:val="clear"/>
             <w:tcMar>
               <w:top w:type="dxa" w:w="80"/>
               <w:left w:type="dxa" w:w="140"/>
@@ -9614,7 +9614,7 @@
                 <w:color w:val="0F172A"/>
                 <w:sz w:val="19"/>
                 <w:szCs w:val="19"/>
-                <w:shd w:fill="F1F5F9"/>
+                <w:shd w:fill="F1F5F9" w:val="clear"/>
               </w:rPr>
               <w:t xml:space="preserve">gcloud services enable serviceusage.googleapis.com --project=&lt;PROJECT_ID&gt;</w:t>
             </w:r>
@@ -9633,7 +9633,7 @@
                 <w:color w:val="0F172A"/>
                 <w:sz w:val="19"/>
                 <w:szCs w:val="19"/>
-                <w:shd w:fill="F1F5F9"/>
+                <w:shd w:fill="F1F5F9" w:val="clear"/>
               </w:rPr>
               <w:t xml:space="preserve">roles/serviceusage.serviceUsageConsumer</w:t>
             </w:r>
@@ -9652,8 +9652,8 @@
       <w:tr>
         <w:tc>
           <w:tcPr>
-            <w:tcW w:type="pct" w:w="30%"/>
-            <w:shd w:fill="F8FAFC"/>
+            <w:tcW w:type="pct" w:w="1500"/>
+            <w:shd w:fill="F8FAFC" w:val="clear"/>
             <w:tcMar>
               <w:top w:type="dxa" w:w="80"/>
               <w:left w:type="dxa" w:w="140"/>
@@ -9678,8 +9678,8 @@
         </w:tc>
         <w:tc>
           <w:tcPr>
-            <w:tcW w:type="pct" w:w="30%"/>
-            <w:shd w:fill="F8FAFC"/>
+            <w:tcW w:type="pct" w:w="1500"/>
+            <w:shd w:fill="F8FAFC" w:val="clear"/>
             <w:tcMar>
               <w:top w:type="dxa" w:w="80"/>
               <w:left w:type="dxa" w:w="140"/>
@@ -9704,8 +9704,8 @@
         </w:tc>
         <w:tc>
           <w:tcPr>
-            <w:tcW w:type="pct" w:w="40%"/>
-            <w:shd w:fill="F8FAFC"/>
+            <w:tcW w:type="pct" w:w="2000"/>
+            <w:shd w:fill="F8FAFC" w:val="clear"/>
             <w:tcMar>
               <w:top w:type="dxa" w:w="80"/>
               <w:left w:type="dxa" w:w="140"/>
@@ -9732,7 +9732,7 @@
                 <w:color w:val="0F172A"/>
                 <w:sz w:val="19"/>
                 <w:szCs w:val="19"/>
-                <w:shd w:fill="F1F5F9"/>
+                <w:shd w:fill="F1F5F9" w:val="clear"/>
               </w:rPr>
               <w:t xml:space="preserve">admin.google.com</w:t>
             </w:r>
@@ -9751,8 +9751,8 @@
       <w:tr>
         <w:tc>
           <w:tcPr>
-            <w:tcW w:type="pct" w:w="30%"/>
-            <w:shd w:fill="FFFFFF"/>
+            <w:tcW w:type="pct" w:w="1500"/>
+            <w:shd w:fill="FFFFFF" w:val="clear"/>
             <w:tcMar>
               <w:top w:type="dxa" w:w="80"/>
               <w:left w:type="dxa" w:w="140"/>
@@ -9777,8 +9777,8 @@
         </w:tc>
         <w:tc>
           <w:tcPr>
-            <w:tcW w:type="pct" w:w="30%"/>
-            <w:shd w:fill="FFFFFF"/>
+            <w:tcW w:type="pct" w:w="1500"/>
+            <w:shd w:fill="FFFFFF" w:val="clear"/>
             <w:tcMar>
               <w:top w:type="dxa" w:w="80"/>
               <w:left w:type="dxa" w:w="140"/>
@@ -9803,8 +9803,8 @@
         </w:tc>
         <w:tc>
           <w:tcPr>
-            <w:tcW w:type="pct" w:w="40%"/>
-            <w:shd w:fill="FFFFFF"/>
+            <w:tcW w:type="pct" w:w="2000"/>
+            <w:shd w:fill="FFFFFF" w:val="clear"/>
             <w:tcMar>
               <w:top w:type="dxa" w:w="80"/>
               <w:left w:type="dxa" w:w="140"/>
@@ -9831,7 +9831,7 @@
                 <w:color w:val="0F172A"/>
                 <w:sz w:val="19"/>
                 <w:szCs w:val="19"/>
-                <w:shd w:fill="F1F5F9"/>
+                <w:shd w:fill="F1F5F9" w:val="clear"/>
               </w:rPr>
               <w:t xml:space="preserve">wif-migration-key.pem</w:t>
             </w:r>
@@ -9850,8 +9850,8 @@
       <w:tr>
         <w:tc>
           <w:tcPr>
-            <w:tcW w:type="pct" w:w="30%"/>
-            <w:shd w:fill="F8FAFC"/>
+            <w:tcW w:type="pct" w:w="1500"/>
+            <w:shd w:fill="F8FAFC" w:val="clear"/>
             <w:tcMar>
               <w:top w:type="dxa" w:w="80"/>
               <w:left w:type="dxa" w:w="140"/>
@@ -9876,8 +9876,8 @@
         </w:tc>
         <w:tc>
           <w:tcPr>
-            <w:tcW w:type="pct" w:w="30%"/>
-            <w:shd w:fill="F8FAFC"/>
+            <w:tcW w:type="pct" w:w="1500"/>
+            <w:shd w:fill="F8FAFC" w:val="clear"/>
             <w:tcMar>
               <w:top w:type="dxa" w:w="80"/>
               <w:left w:type="dxa" w:w="140"/>
@@ -9902,8 +9902,8 @@
         </w:tc>
         <w:tc>
           <w:tcPr>
-            <w:tcW w:type="pct" w:w="40%"/>
-            <w:shd w:fill="F8FAFC"/>
+            <w:tcW w:type="pct" w:w="2000"/>
+            <w:shd w:fill="F8FAFC" w:val="clear"/>
             <w:tcMar>
               <w:top w:type="dxa" w:w="80"/>
               <w:left w:type="dxa" w:w="140"/>
@@ -9930,7 +9930,7 @@
                 <w:color w:val="0F172A"/>
                 <w:sz w:val="19"/>
                 <w:szCs w:val="19"/>
-                <w:shd w:fill="F1F5F9"/>
+                <w:shd w:fill="F1F5F9" w:val="clear"/>
               </w:rPr>
               <w:t xml:space="preserve">PORT=8085 npm start</w:t>
             </w:r>
@@ -9949,7 +9949,7 @@
                 <w:color w:val="0F172A"/>
                 <w:sz w:val="19"/>
                 <w:szCs w:val="19"/>
-                <w:shd w:fill="F1F5F9"/>
+                <w:shd w:fill="F1F5F9" w:val="clear"/>
               </w:rPr>
               <w:t xml:space="preserve">lsof -i :8080</w:t>
             </w:r>
@@ -9968,8 +9968,8 @@
       <w:tr>
         <w:tc>
           <w:tcPr>
-            <w:tcW w:type="pct" w:w="30%"/>
-            <w:shd w:fill="FFFFFF"/>
+            <w:tcW w:type="pct" w:w="1500"/>
+            <w:shd w:fill="FFFFFF" w:val="clear"/>
             <w:tcMar>
               <w:top w:type="dxa" w:w="80"/>
               <w:left w:type="dxa" w:w="140"/>
@@ -9994,8 +9994,8 @@
         </w:tc>
         <w:tc>
           <w:tcPr>
-            <w:tcW w:type="pct" w:w="30%"/>
-            <w:shd w:fill="FFFFFF"/>
+            <w:tcW w:type="pct" w:w="1500"/>
+            <w:shd w:fill="FFFFFF" w:val="clear"/>
             <w:tcMar>
               <w:top w:type="dxa" w:w="80"/>
               <w:left w:type="dxa" w:w="140"/>
@@ -10020,8 +10020,8 @@
         </w:tc>
         <w:tc>
           <w:tcPr>
-            <w:tcW w:type="pct" w:w="40%"/>
-            <w:shd w:fill="FFFFFF"/>
+            <w:tcW w:type="pct" w:w="2000"/>
+            <w:shd w:fill="FFFFFF" w:val="clear"/>
             <w:tcMar>
               <w:top w:type="dxa" w:w="80"/>
               <w:left w:type="dxa" w:w="140"/>
@@ -10048,7 +10048,7 @@
                 <w:color w:val="0F172A"/>
                 <w:sz w:val="19"/>
                 <w:szCs w:val="19"/>
-                <w:shd w:fill="F1F5F9"/>
+                <w:shd w:fill="F1F5F9" w:val="clear"/>
               </w:rPr>
               <w:t xml:space="preserve">apt-get install -y google-chrome-stable</w:t>
             </w:r>
@@ -10393,8 +10393,8 @@
       </w:r>
     </w:p>
     <w:sectPr>
-      <w:headerReference w:type="default" r:id="rId7"/>
-      <w:footerReference w:type="default" r:id="rId8"/>
+      <w:headerReference w:type="default" r:id="rId6"/>
+      <w:footerReference w:type="default" r:id="rId7"/>
       <w:pgSz w:w="11906" w:h="16838" w:orient="portrait"/>
       <w:pgMar w:top="1440" w:right="1440" w:bottom="1440" w:left="1440" w:header="708" w:footer="708" w:gutter="0"/>
       <w:pgNumType/>
@@ -10402,10 +10402,6 @@
     </w:sectPr>
   </w:body>
 </w:document>
-</file>
-
-<file path=word/comments.xml><?xml version="1.0" encoding="utf-8"?>
-<w:comments xmlns:cx="http://schemas.microsoft.com/office/drawing/2014/chartex" xmlns:cx1="http://schemas.microsoft.com/office/drawing/2015/9/8/chartex" xmlns:cx2="http://schemas.microsoft.com/office/drawing/2015/10/21/chartex" xmlns:cx3="http://schemas.microsoft.com/office/drawing/2016/5/9/chartex" xmlns:cx4="http://schemas.microsoft.com/office/drawing/2016/5/10/chartex" xmlns:cx5="http://schemas.microsoft.com/office/drawing/2016/5/11/chartex" xmlns:cx6="http://schemas.microsoft.com/office/drawing/2016/5/12/chartex" xmlns:cx7="http://schemas.microsoft.com/office/drawing/2016/5/13/chartex" xmlns:cx8="http://schemas.microsoft.com/office/drawing/2016/5/14/chartex" xmlns:mc="http://schemas.openxmlformats.org/markup-compatibility/2006" xmlns:aink="http://schemas.microsoft.com/office/drawing/2016/ink" xmlns:am3d="http://schemas.microsoft.com/office/drawing/2017/model3d" xmlns:o="urn:schemas-microsoft-com:office:office" xmlns:r="http://schemas.openxmlformats.org/officeDocument/2006/relationships" xmlns:m="http://schemas.openxmlformats.org/officeDocument/2006/math" xmlns:v="urn:schemas-microsoft-com:vml" xmlns:wp14="http://schemas.microsoft.com/office/word/2010/wordprocessingDrawing" xmlns:wp="http://schemas.openxmlformats.org/drawingml/2006/wordprocessingDrawing" xmlns:w10="urn:schemas-microsoft-com:office:word" xmlns:w="http://schemas.openxmlformats.org/wordprocessingml/2006/main" xmlns:w14="http://schemas.microsoft.com/office/word/2010/wordml" xmlns:w15="http://schemas.microsoft.com/office/word/2012/wordml" xmlns:w16cex="http://schemas.microsoft.com/office/word/2018/wordml/cex" xmlns:w16cid="http://schemas.microsoft.com/office/word/2016/wordml/cid" xmlns:w16="http://schemas.microsoft.com/office/word/2018/wordml" xmlns:w16sdtdh="http://schemas.microsoft.com/office/word/2020/wordml/sdtdatahash" xmlns:w16se="http://schemas.microsoft.com/office/word/2015/wordml/symex" xmlns:wpg="http://schemas.microsoft.com/office/word/2010/wordprocessingGroup" xmlns:wpi="http://schemas.microsoft.com/office/word/2010/wordprocessingInk" xmlns:wne="http://schemas.microsoft.com/office/word/2006/wordml" xmlns:wps="http://schemas.microsoft.com/office/word/2010/wordprocessingShape"/>
 </file>
 
 <file path=word/endnotes.xml><?xml version="1.0" encoding="utf-8"?>
@@ -10557,7 +10553,7 @@
 <w:numbering xmlns:wpc="http://schemas.microsoft.com/office/word/2010/wordprocessingCanvas" xmlns:mc="http://schemas.openxmlformats.org/markup-compatibility/2006" xmlns:o="urn:schemas-microsoft-com:office:office" xmlns:r="http://schemas.openxmlformats.org/officeDocument/2006/relationships" xmlns:m="http://schemas.openxmlformats.org/officeDocument/2006/math" xmlns:v="urn:schemas-microsoft-com:vml" xmlns:wp14="http://schemas.microsoft.com/office/word/2010/wordprocessingDrawing" xmlns:wp="http://schemas.openxmlformats.org/drawingml/2006/wordprocessingDrawing" xmlns:w10="urn:schemas-microsoft-com:office:word" xmlns:w="http://schemas.openxmlformats.org/wordprocessingml/2006/main" xmlns:w14="http://schemas.microsoft.com/office/word/2010/wordml" xmlns:w15="http://schemas.microsoft.com/office/word/2012/wordml" xmlns:wpg="http://schemas.microsoft.com/office/word/2010/wordprocessingGroup" xmlns:wpi="http://schemas.microsoft.com/office/word/2010/wordprocessingInk" xmlns:wne="http://schemas.microsoft.com/office/word/2006/wordml" xmlns:wps="http://schemas.microsoft.com/office/word/2010/wordprocessingShape" mc:Ignorable="w14 w15 wp14">
   <w:abstractNum w:abstractNumId="1" w15:restartNumberingAfterBreak="0">
     <w:multiLevelType w:val="hybridMultilevel"/>
-    <w:lvl w:ilvl="0" w15:tentative="1">
+    <w:lvl w:ilvl="0" w:tentative="1">
       <w:start w:val="1"/>
       <w:numFmt w:val="bullet"/>
       <w:lvlText w:val="●"/>
@@ -10566,7 +10562,7 @@
         <w:ind w:left="720" w:hanging="360"/>
       </w:pPr>
     </w:lvl>
-    <w:lvl w:ilvl="1" w15:tentative="1">
+    <w:lvl w:ilvl="1" w:tentative="1">
       <w:start w:val="1"/>
       <w:numFmt w:val="bullet"/>
       <w:lvlText w:val="○"/>
@@ -10575,7 +10571,7 @@
         <w:ind w:left="1440" w:hanging="360"/>
       </w:pPr>
     </w:lvl>
-    <w:lvl w:ilvl="2" w15:tentative="1">
+    <w:lvl w:ilvl="2" w:tentative="1">
       <w:start w:val="1"/>
       <w:numFmt w:val="bullet"/>
       <w:lvlText w:val="■"/>
@@ -10584,7 +10580,7 @@
         <w:ind w:left="2160" w:hanging="360"/>
       </w:pPr>
     </w:lvl>
-    <w:lvl w:ilvl="3" w15:tentative="1">
+    <w:lvl w:ilvl="3" w:tentative="1">
       <w:start w:val="1"/>
       <w:numFmt w:val="bullet"/>
       <w:lvlText w:val="●"/>
@@ -10593,7 +10589,7 @@
         <w:ind w:left="2880" w:hanging="360"/>
       </w:pPr>
     </w:lvl>
-    <w:lvl w:ilvl="4" w15:tentative="1">
+    <w:lvl w:ilvl="4" w:tentative="1">
       <w:start w:val="1"/>
       <w:numFmt w:val="bullet"/>
       <w:lvlText w:val="○"/>
@@ -10602,7 +10598,7 @@
         <w:ind w:left="3600" w:hanging="360"/>
       </w:pPr>
     </w:lvl>
-    <w:lvl w:ilvl="5" w15:tentative="1">
+    <w:lvl w:ilvl="5" w:tentative="1">
       <w:start w:val="1"/>
       <w:numFmt w:val="bullet"/>
       <w:lvlText w:val="■"/>
@@ -10611,7 +10607,7 @@
         <w:ind w:left="4320" w:hanging="360"/>
       </w:pPr>
     </w:lvl>
-    <w:lvl w:ilvl="6" w15:tentative="1">
+    <w:lvl w:ilvl="6" w:tentative="1">
       <w:start w:val="1"/>
       <w:numFmt w:val="bullet"/>
       <w:lvlText w:val="●"/>
@@ -10620,7 +10616,7 @@
         <w:ind w:left="5040" w:hanging="360"/>
       </w:pPr>
     </w:lvl>
-    <w:lvl w:ilvl="7" w15:tentative="1">
+    <w:lvl w:ilvl="7" w:tentative="1">
       <w:start w:val="1"/>
       <w:numFmt w:val="bullet"/>
       <w:lvlText w:val="●"/>
@@ -10629,7 +10625,7 @@
         <w:ind w:left="5760" w:hanging="360"/>
       </w:pPr>
     </w:lvl>
-    <w:lvl w:ilvl="8" w15:tentative="1">
+    <w:lvl w:ilvl="8" w:tentative="1">
       <w:start w:val="1"/>
       <w:numFmt w:val="bullet"/>
       <w:lvlText w:val="●"/>
@@ -10661,6 +10657,10 @@
     </w:rPrDefault>
     <w:pPrDefault/>
   </w:docDefaults>
+  <w:style w:type="paragraph" w:styleId="Normal" w:default="1">
+    <w:name w:val="Normal"/>
+    <w:qFormat/>
+  </w:style>
   <w:style w:type="paragraph" w:styleId="Title">
     <w:name w:val="Title"/>
     <w:basedOn w:val="Normal"/>
@@ -10851,4 +10851,294 @@
     </w:rPr>
   </w:style>
 </w:styles>
+</file>
+
+<file path=word/theme/theme1.xml><?xml version="1.0" encoding="utf-8"?>
+<a:theme xmlns:a="http://schemas.openxmlformats.org/drawingml/2006/main" name="Office Theme">
+  <a:themeElements>
+    <a:clrScheme name="Office">
+      <a:dk1>
+        <a:sysClr val="windowText" lastClr="000000"/>
+      </a:dk1>
+      <a:lt1>
+        <a:sysClr val="window" lastClr="FFFFFF"/>
+      </a:lt1>
+      <a:dk2>
+        <a:srgbClr val="44546A"/>
+      </a:dk2>
+      <a:lt2>
+        <a:srgbClr val="E7E6E6"/>
+      </a:lt2>
+      <a:accent1>
+        <a:srgbClr val="4472C4"/>
+      </a:accent1>
+      <a:accent2>
+        <a:srgbClr val="ED7D31"/>
+      </a:accent2>
+      <a:accent3>
+        <a:srgbClr val="A5A5A5"/>
+      </a:accent3>
+      <a:accent4>
+        <a:srgbClr val="FFC000"/>
+      </a:accent4>
+      <a:accent5>
+        <a:srgbClr val="5B9BD5"/>
+      </a:accent5>
+      <a:accent6>
+        <a:srgbClr val="70AD47"/>
+      </a:accent6>
+      <a:hlink>
+        <a:srgbClr val="0563C1"/>
+      </a:hlink>
+      <a:folHlink>
+        <a:srgbClr val="954F72"/>
+      </a:folHlink>
+    </a:clrScheme>
+    <a:fontScheme name="Office">
+      <a:majorFont>
+        <a:latin typeface="Calibri Light" panose="020F0302020204030204"/>
+        <a:ea typeface=""/>
+        <a:cs typeface=""/>
+        <a:font script="Jpan" typeface="游ゴシック Light"/>
+        <a:font script="Hang" typeface="맑은 고딕"/>
+        <a:font script="Hans" typeface="等线 Light"/>
+        <a:font script="Hant" typeface="新細明體"/>
+        <a:font script="Arab" typeface="Times New Roman"/>
+        <a:font script="Hebr" typeface="Times New Roman"/>
+        <a:font script="Thai" typeface="Angsana New"/>
+        <a:font script="Ethi" typeface="Nyala"/>
+        <a:font script="Beng" typeface="Vrinda"/>
+        <a:font script="Gujr" typeface="Shruti"/>
+        <a:font script="Khmr" typeface="MoolBoran"/>
+        <a:font script="Knda" typeface="Tunga"/>
+        <a:font script="Guru" typeface="Raavi"/>
+        <a:font script="Cans" typeface="Euphemia"/>
+        <a:font script="Cher" typeface="Plantagenet Cherokee"/>
+        <a:font script="Yiii" typeface="Microsoft Yi Baiti"/>
+        <a:font script="Tibt" typeface="Microsoft Himalaya"/>
+        <a:font script="Thaa" typeface="MV Boli"/>
+        <a:font script="Deva" typeface="Mangal"/>
+        <a:font script="Telu" typeface="Gautami"/>
+        <a:font script="Taml" typeface="Latha"/>
+        <a:font script="Syrc" typeface="Estrangelo Edessa"/>
+        <a:font script="Orya" typeface="Kalinga"/>
+        <a:font script="Mlym" typeface="Kartika"/>
+        <a:font script="Laoo" typeface="DokChampa"/>
+        <a:font script="Sinh" typeface="Iskoola Pota"/>
+        <a:font script="Mong" typeface="Mongolian Baiti"/>
+        <a:font script="Viet" typeface="Times New Roman"/>
+        <a:font script="Uigh" typeface="Microsoft Uighur"/>
+        <a:font script="Geor" typeface="Sylfaen"/>
+        <a:font script="Armn" typeface="Arial"/>
+        <a:font script="Bugi" typeface="Leelawadee UI"/>
+        <a:font script="Bopo" typeface="Microsoft JhengHei"/>
+        <a:font script="Java" typeface="Javanese Text"/>
+        <a:font script="Lisu" typeface="Segoe UI"/>
+        <a:font script="Mymr" typeface="Myanmar Text"/>
+        <a:font script="Nkoo" typeface="Ebrima"/>
+        <a:font script="Olck" typeface="Nirmala UI"/>
+        <a:font script="Osma" typeface="Ebrima"/>
+        <a:font script="Phag" typeface="Phagspa"/>
+        <a:font script="Syrn" typeface="Estrangelo Edessa"/>
+        <a:font script="Syrj" typeface="Estrangelo Edessa"/>
+        <a:font script="Syre" typeface="Estrangelo Edessa"/>
+        <a:font script="Sora" typeface="Nirmala UI"/>
+        <a:font script="Tale" typeface="Microsoft Tai Le"/>
+        <a:font script="Talu" typeface="Microsoft New Tai Lue"/>
+        <a:font script="Tfng" typeface="Ebrima"/>
+      </a:majorFont>
+      <a:minorFont>
+        <a:latin typeface="Calibri" panose="020F0502020204030204"/>
+        <a:ea typeface=""/>
+        <a:cs typeface=""/>
+        <a:font script="Jpan" typeface="游明朝"/>
+        <a:font script="Hang" typeface="맑은 고딕"/>
+        <a:font script="Hans" typeface="等线"/>
+        <a:font script="Hant" typeface="新細明體"/>
+        <a:font script="Arab" typeface="Arial"/>
+        <a:font script="Hebr" typeface="Arial"/>
+        <a:font script="Thai" typeface="Cordia New"/>
+        <a:font script="Ethi" typeface="Nyala"/>
+        <a:font script="Beng" typeface="Vrinda"/>
+        <a:font script="Gujr" typeface="Shruti"/>
+        <a:font script="Khmr" typeface="DaunPenh"/>
+        <a:font script="Knda" typeface="Tunga"/>
+        <a:font script="Guru" typeface="Raavi"/>
+        <a:font script="Cans" typeface="Euphemia"/>
+        <a:font script="Cher" typeface="Plantagenet Cherokee"/>
+        <a:font script="Yiii" typeface="Microsoft Yi Baiti"/>
+        <a:font script="Tibt" typeface="Microsoft Himalaya"/>
+        <a:font script="Thaa" typeface="MV Boli"/>
+        <a:font script="Deva" typeface="Mangal"/>
+        <a:font script="Telu" typeface="Gautami"/>
+        <a:font script="Taml" typeface="Latha"/>
+        <a:font script="Syrc" typeface="Estrangelo Edessa"/>
+        <a:font script="Orya" typeface="Kalinga"/>
+        <a:font script="Mlym" typeface="Kartika"/>
+        <a:font script="Laoo" typeface="DokChampa"/>
+        <a:font script="Sinh" typeface="Iskoola Pota"/>
+        <a:font script="Mong" typeface="Mongolian Baiti"/>
+        <a:font script="Viet" typeface="Arial"/>
+        <a:font script="Uigh" typeface="Microsoft Uighur"/>
+        <a:font script="Geor" typeface="Sylfaen"/>
+        <a:font script="Armn" typeface="Arial"/>
+        <a:font script="Bugi" typeface="Leelawadee UI"/>
+        <a:font script="Bopo" typeface="Microsoft JhengHei"/>
+        <a:font script="Java" typeface="Javanese Text"/>
+        <a:font script="Lisu" typeface="Segoe UI"/>
+        <a:font script="Mymr" typeface="Myanmar Text"/>
+        <a:font script="Nkoo" typeface="Ebrima"/>
+        <a:font script="Olck" typeface="Nirmala UI"/>
+        <a:font script="Osma" typeface="Ebrima"/>
+        <a:font script="Phag" typeface="Phagspa"/>
+        <a:font script="Syrn" typeface="Estrangelo Edessa"/>
+        <a:font script="Syrj" typeface="Estrangelo Edessa"/>
+        <a:font script="Syre" typeface="Estrangelo Edessa"/>
+        <a:font script="Sora" typeface="Nirmala UI"/>
+        <a:font script="Tale" typeface="Microsoft Tai Le"/>
+        <a:font script="Talu" typeface="Microsoft New Tai Lue"/>
+        <a:font script="Tfng" typeface="Ebrima"/>
+      </a:minorFont>
+    </a:fontScheme>
+    <a:fmtScheme name="Office">
+      <a:fillStyleLst>
+        <a:solidFill>
+          <a:schemeClr val="phClr"/>
+        </a:solidFill>
+        <a:gradFill rotWithShape="true">
+          <a:gsLst>
+            <a:gs pos="0">
+              <a:schemeClr val="phClr">
+                <a:lumMod val="110000"/>
+                <a:satMod val="105000"/>
+                <a:tint val="67000"/>
+              </a:schemeClr>
+            </a:gs>
+            <a:gs pos="50000">
+              <a:schemeClr val="phClr">
+                <a:lumMod val="105000"/>
+                <a:satMod val="103000"/>
+                <a:tint val="73000"/>
+              </a:schemeClr>
+            </a:gs>
+            <a:gs pos="100000">
+              <a:schemeClr val="phClr">
+                <a:lumMod val="105000"/>
+                <a:satMod val="109000"/>
+                <a:tint val="81000"/>
+              </a:schemeClr>
+            </a:gs>
+          </a:gsLst>
+          <a:lin ang="5400000" scaled="false"/>
+        </a:gradFill>
+        <a:gradFill rotWithShape="true">
+          <a:gsLst>
+            <a:gs pos="0">
+              <a:schemeClr val="phClr">
+                <a:satMod val="103000"/>
+                <a:lumMod val="102000"/>
+                <a:tint val="94000"/>
+              </a:schemeClr>
+            </a:gs>
+            <a:gs pos="50000">
+              <a:schemeClr val="phClr">
+                <a:satMod val="110000"/>
+                <a:lumMod val="100000"/>
+                <a:shade val="100000"/>
+              </a:schemeClr>
+            </a:gs>
+            <a:gs pos="100000">
+              <a:schemeClr val="phClr">
+                <a:lumMod val="99000"/>
+                <a:satMod val="120000"/>
+                <a:shade val="78000"/>
+              </a:schemeClr>
+            </a:gs>
+          </a:gsLst>
+          <a:lin ang="5400000" scaled="false"/>
+        </a:gradFill>
+      </a:fillStyleLst>
+      <a:lnStyleLst>
+        <a:ln w="6350" cap="flat" cmpd="sng" algn="ctr">
+          <a:solidFill>
+            <a:schemeClr val="phClr"/>
+          </a:solidFill>
+          <a:prstDash val="solid"/>
+          <a:miter lim="800000"/>
+        </a:ln>
+        <a:ln w="12700" cap="flat" cmpd="sng" algn="ctr">
+          <a:solidFill>
+            <a:schemeClr val="phClr"/>
+          </a:solidFill>
+          <a:prstDash val="solid"/>
+          <a:miter lim="800000"/>
+        </a:ln>
+        <a:ln w="19050" cap="flat" cmpd="sng" algn="ctr">
+          <a:solidFill>
+            <a:schemeClr val="phClr"/>
+          </a:solidFill>
+          <a:prstDash val="solid"/>
+          <a:miter lim="800000"/>
+        </a:ln>
+      </a:lnStyleLst>
+      <a:effectStyleLst>
+        <a:effectStyle>
+          <a:effectLst/>
+        </a:effectStyle>
+        <a:effectStyle>
+          <a:effectLst/>
+        </a:effectStyle>
+        <a:effectStyle>
+          <a:effectLst>
+            <a:outerShdw blurRad="57150" dist="19050" dir="5400000" algn="ctr" rotWithShape="false">
+              <a:srgbClr val="000000">
+                <a:alpha val="63000"/>
+              </a:srgbClr>
+            </a:outerShdw>
+          </a:effectLst>
+        </a:effectStyle>
+      </a:effectStyleLst>
+      <a:bgFillStyleLst>
+        <a:solidFill>
+          <a:schemeClr val="phClr"/>
+        </a:solidFill>
+        <a:solidFill>
+          <a:schemeClr val="phClr">
+            <a:tint val="95000"/>
+            <a:satMod val="170000"/>
+          </a:schemeClr>
+        </a:solidFill>
+        <a:gradFill rotWithShape="true">
+          <a:gsLst>
+            <a:gs pos="0">
+              <a:schemeClr val="phClr">
+                <a:tint val="93000"/>
+                <a:satMod val="150000"/>
+                <a:shade val="98000"/>
+                <a:lumMod val="102000"/>
+              </a:schemeClr>
+            </a:gs>
+            <a:gs pos="50000">
+              <a:schemeClr val="phClr">
+                <a:tint val="98000"/>
+                <a:satMod val="130000"/>
+                <a:shade val="90000"/>
+                <a:lumMod val="103000"/>
+              </a:schemeClr>
+            </a:gs>
+            <a:gs pos="100000">
+              <a:schemeClr val="phClr">
+                <a:shade val="63000"/>
+                <a:satMod val="120000"/>
+              </a:schemeClr>
+            </a:gs>
+          </a:gsLst>
+          <a:lin ang="5400000" scaled="false"/>
+        </a:gradFill>
+      </a:bgFillStyleLst>
+    </a:fmtScheme>
+  </a:themeElements>
+  <a:objectDefaults/>
+  <a:extraClrSchemeLst/>
+</a:theme>
 </file>
</xml_diff>